<commit_message>
form v20: apply third blind review fixes (truthful experiment location, E9 split, v14 two gaps, detector v9/v12, Cogburn metric caveat, shielding ref)
Co-Authored-By: Claude Opus 5.5 <noreply@anthropic.com>
Claude-Session: https://claude.ai/code/session_011J2KrGUp2npQo9Tosx1KRc
</commit_message>
<xml_diff>
--- a/docs/qacrs/form_drafts/IBDAA_2027_FORM_ACRS_v20.docx
+++ b/docs/qacrs/form_drafts/IBDAA_2027_FORM_ACRS_v20.docx
@@ -3201,7 +3201,7 @@
                 <w:szCs w:val="22"/>
                 <w:rtl/>
               </w:rPr>
-              <w:t xml:space="preserve"> لحظات اكتشاف، حوّلها نموذج ذكاء اصطناعي من تقاريرها العامة) احتوى تلقائيًا </w:t>
+              <w:t xml:space="preserve"> لحظات اكتشاف، حوّلها نموذج ذكاء اصطناعي من تقاريرها العامة، فنعدّها تجريبية) احتوى تلقائيًا </w:t>
             </w:r>
             <w:r>
               <w:rPr>
@@ -3366,7 +3366,24 @@
                 <w:szCs w:val="22"/>
                 <w:rtl/>
               </w:rPr>
-              <w:t xml:space="preserve"> على الحالات الحقيقية، فوق هدفنا (</w:t>
+              <w:t xml:space="preserve"> على </w:t>
+            </w:r>
+            <w:r>
+              <w:rPr>
+                <w:rFonts w:ascii="Arial" w:hAnsi="Arial" w:cs="Arial"/>
+                <w:sz w:val="22"/>
+                <w:szCs w:val="22"/>
+              </w:rPr>
+              <w:t xml:space="preserve">66</w:t>
+            </w:r>
+            <w:r>
+              <w:rPr>
+                <w:rFonts w:ascii="Arial" w:hAnsi="Arial" w:cs="Arial"/>
+                <w:sz w:val="22"/>
+                <w:szCs w:val="22"/>
+                <w:rtl/>
+              </w:rPr>
+              <w:t xml:space="preserve"> حالة حقيقية وواقعية، فوق هدفنا (</w:t>
             </w:r>
             <w:r>
               <w:rPr>
@@ -3588,7 +3605,24 @@
                 <w:szCs w:val="22"/>
                 <w:rtl/>
               </w:rPr>
-              <w:t xml:space="preserve"> مسألة فرعية من حادثة في شبكة </w:t>
+              <w:t xml:space="preserve"> مسألة فرعية مترابطة (</w:t>
+            </w:r>
+            <w:r>
+              <w:rPr>
+                <w:rFonts w:ascii="Arial" w:hAnsi="Arial" w:cs="Arial"/>
+                <w:sz w:val="22"/>
+                <w:szCs w:val="22"/>
+              </w:rPr>
+              <w:t xml:space="preserve">75</w:t>
+            </w:r>
+            <w:r>
+              <w:rPr>
+                <w:rFonts w:ascii="Arial" w:hAnsi="Arial" w:cs="Arial"/>
+                <w:sz w:val="22"/>
+                <w:szCs w:val="22"/>
+                <w:rtl/>
+              </w:rPr>
+              <w:t xml:space="preserve"> كيوبت) من حادثة في شبكة </w:t>
             </w:r>
             <w:r>
               <w:rPr>
@@ -3605,7 +3639,7 @@
                 <w:szCs w:val="22"/>
                 <w:rtl/>
               </w:rPr>
-              <w:t xml:space="preserve"> جهازًا، بعد أن أثبتنا أن تصغير عقوبة السلامة لا يغيّر الحل الأمثل، دون ادعاء تفوق كمّي.</w:t>
+              <w:t xml:space="preserve"> جهازًا، وحُسم الباقي كلاسيكيًا، بعد أن أثبتنا أن تصغير عقوبة السلامة لا يغيّر الحل الأمثل، دون ادعاء تفوق كمّي.</w:t>
             </w:r>
           </w:p>
           <w:p>
@@ -6700,41 +6734,58 @@
                 <w:szCs w:val="22"/>
                 <w:rtl/>
               </w:rPr>
-              <w:t xml:space="preserve"> هو المُحسِّن، والبسيط هو بوابة السلامة؛ فإذا انخدع المُحسِّن بتنبيهات مزوّرة وقرر عزل خادم حرج، أوقفت البوابة القرار حتى يوافق عليه شخصان. واخترناه لأن البوابة البسيطة يمكن إثبات خصائصها رياضيًا بأدوات مثل </w:t>
-            </w:r>
-            <w:r>
-              <w:rPr>
-                <w:rFonts w:ascii="Arial" w:hAnsi="Arial" w:cs="Arial"/>
-                <w:sz w:val="22"/>
-                <w:szCs w:val="22"/>
-              </w:rPr>
-              <w:t xml:space="preserve">Z3 [24]</w:t>
-            </w:r>
-            <w:r>
-              <w:rPr>
-                <w:rFonts w:ascii="Arial" w:hAnsi="Arial" w:cs="Arial"/>
-                <w:sz w:val="22"/>
-                <w:szCs w:val="22"/>
-                <w:rtl/>
-              </w:rPr>
-              <w:t xml:space="preserve"> و</w:t>
-            </w:r>
-            <w:r>
-              <w:rPr>
-                <w:rFonts w:ascii="Arial" w:hAnsi="Arial" w:cs="Arial"/>
-                <w:sz w:val="22"/>
-                <w:szCs w:val="22"/>
-              </w:rPr>
-              <w:t xml:space="preserve">HiGHS [25]</w:t>
-            </w:r>
-            <w:r>
-              <w:rPr>
-                <w:rFonts w:ascii="Arial" w:hAnsi="Arial" w:cs="Arial"/>
-                <w:sz w:val="22"/>
-                <w:szCs w:val="22"/>
-                <w:rtl/>
-              </w:rPr>
-              <w:t xml:space="preserve">، أما المُحسِّن فلا.</w:t>
+              <w:t xml:space="preserve"> هو المُحسِّن، والبسيط هو بوابة السلامة؛ فإذا انخدع المُحسِّن بتنبيهات مزوّرة وقرر عزل خادم حرج، أوقفت البوابة القرار حتى يوافق عليه شخصان. واخترناه لأن البوابة البسيطة يمكن إثبات خصائصها رياضيًا بحلّال دقيق مثل </w:t>
+            </w:r>
+            <w:r>
+              <w:rPr>
+                <w:rFonts w:ascii="Arial" w:hAnsi="Arial" w:cs="Arial"/>
+                <w:sz w:val="22"/>
+                <w:szCs w:val="22"/>
+              </w:rPr>
+              <w:t xml:space="preserve">HiGHS [24]</w:t>
+            </w:r>
+            <w:r>
+              <w:rPr>
+                <w:rFonts w:ascii="Arial" w:hAnsi="Arial" w:cs="Arial"/>
+                <w:sz w:val="22"/>
+                <w:szCs w:val="22"/>
+                <w:rtl/>
+              </w:rPr>
+              <w:t xml:space="preserve"> وأدوات مثل </w:t>
+            </w:r>
+            <w:r>
+              <w:rPr>
+                <w:rFonts w:ascii="Arial" w:hAnsi="Arial" w:cs="Arial"/>
+                <w:sz w:val="22"/>
+                <w:szCs w:val="22"/>
+              </w:rPr>
+              <w:t xml:space="preserve">Z3 [25]</w:t>
+            </w:r>
+            <w:r>
+              <w:rPr>
+                <w:rFonts w:ascii="Arial" w:hAnsi="Arial" w:cs="Arial"/>
+                <w:sz w:val="22"/>
+                <w:szCs w:val="22"/>
+                <w:rtl/>
+              </w:rPr>
+              <w:t xml:space="preserve">، أما المُحسِّن فلا. وفكرة «الدرع» في التعلم المعزز الآمن </w:t>
+            </w:r>
+            <w:r>
+              <w:rPr>
+                <w:rFonts w:ascii="Arial" w:hAnsi="Arial" w:cs="Arial"/>
+                <w:sz w:val="22"/>
+                <w:szCs w:val="22"/>
+              </w:rPr>
+              <w:t xml:space="preserve">[26]</w:t>
+            </w:r>
+            <w:r>
+              <w:rPr>
+                <w:rFonts w:ascii="Arial" w:hAnsi="Arial" w:cs="Arial"/>
+                <w:sz w:val="22"/>
+                <w:szCs w:val="22"/>
+                <w:rtl/>
+              </w:rPr>
+              <w:t xml:space="preserve"> قريبة، لكنها لا تتناول التجزئة ولا تزوير التنبيهات.</w:t>
             </w:r>
           </w:p>
           <w:p>
@@ -7795,7 +7846,7 @@
                 <w:sz w:val="22"/>
                 <w:szCs w:val="22"/>
               </w:rPr>
-              <w:t xml:space="preserve">CVSS [26])</w:t>
+              <w:t xml:space="preserve">CVSS [27])</w:t>
             </w:r>
             <w:r>
               <w:rPr>
@@ -8454,24 +8505,41 @@
                 <w:szCs w:val="22"/>
                 <w:rtl/>
               </w:rPr>
-              <w:t xml:space="preserve"> اختيار «التجزئة» تلقائيًا للخادم الحرج رفع الاحتواء من </w:t>
-            </w:r>
-            <w:r>
-              <w:rPr>
-                <w:rFonts w:ascii="Arial" w:hAnsi="Arial" w:cs="Arial"/>
-                <w:sz w:val="22"/>
-                <w:szCs w:val="22"/>
-              </w:rPr>
-              <w:t xml:space="preserve">0.55</w:t>
-            </w:r>
-            <w:r>
-              <w:rPr>
-                <w:rFonts w:ascii="Arial" w:hAnsi="Arial" w:cs="Arial"/>
-                <w:sz w:val="22"/>
-                <w:szCs w:val="22"/>
-                <w:rtl/>
-              </w:rPr>
-              <w:t xml:space="preserve"> إلى </w:t>
+              <w:t xml:space="preserve"> اختيار «التجزئة» تلقائيًا للخادم الحرج رفع الاحتواء على </w:t>
+            </w:r>
+            <w:r>
+              <w:rPr>
+                <w:rFonts w:ascii="Arial" w:hAnsi="Arial" w:cs="Arial"/>
+                <w:sz w:val="22"/>
+                <w:szCs w:val="22"/>
+              </w:rPr>
+              <w:t xml:space="preserve">259</w:t>
+            </w:r>
+            <w:r>
+              <w:rPr>
+                <w:rFonts w:ascii="Arial" w:hAnsi="Arial" w:cs="Arial"/>
+                <w:sz w:val="22"/>
+                <w:szCs w:val="22"/>
+                <w:rtl/>
+              </w:rPr>
+              <w:t xml:space="preserve"> سلسلة من </w:t>
+            </w:r>
+            <w:r>
+              <w:rPr>
+                <w:rFonts w:ascii="Arial" w:hAnsi="Arial" w:cs="Arial"/>
+                <w:sz w:val="22"/>
+                <w:szCs w:val="22"/>
+              </w:rPr>
+              <w:t xml:space="preserve">0.56</w:t>
+            </w:r>
+            <w:r>
+              <w:rPr>
+                <w:rFonts w:ascii="Arial" w:hAnsi="Arial" w:cs="Arial"/>
+                <w:sz w:val="22"/>
+                <w:szCs w:val="22"/>
+                <w:rtl/>
+              </w:rPr>
+              <w:t xml:space="preserve"> (بلا تجزئة) إلى </w:t>
             </w:r>
             <w:r>
               <w:rPr>
@@ -8488,24 +8556,7 @@
                 <w:szCs w:val="22"/>
                 <w:rtl/>
               </w:rPr>
-              <w:t xml:space="preserve"> على نفس </w:t>
-            </w:r>
-            <w:r>
-              <w:rPr>
-                <w:rFonts w:ascii="Arial" w:hAnsi="Arial" w:cs="Arial"/>
-                <w:sz w:val="22"/>
-                <w:szCs w:val="22"/>
-              </w:rPr>
-              <w:t xml:space="preserve">259</w:t>
-            </w:r>
-            <w:r>
-              <w:rPr>
-                <w:rFonts w:ascii="Arial" w:hAnsi="Arial" w:cs="Arial"/>
-                <w:sz w:val="22"/>
-                <w:szCs w:val="22"/>
-                <w:rtl/>
-              </w:rPr>
-              <w:t xml:space="preserve"> سلسلة. التجزئة نفسها معروفة </w:t>
+              <w:t xml:space="preserve">. التجزئة نفسها معروفة </w:t>
             </w:r>
             <w:r>
               <w:rPr>
@@ -8582,7 +8633,41 @@
                 <w:szCs w:val="22"/>
                 <w:rtl/>
               </w:rPr>
-              <w:t xml:space="preserve"> أجهزة.</w:t>
+              <w:t xml:space="preserve"> أجهزة على شبكتي </w:t>
+            </w:r>
+            <w:r>
+              <w:rPr>
+                <w:rFonts w:ascii="Arial" w:hAnsi="Arial" w:cs="Arial"/>
+                <w:sz w:val="22"/>
+                <w:szCs w:val="22"/>
+              </w:rPr>
+              <w:t xml:space="preserve">12</w:t>
+            </w:r>
+            <w:r>
+              <w:rPr>
+                <w:rFonts w:ascii="Arial" w:hAnsi="Arial" w:cs="Arial"/>
+                <w:sz w:val="22"/>
+                <w:szCs w:val="22"/>
+                <w:rtl/>
+              </w:rPr>
+              <w:t xml:space="preserve"> و</w:t>
+            </w:r>
+            <w:r>
+              <w:rPr>
+                <w:rFonts w:ascii="Arial" w:hAnsi="Arial" w:cs="Arial"/>
+                <w:sz w:val="22"/>
+                <w:szCs w:val="22"/>
+              </w:rPr>
+              <w:t xml:space="preserve">22</w:t>
+            </w:r>
+            <w:r>
+              <w:rPr>
+                <w:rFonts w:ascii="Arial" w:hAnsi="Arial" w:cs="Arial"/>
+                <w:sz w:val="22"/>
+                <w:szCs w:val="22"/>
+                <w:rtl/>
+              </w:rPr>
+              <w:t xml:space="preserve"> جهازًا.</w:t>
             </w:r>
           </w:p>
           <w:p>
@@ -8625,7 +8710,7 @@
                 <w:szCs w:val="22"/>
                 <w:rtl/>
               </w:rPr>
-              <w:t xml:space="preserve"> أثبتنا أنها لا تغيّر الحل الأمثل، وبها وجد العتاد الكمّي الأمثل الدقيق، بينما بلغت نسبة التكلفة في أقرب عمل كمّي </w:t>
+              <w:t xml:space="preserve"> أثبتنا أنها لا تغيّر الحل الأمثل، وبها وجد العتاد الكمّي الأمثل الدقيق، أما أقرب عمل كمّي </w:t>
             </w:r>
             <w:r>
               <w:rPr>
@@ -8642,7 +8727,7 @@
                 <w:szCs w:val="22"/>
                 <w:rtl/>
               </w:rPr>
-              <w:t xml:space="preserve"> نحو </w:t>
+              <w:t xml:space="preserve"> فقاس متوسط نسبة التكلفة (</w:t>
             </w:r>
             <w:r>
               <w:rPr>
@@ -8676,7 +8761,7 @@
                 <w:szCs w:val="22"/>
                 <w:rtl/>
               </w:rPr>
-              <w:t xml:space="preserve"> كيوبت (حجم أكبر مسائلنا) و</w:t>
+              <w:t xml:space="preserve"> كيوبت و</w:t>
             </w:r>
             <w:r>
               <w:rPr>
@@ -8701,16 +8786,16 @@
                 <w:sz w:val="22"/>
                 <w:szCs w:val="22"/>
               </w:rPr>
-              <w:t xml:space="preserve">110</w:t>
-            </w:r>
-            <w:r>
-              <w:rPr>
-                <w:rFonts w:ascii="Arial" w:hAnsi="Arial" w:cs="Arial"/>
-                <w:sz w:val="22"/>
-                <w:szCs w:val="22"/>
-                <w:rtl/>
-              </w:rPr>
-              <w:t xml:space="preserve">.</w:t>
+              <w:t xml:space="preserve">110)</w:t>
+            </w:r>
+            <w:r>
+              <w:rPr>
+                <w:rFonts w:ascii="Arial" w:hAnsi="Arial" w:cs="Arial"/>
+                <w:sz w:val="22"/>
+                <w:szCs w:val="22"/>
+                <w:rtl/>
+              </w:rPr>
+              <w:t xml:space="preserve">، ونحن نقيس أفضل قراءة، فالمقارنة تقريبية.</w:t>
             </w:r>
           </w:p>
           <w:p>
@@ -10637,24 +10722,58 @@
                 <w:szCs w:val="22"/>
                 <w:rtl/>
               </w:rPr>
-              <w:t xml:space="preserve"> تسجيلًا منذ </w:t>
-            </w:r>
-            <w:r>
-              <w:rPr>
-                <w:rFonts w:ascii="Arial" w:hAnsi="Arial" w:cs="Arial"/>
-                <w:sz w:val="22"/>
-                <w:szCs w:val="22"/>
-              </w:rPr>
-              <w:t xml:space="preserve">v2)</w:t>
-            </w:r>
-            <w:r>
-              <w:rPr>
-                <w:rFonts w:ascii="Arial" w:hAnsi="Arial" w:cs="Arial"/>
-                <w:sz w:val="22"/>
-                <w:szCs w:val="22"/>
-                <w:rtl/>
-              </w:rPr>
-              <w:t xml:space="preserve">، فتاريخ كل خطوة مثبت في سجل المستودع.</w:t>
+              <w:t xml:space="preserve"> تسجيلًا: </w:t>
+            </w:r>
+            <w:r>
+              <w:rPr>
+                <w:rFonts w:ascii="Arial" w:hAnsi="Arial" w:cs="Arial"/>
+                <w:sz w:val="22"/>
+                <w:szCs w:val="22"/>
+              </w:rPr>
+              <w:t xml:space="preserve">13</w:t>
+            </w:r>
+            <w:r>
+              <w:rPr>
+                <w:rFonts w:ascii="Arial" w:hAnsi="Arial" w:cs="Arial"/>
+                <w:sz w:val="22"/>
+                <w:szCs w:val="22"/>
+                <w:rtl/>
+              </w:rPr>
+              <w:t xml:space="preserve"> إصدارًا، وتجربتا </w:t>
+            </w:r>
+            <w:r>
+              <w:rPr>
+                <w:rFonts w:ascii="Arial" w:hAnsi="Arial" w:cs="Arial"/>
+                <w:sz w:val="22"/>
+                <w:szCs w:val="22"/>
+              </w:rPr>
+              <w:t xml:space="preserve">E8</w:t>
+            </w:r>
+            <w:r>
+              <w:rPr>
+                <w:rFonts w:ascii="Arial" w:hAnsi="Arial" w:cs="Arial"/>
+                <w:sz w:val="22"/>
+                <w:szCs w:val="22"/>
+                <w:rtl/>
+              </w:rPr>
+              <w:t xml:space="preserve"> و</w:t>
+            </w:r>
+            <w:r>
+              <w:rPr>
+                <w:rFonts w:ascii="Arial" w:hAnsi="Arial" w:cs="Arial"/>
+                <w:sz w:val="22"/>
+                <w:szCs w:val="22"/>
+              </w:rPr>
+              <w:t xml:space="preserve">E9</w:t>
+            </w:r>
+            <w:r>
+              <w:rPr>
+                <w:rFonts w:ascii="Arial" w:hAnsi="Arial" w:cs="Arial"/>
+                <w:sz w:val="22"/>
+                <w:szCs w:val="22"/>
+                <w:rtl/>
+              </w:rPr>
+              <w:t xml:space="preserve">، والاختبار الأعمى)، فتاريخ كل خطوة مثبت في سجل المستودع.</w:t>
             </w:r>
           </w:p>
           <w:p>
@@ -13080,7 +13199,7 @@
                 <w:sz w:val="22"/>
                 <w:szCs w:val="22"/>
               </w:rPr>
-              <w:t xml:space="preserve">MITRE ATT&amp;CK [27]</w:t>
+              <w:t xml:space="preserve">MITRE ATT&amp;CK [28]</w:t>
             </w:r>
             <w:r>
               <w:rPr>
@@ -13284,7 +13403,7 @@
                 <w:sz w:val="22"/>
                 <w:szCs w:val="22"/>
               </w:rPr>
-              <w:t xml:space="preserve">PwC [28]</w:t>
+              <w:t xml:space="preserve">PwC [29]</w:t>
             </w:r>
             <w:r>
               <w:rPr>
@@ -13301,7 +13420,7 @@
                 <w:sz w:val="22"/>
                 <w:szCs w:val="22"/>
               </w:rPr>
-              <w:t xml:space="preserve">The DFIR Report [29]</w:t>
+              <w:t xml:space="preserve">The DFIR Report [30]</w:t>
             </w:r>
             <w:r>
               <w:rPr>
@@ -13318,7 +13437,7 @@
                 <w:sz w:val="22"/>
                 <w:szCs w:val="22"/>
               </w:rPr>
-              <w:t xml:space="preserve">MITRE Attack Flow [30]</w:t>
+              <w:t xml:space="preserve">MITRE Attack Flow [31]</w:t>
             </w:r>
             <w:r>
               <w:rPr>
@@ -13335,7 +13454,7 @@
                 <w:sz w:val="22"/>
                 <w:szCs w:val="22"/>
               </w:rPr>
-              <w:t xml:space="preserve">CISA [31]: 8</w:t>
+              <w:t xml:space="preserve">CISA [32]: 8</w:t>
             </w:r>
             <w:r>
               <w:rPr>
@@ -13748,7 +13867,7 @@
                 <w:sz w:val="22"/>
                 <w:szCs w:val="22"/>
               </w:rPr>
-              <w:t xml:space="preserve">HiGHS [25]</w:t>
+              <w:t xml:space="preserve">HiGHS [24]</w:t>
             </w:r>
             <w:r>
               <w:rPr>
@@ -13927,7 +14046,7 @@
                 <w:sz w:val="22"/>
                 <w:szCs w:val="22"/>
               </w:rPr>
-              <w:t xml:space="preserve">CVaR [32])</w:t>
+              <w:t xml:space="preserve">CVaR [33])</w:t>
             </w:r>
             <w:r>
               <w:rPr>
@@ -13970,7 +14089,7 @@
                 <w:szCs w:val="22"/>
                 <w:rtl/>
               </w:rPr>
-              <w:t xml:space="preserve"> قسّمنا قرار شبكة من </w:t>
+              <w:t xml:space="preserve"> بسّطنا قرار شبكة من </w:t>
             </w:r>
             <w:r>
               <w:rPr>
@@ -13995,6 +14114,57 @@
                 <w:sz w:val="22"/>
                 <w:szCs w:val="22"/>
               </w:rPr>
+              <w:t xml:space="preserve">132</w:t>
+            </w:r>
+            <w:r>
+              <w:rPr>
+                <w:rFonts w:ascii="Arial" w:hAnsi="Arial" w:cs="Arial"/>
+                <w:sz w:val="22"/>
+                <w:szCs w:val="22"/>
+                <w:rtl/>
+              </w:rPr>
+              <w:t xml:space="preserve"> متغيرًا دون تغيير الأمثل: </w:t>
+            </w:r>
+            <w:r>
+              <w:rPr>
+                <w:rFonts w:ascii="Arial" w:hAnsi="Arial" w:cs="Arial"/>
+                <w:sz w:val="22"/>
+                <w:szCs w:val="22"/>
+              </w:rPr>
+              <w:t xml:space="preserve">57</w:t>
+            </w:r>
+            <w:r>
+              <w:rPr>
+                <w:rFonts w:ascii="Arial" w:hAnsi="Arial" w:cs="Arial"/>
+                <w:sz w:val="22"/>
+                <w:szCs w:val="22"/>
+                <w:rtl/>
+              </w:rPr>
+              <w:t xml:space="preserve"> متغيرًا مستقلًا حُسمت كلاسيكيًا، و</w:t>
+            </w:r>
+            <w:r>
+              <w:rPr>
+                <w:rFonts w:ascii="Arial" w:hAnsi="Arial" w:cs="Arial"/>
+                <w:sz w:val="22"/>
+                <w:szCs w:val="22"/>
+              </w:rPr>
+              <w:t xml:space="preserve">75</w:t>
+            </w:r>
+            <w:r>
+              <w:rPr>
+                <w:rFonts w:ascii="Arial" w:hAnsi="Arial" w:cs="Arial"/>
+                <w:sz w:val="22"/>
+                <w:szCs w:val="22"/>
+                <w:rtl/>
+              </w:rPr>
+              <w:t xml:space="preserve"> كيوبت في </w:t>
+            </w:r>
+            <w:r>
+              <w:rPr>
+                <w:rFonts w:ascii="Arial" w:hAnsi="Arial" w:cs="Arial"/>
+                <w:sz w:val="22"/>
+                <w:szCs w:val="22"/>
+              </w:rPr>
               <w:t xml:space="preserve">11</w:t>
             </w:r>
             <w:r>
@@ -14004,7 +14174,7 @@
                 <w:szCs w:val="22"/>
                 <w:rtl/>
               </w:rPr>
-              <w:t xml:space="preserve"> مسألة مستقلة شغّلناها معًا.</w:t>
+              <w:t xml:space="preserve"> مسألة مترابطة شغّلناها معًا في دارة واحدة.</w:t>
             </w:r>
           </w:p>
           <w:p>
@@ -14639,16 +14809,16 @@
                       <w:sz w:val="19"/>
                       <w:szCs w:val="19"/>
                     </w:rPr>
-                    <w:t xml:space="preserve">141</w:t>
-                  </w:r>
-                  <w:r>
-                    <w:rPr>
-                      <w:rFonts w:ascii="Arial" w:hAnsi="Arial" w:cs="Arial"/>
-                      <w:sz w:val="19"/>
-                      <w:szCs w:val="19"/>
-                      <w:rtl/>
-                    </w:rPr>
-                    <w:t xml:space="preserve"> اختبارًا آليًا مع كل تغيير</w:t>
+                    <w:t xml:space="preserve">201</w:t>
+                  </w:r>
+                  <w:r>
+                    <w:rPr>
+                      <w:rFonts w:ascii="Arial" w:hAnsi="Arial" w:cs="Arial"/>
+                      <w:sz w:val="19"/>
+                      <w:szCs w:val="19"/>
+                      <w:rtl/>
+                    </w:rPr>
+                    <w:t xml:space="preserve"> اختبار آلي مع كل تغيير</w:t>
                   </w:r>
                 </w:p>
               </w:tc>
@@ -14680,7 +14850,41 @@
                       <w:szCs w:val="19"/>
                       <w:rtl/>
                     </w:rPr>
-                    <w:t xml:space="preserve">حاسوب شخصي في المنزل</w:t>
+                    <w:t xml:space="preserve">بيئة </w:t>
+                  </w:r>
+                  <w:r>
+                    <w:rPr>
+                      <w:rFonts w:ascii="Arial" w:hAnsi="Arial" w:cs="Arial"/>
+                      <w:sz w:val="19"/>
+                      <w:szCs w:val="19"/>
+                    </w:rPr>
+                    <w:t xml:space="preserve">Claude</w:t>
+                  </w:r>
+                  <w:r>
+                    <w:rPr>
+                      <w:rFonts w:ascii="Arial" w:hAnsi="Arial" w:cs="Arial"/>
+                      <w:sz w:val="19"/>
+                      <w:szCs w:val="19"/>
+                      <w:rtl/>
+                    </w:rPr>
+                    <w:t xml:space="preserve"> البرمجية (</w:t>
+                  </w:r>
+                  <w:r>
+                    <w:rPr>
+                      <w:rFonts w:ascii="Arial" w:hAnsi="Arial" w:cs="Arial"/>
+                      <w:sz w:val="19"/>
+                      <w:szCs w:val="19"/>
+                    </w:rPr>
+                    <w:t xml:space="preserve">Linux</w:t>
+                  </w:r>
+                  <w:r>
+                    <w:rPr>
+                      <w:rFonts w:ascii="Arial" w:hAnsi="Arial" w:cs="Arial"/>
+                      <w:sz w:val="19"/>
+                      <w:szCs w:val="19"/>
+                      <w:rtl/>
+                    </w:rPr>
+                    <w:t xml:space="preserve"> سحابي) وحاسوب الطالب</w:t>
                   </w:r>
                 </w:p>
               </w:tc>
@@ -14707,7 +14911,24 @@
                       <w:szCs w:val="19"/>
                       <w:rtl/>
                     </w:rPr>
-                    <w:t xml:space="preserve">كل التجارب</w:t>
+                    <w:t xml:space="preserve">المحاكاة والنواة بتوجيه الطالب؛ وتجارب </w:t>
+                  </w:r>
+                  <w:r>
+                    <w:rPr>
+                      <w:rFonts w:ascii="Arial" w:hAnsi="Arial" w:cs="Arial"/>
+                      <w:sz w:val="19"/>
+                      <w:szCs w:val="19"/>
+                    </w:rPr>
+                    <w:t xml:space="preserve">IBM</w:t>
+                  </w:r>
+                  <w:r>
+                    <w:rPr>
+                      <w:rFonts w:ascii="Arial" w:hAnsi="Arial" w:cs="Arial"/>
+                      <w:sz w:val="19"/>
+                      <w:szCs w:val="19"/>
+                      <w:rtl/>
+                    </w:rPr>
+                    <w:t xml:space="preserve"> من حساب الطالب</w:t>
                   </w:r>
                 </w:p>
               </w:tc>
@@ -14817,7 +15038,7 @@
                 <w:szCs w:val="22"/>
                 <w:rtl/>
               </w:rPr>
-              <w:t xml:space="preserve"> ثانية، وأعطى نتائج مطابقة.</w:t>
+              <w:t xml:space="preserve"> ثانية، وأعطى نتائج مطابقة عدا الأزمنة.</w:t>
             </w:r>
           </w:p>
         </w:tc>
@@ -16280,7 +16501,24 @@
                       <w:szCs w:val="19"/>
                       <w:rtl/>
                     </w:rPr>
-                    <w:t xml:space="preserve"> حقيقي</w:t>
+                    <w:t xml:space="preserve"> على </w:t>
+                  </w:r>
+                  <w:r>
+                    <w:rPr>
+                      <w:rFonts w:ascii="Arial" w:hAnsi="Arial" w:cs="Arial"/>
+                      <w:sz w:val="19"/>
+                      <w:szCs w:val="19"/>
+                    </w:rPr>
+                    <w:t xml:space="preserve">66</w:t>
+                  </w:r>
+                  <w:r>
+                    <w:rPr>
+                      <w:rFonts w:ascii="Arial" w:hAnsi="Arial" w:cs="Arial"/>
+                      <w:sz w:val="19"/>
+                      <w:szCs w:val="19"/>
+                      <w:rtl/>
+                    </w:rPr>
+                    <w:t xml:space="preserve"> حقيقية وواقعية</w:t>
                   </w:r>
                 </w:p>
               </w:tc>
@@ -20263,7 +20501,41 @@
                 <w:szCs w:val="22"/>
                 <w:rtl/>
               </w:rPr>
-              <w:t xml:space="preserve"> مسارًا مفتوحًا إلى خوادم حرجة، و</w:t>
+              <w:t xml:space="preserve"> مسارًا مفتوحًا إلى خوادم حرجة في </w:t>
+            </w:r>
+            <w:r>
+              <w:rPr>
+                <w:rFonts w:ascii="Arial" w:hAnsi="Arial" w:cs="Arial"/>
+                <w:sz w:val="22"/>
+                <w:szCs w:val="22"/>
+              </w:rPr>
+              <w:t xml:space="preserve">8</w:t>
+            </w:r>
+            <w:r>
+              <w:rPr>
+                <w:rFonts w:ascii="Arial" w:hAnsi="Arial" w:cs="Arial"/>
+                <w:sz w:val="22"/>
+                <w:szCs w:val="22"/>
+                <w:rtl/>
+              </w:rPr>
+              <w:t xml:space="preserve"> من </w:t>
+            </w:r>
+            <w:r>
+              <w:rPr>
+                <w:rFonts w:ascii="Arial" w:hAnsi="Arial" w:cs="Arial"/>
+                <w:sz w:val="22"/>
+                <w:szCs w:val="22"/>
+              </w:rPr>
+              <w:t xml:space="preserve">16</w:t>
+            </w:r>
+            <w:r>
+              <w:rPr>
+                <w:rFonts w:ascii="Arial" w:hAnsi="Arial" w:cs="Arial"/>
+                <w:sz w:val="22"/>
+                <w:szCs w:val="22"/>
+                <w:rtl/>
+              </w:rPr>
+              <w:t xml:space="preserve"> لحظة، و</w:t>
             </w:r>
             <w:r>
               <w:rPr>
@@ -20322,7 +20594,7 @@
                 <w:sz w:val="22"/>
                 <w:szCs w:val="22"/>
               </w:rPr>
-              <w:t xml:space="preserve">[28]</w:t>
+              <w:t xml:space="preserve">[29]</w:t>
             </w:r>
             <w:r>
               <w:rPr>
@@ -20548,15 +20820,32 @@
                       <w:szCs w:val="19"/>
                       <w:rtl/>
                     </w:rPr>
-                    <w:t xml:space="preserve"> أجهزة + </w:t>
-                  </w:r>
-                  <w:r>
-                    <w:rPr>
-                      <w:rFonts w:ascii="Arial" w:hAnsi="Arial" w:cs="Arial"/>
-                      <w:sz w:val="19"/>
-                      <w:szCs w:val="19"/>
-                    </w:rPr>
-                    <w:t xml:space="preserve">20,000</w:t>
+                    <w:t xml:space="preserve"> أجهزة (شبكتا </w:t>
+                  </w:r>
+                  <w:r>
+                    <w:rPr>
+                      <w:rFonts w:ascii="Arial" w:hAnsi="Arial" w:cs="Arial"/>
+                      <w:sz w:val="19"/>
+                      <w:szCs w:val="19"/>
+                    </w:rPr>
+                    <w:t xml:space="preserve">12</w:t>
+                  </w:r>
+                  <w:r>
+                    <w:rPr>
+                      <w:rFonts w:ascii="Arial" w:hAnsi="Arial" w:cs="Arial"/>
+                      <w:sz w:val="19"/>
+                      <w:szCs w:val="19"/>
+                      <w:rtl/>
+                    </w:rPr>
+                    <w:t xml:space="preserve"> و</w:t>
+                  </w:r>
+                  <w:r>
+                    <w:rPr>
+                      <w:rFonts w:ascii="Arial" w:hAnsi="Arial" w:cs="Arial"/>
+                      <w:sz w:val="19"/>
+                      <w:szCs w:val="19"/>
+                    </w:rPr>
+                    <w:t xml:space="preserve">22) + 20,000</w:t>
                   </w:r>
                   <w:r>
                     <w:rPr>
@@ -20658,15 +20947,7 @@
                       <w:szCs w:val="19"/>
                       <w:rtl/>
                     </w:rPr>
-                    <w:t xml:space="preserve">كشف التزوير (مستشعر شبكة مستقل، </w:t>
-                  </w:r>
-                  <w:r>
-                    <w:rPr>
-                      <w:rFonts w:ascii="Arial" w:hAnsi="Arial" w:cs="Arial"/>
-                      <w:sz w:val="19"/>
-                      <w:szCs w:val="19"/>
-                    </w:rPr>
-                    <w:t xml:space="preserve">v9)</w:t>
+                    <w:t xml:space="preserve">كشف التزوير (مستشعر شبكة مستقل)</w:t>
                   </w:r>
                 </w:p>
               </w:tc>
@@ -20692,6 +20973,23 @@
                       <w:sz w:val="19"/>
                       <w:szCs w:val="19"/>
                     </w:rPr>
+                    <w:t xml:space="preserve">v9</w:t>
+                  </w:r>
+                  <w:r>
+                    <w:rPr>
+                      <w:rFonts w:ascii="Arial" w:hAnsi="Arial" w:cs="Arial"/>
+                      <w:sz w:val="19"/>
+                      <w:szCs w:val="19"/>
+                      <w:rtl/>
+                    </w:rPr>
+                    <w:t xml:space="preserve">: ‏</w:t>
+                  </w:r>
+                  <w:r>
+                    <w:rPr>
+                      <w:rFonts w:ascii="Arial" w:hAnsi="Arial" w:cs="Arial"/>
+                      <w:sz w:val="19"/>
+                      <w:szCs w:val="19"/>
+                    </w:rPr>
                     <w:t xml:space="preserve">87.8%</w:t>
                   </w:r>
                   <w:r>
@@ -20727,6 +21025,83 @@
                       <w:szCs w:val="19"/>
                     </w:rPr>
                     <w:t xml:space="preserve">8.7%</w:t>
+                  </w:r>
+                  <w:r>
+                    <w:rPr>
+                      <w:rFonts w:ascii="Arial" w:hAnsi="Arial" w:cs="Arial"/>
+                      <w:sz w:val="19"/>
+                      <w:szCs w:val="19"/>
+                      <w:rtl/>
+                    </w:rPr>
+                    <w:t xml:space="preserve">؛ </w:t>
+                  </w:r>
+                  <w:r>
+                    <w:rPr>
+                      <w:rFonts w:ascii="Arial" w:hAnsi="Arial" w:cs="Arial"/>
+                      <w:sz w:val="19"/>
+                      <w:szCs w:val="19"/>
+                    </w:rPr>
+                    <w:t xml:space="preserve">v12</w:t>
+                  </w:r>
+                  <w:r>
+                    <w:rPr>
+                      <w:rFonts w:ascii="Arial" w:hAnsi="Arial" w:cs="Arial"/>
+                      <w:sz w:val="19"/>
+                      <w:szCs w:val="19"/>
+                      <w:rtl/>
+                    </w:rPr>
+                    <w:t xml:space="preserve">: ‏</w:t>
+                  </w:r>
+                  <w:r>
+                    <w:rPr>
+                      <w:rFonts w:ascii="Arial" w:hAnsi="Arial" w:cs="Arial"/>
+                      <w:sz w:val="19"/>
+                      <w:szCs w:val="19"/>
+                    </w:rPr>
+                    <w:t xml:space="preserve">0/4</w:t>
+                  </w:r>
+                  <w:r>
+                    <w:rPr>
+                      <w:rFonts w:ascii="Arial" w:hAnsi="Arial" w:cs="Arial"/>
+                      <w:sz w:val="19"/>
+                      <w:szCs w:val="19"/>
+                      <w:rtl/>
+                    </w:rPr>
+                    <w:t xml:space="preserve"> إنذار خاطئ على تفجيرات حقيقية، وكشف </w:t>
+                  </w:r>
+                  <w:r>
+                    <w:rPr>
+                      <w:rFonts w:ascii="Arial" w:hAnsi="Arial" w:cs="Arial"/>
+                      <w:sz w:val="19"/>
+                      <w:szCs w:val="19"/>
+                    </w:rPr>
+                    <w:t xml:space="preserve">398/500</w:t>
+                  </w:r>
+                  <w:r>
+                    <w:rPr>
+                      <w:rFonts w:ascii="Arial" w:hAnsi="Arial" w:cs="Arial"/>
+                      <w:sz w:val="19"/>
+                      <w:szCs w:val="19"/>
+                      <w:rtl/>
+                    </w:rPr>
+                    <w:t xml:space="preserve"> حقنًا بسيطًا و</w:t>
+                  </w:r>
+                  <w:r>
+                    <w:rPr>
+                      <w:rFonts w:ascii="Arial" w:hAnsi="Arial" w:cs="Arial"/>
+                      <w:sz w:val="19"/>
+                      <w:szCs w:val="19"/>
+                    </w:rPr>
+                    <w:t xml:space="preserve">158/500</w:t>
+                  </w:r>
+                  <w:r>
+                    <w:rPr>
+                      <w:rFonts w:ascii="Arial" w:hAnsi="Arial" w:cs="Arial"/>
+                      <w:sz w:val="19"/>
+                      <w:szCs w:val="19"/>
+                      <w:rtl/>
+                    </w:rPr>
+                    <w:t xml:space="preserve"> ذكيًا</w:t>
                   </w:r>
                 </w:p>
               </w:tc>
@@ -21397,7 +21772,7 @@
                 <w:szCs w:val="22"/>
                 <w:rtl/>
               </w:rPr>
-              <w:t xml:space="preserve"> كشف الإثبات ثغرة في الطبقة التي تنقل القرار إلى التنفيذ (لا في المحرّك)، فأُصلحت ثم ثبتت الخصائص.</w:t>
+              <w:t xml:space="preserve"> كشف الإثبات ثغرتين خارج المحرّك: طبقة الخدمة تمرّر عزلًا رفضه المحرّك، ومنفّذ الجدار قد يعزل جهازًا لم يُبلَّغ عنه؛ أصلحنا الأولى كما سُجّل مسبقًا، والثانية بتوسعة لاحقة معلنة، ثم ثبتت الخصائص الخمس.</w:t>
             </w:r>
           </w:p>
           <w:p>
@@ -21800,6 +22175,15 @@
                     </w:rPr>
                     <w:t xml:space="preserve">25%</w:t>
                   </w:r>
+                  <w:r>
+                    <w:rPr>
+                      <w:rFonts w:ascii="Arial" w:hAnsi="Arial" w:cs="Arial"/>
+                      <w:sz w:val="19"/>
+                      <w:szCs w:val="19"/>
+                      <w:rtl/>
+                    </w:rPr>
+                    <w:t xml:space="preserve"> (حلّان أمثلان)</w:t>
+                  </w:r>
                 </w:p>
               </w:tc>
             </w:tr>
@@ -22671,7 +23055,7 @@
                 <w:sz w:val="22"/>
                 <w:szCs w:val="22"/>
               </w:rPr>
-              <w:t xml:space="preserve">0.55</w:t>
+              <w:t xml:space="preserve">0.56 (v6)</w:t>
             </w:r>
             <w:r>
               <w:rPr>
@@ -23035,7 +23419,7 @@
                 <w:sz w:val="22"/>
                 <w:szCs w:val="22"/>
               </w:rPr>
-              <w:t xml:space="preserve">ML-DSA-65 [33] (71–98</w:t>
+              <w:t xml:space="preserve">ML-DSA-65 [34] (71–98</w:t>
             </w:r>
             <w:r>
               <w:rPr>
@@ -23353,7 +23737,7 @@
                 <w:szCs w:val="22"/>
                 <w:rtl/>
               </w:rPr>
-              <w:t xml:space="preserve"> (نحو </w:t>
+              <w:t xml:space="preserve"> (متوسط نسبة تكلفة </w:t>
             </w:r>
             <w:r>
               <w:rPr>
@@ -23387,7 +23771,7 @@
                 <w:szCs w:val="22"/>
                 <w:rtl/>
               </w:rPr>
-              <w:t xml:space="preserve"> كيوبت) وصلنا إلى الأمثل الدقيق مع قيود السلامة.</w:t>
+              <w:t xml:space="preserve"> كيوبت) وصلنا إلى الأمثل الدقيق مع قيود السلامة، بمقياس أفضل قراءة.</w:t>
             </w:r>
           </w:p>
           <w:p>
@@ -23548,58 +23932,7 @@
                 <w:szCs w:val="22"/>
                 <w:rtl/>
               </w:rPr>
-              <w:t xml:space="preserve">–  النظام لا يكشف الهجوم: كل أرقام الاحتواء مشروطة بوصول التنبيه، وفي </w:t>
-            </w:r>
-            <w:r>
-              <w:rPr>
-                <w:rFonts w:ascii="Arial" w:hAnsi="Arial" w:cs="Arial"/>
-                <w:sz w:val="22"/>
-                <w:szCs w:val="22"/>
-              </w:rPr>
-              <w:t xml:space="preserve">D</w:t>
-            </w:r>
-            <w:r>
-              <w:rPr>
-                <w:rFonts w:ascii="Arial" w:hAnsi="Arial" w:cs="Arial"/>
-                <w:sz w:val="22"/>
-                <w:szCs w:val="22"/>
-                <w:rtl/>
-              </w:rPr>
-              <w:t xml:space="preserve">ü</w:t>
-            </w:r>
-            <w:r>
-              <w:rPr>
-                <w:rFonts w:ascii="Arial" w:hAnsi="Arial" w:cs="Arial"/>
-                <w:sz w:val="22"/>
-                <w:szCs w:val="22"/>
-              </w:rPr>
-              <w:t xml:space="preserve">sseldorf</w:t>
-            </w:r>
-            <w:r>
-              <w:rPr>
-                <w:rFonts w:ascii="Arial" w:hAnsi="Arial" w:cs="Arial"/>
-                <w:sz w:val="22"/>
-                <w:szCs w:val="22"/>
-                <w:rtl/>
-              </w:rPr>
-              <w:t xml:space="preserve"> و</w:t>
-            </w:r>
-            <w:r>
-              <w:rPr>
-                <w:rFonts w:ascii="Arial" w:hAnsi="Arial" w:cs="Arial"/>
-                <w:sz w:val="22"/>
-                <w:szCs w:val="22"/>
-              </w:rPr>
-              <w:t xml:space="preserve">Colonial</w:t>
-            </w:r>
-            <w:r>
-              <w:rPr>
-                <w:rFonts w:ascii="Arial" w:hAnsi="Arial" w:cs="Arial"/>
-                <w:sz w:val="22"/>
-                <w:szCs w:val="22"/>
-                <w:rtl/>
-              </w:rPr>
-              <w:t xml:space="preserve"> كانت أول إشارة رسالة الفدية نفسها.</w:t>
+              <w:t xml:space="preserve">–  النظام لا يكشف الهجوم: كل أرقام الاحتواء مشروطة بوصول التنبيه، وفي بعض الحوادث كانت أول إشارة رسالة الفدية نفسها.</w:t>
             </w:r>
           </w:p>
           <w:p>
@@ -23822,7 +24155,7 @@
                 <w:sz w:val="22"/>
                 <w:szCs w:val="22"/>
               </w:rPr>
-              <w:t xml:space="preserve">[34]</w:t>
+              <w:t xml:space="preserve">[35]</w:t>
             </w:r>
             <w:r>
               <w:rPr>
@@ -24424,16 +24757,16 @@
                 <w:sz w:val="22"/>
                 <w:szCs w:val="22"/>
               </w:rPr>
-              <w:t xml:space="preserve">141</w:t>
-            </w:r>
-            <w:r>
-              <w:rPr>
-                <w:rFonts w:ascii="Arial" w:hAnsi="Arial" w:cs="Arial"/>
-                <w:sz w:val="22"/>
-                <w:szCs w:val="22"/>
-                <w:rtl/>
-              </w:rPr>
-              <w:t xml:space="preserve"> اختبارًا آليًا، ونموذج تهديدات </w:t>
+              <w:t xml:space="preserve">201</w:t>
+            </w:r>
+            <w:r>
+              <w:rPr>
+                <w:rFonts w:ascii="Arial" w:hAnsi="Arial" w:cs="Arial"/>
+                <w:sz w:val="22"/>
+                <w:szCs w:val="22"/>
+                <w:rtl/>
+              </w:rPr>
+              <w:t xml:space="preserve"> اختبار آلي، ونموذج تهديدات </w:t>
             </w:r>
             <w:r>
               <w:rPr>
@@ -25221,7 +25554,7 @@
                       <w:sz w:val="19"/>
                       <w:szCs w:val="19"/>
                     </w:rPr>
-                    <w:t xml:space="preserve">CIC-IDS2017 [35])</w:t>
+                    <w:t xml:space="preserve">CIC-IDS2017 [36])</w:t>
                   </w:r>
                   <w:r>
                     <w:rPr>
@@ -26356,7 +26689,7 @@
                 <w:sz w:val="19"/>
                 <w:szCs w:val="19"/>
               </w:rPr>
-              <w:t xml:space="preserve">[24]  de Moura, L., &amp; Bjørner, N. (2008). Z3: An Efficient SMT Solver. In Tools and Algorithms for the Construction and Analysis of Systems (TACAS 2008), LNCS 4963, 337–340. Springer. https://doi.org/10.1007/978-3-540-78800-3_24</w:t>
+              <w:t xml:space="preserve">[24]  Huangfu, Q., &amp; Hall, J. A. J. (2018). Parallelizing the dual revised simplex method. Mathematical Programming Computation, 10(1), 119–142. https://doi.org/10.1007/s12532-017-0130-5</w:t>
             </w:r>
           </w:p>
           <w:p>
@@ -26372,7 +26705,7 @@
                 <w:sz w:val="19"/>
                 <w:szCs w:val="19"/>
               </w:rPr>
-              <w:t xml:space="preserve">[25]  Huangfu, Q., &amp; Hall, J. A. J. (2018). Parallelizing the dual revised simplex method. Mathematical Programming Computation, 10(1), 119–142. https://doi.org/10.1007/s12532-017-0130-5</w:t>
+              <w:t xml:space="preserve">[25]  de Moura, L., &amp; Bjørner, N. (2008). Z3: An Efficient SMT Solver. In Tools and Algorithms for the Construction and Analysis of Systems (TACAS 2008), LNCS 4963, 337–340. Springer. https://doi.org/10.1007/978-3-540-78800-3_24</w:t>
             </w:r>
           </w:p>
           <w:p>
@@ -26388,7 +26721,7 @@
                 <w:sz w:val="19"/>
                 <w:szCs w:val="19"/>
               </w:rPr>
-              <w:t xml:space="preserve">[26]  FIRST. (2019). Common Vulnerability Scoring System v3.1: Specification Document. https://www.first.org/cvss/v3-1/specification-document</w:t>
+              <w:t xml:space="preserve">[26]  Alshiekh, M., Bloem, R., Ehlers, R., Könighofer, B., Niekum, S., &amp; Topcu, U. (2018). Safe Reinforcement Learning via Shielding. Proceedings of the AAAI Conference on Artificial Intelligence, 32(1). https://doi.org/10.1609/aaai.v32i1.11797</w:t>
             </w:r>
           </w:p>
           <w:p>
@@ -26404,7 +26737,7 @@
                 <w:sz w:val="19"/>
                 <w:szCs w:val="19"/>
               </w:rPr>
-              <w:t xml:space="preserve">[27]  MITRE. (2026). MITRE ATT&amp;CK® (Enterprise and ICS matrices). https://attack.mitre.org/</w:t>
+              <w:t xml:space="preserve">[27]  FIRST. (2019). Common Vulnerability Scoring System v3.1: Specification Document. https://www.first.org/cvss/v3-1/specification-document</w:t>
             </w:r>
           </w:p>
           <w:p>
@@ -26420,7 +26753,7 @@
                 <w:sz w:val="19"/>
                 <w:szCs w:val="19"/>
               </w:rPr>
-              <w:t xml:space="preserve">[28]  PwC. (2021). Conti cyber attack on the HSE: Independent post incident review. Health Service Executive (Ireland). https://www.hse.ie/eng/services/publications/conti-cyber-attack-on-the-hse-full-report.pdf</w:t>
+              <w:t xml:space="preserve">[28]  MITRE. (2026). MITRE ATT&amp;CK® (Enterprise and ICS matrices). https://attack.mitre.org/</w:t>
             </w:r>
           </w:p>
           <w:p>
@@ -26436,7 +26769,7 @@
                 <w:sz w:val="19"/>
                 <w:szCs w:val="19"/>
               </w:rPr>
-              <w:t xml:space="preserve">[29]  The DFIR Report. (2021–2026). Intrusion reports. https://thedfirreport.com/</w:t>
+              <w:t xml:space="preserve">[29]  PwC. (2021). Conti cyber attack on the HSE: Independent post incident review. Health Service Executive (Ireland). https://www.hse.ie/eng/services/publications/conti-cyber-attack-on-the-hse-full-report.pdf</w:t>
             </w:r>
           </w:p>
           <w:p>
@@ -26452,7 +26785,7 @@
                 <w:sz w:val="19"/>
                 <w:szCs w:val="19"/>
               </w:rPr>
-              <w:t xml:space="preserve">[30]  MITRE Center for Threat-Informed Defense. (2024). Attack Flow (v2) and the Attack Flow corpus [Software and data]. https://github.com/center-for-threat-informed-defense/attack-flow</w:t>
+              <w:t xml:space="preserve">[30]  The DFIR Report. (2021–2026). Intrusion reports. https://thedfirreport.com/</w:t>
             </w:r>
           </w:p>
           <w:p>
@@ -26468,7 +26801,7 @@
                 <w:sz w:val="19"/>
                 <w:szCs w:val="19"/>
               </w:rPr>
-              <w:t xml:space="preserve">[31]  Cybersecurity and Infrastructure Security Agency (CISA). (2013–2026). Cybersecurity Advisories. https://www.cisa.gov/news-events/cybersecurity-advisories</w:t>
+              <w:t xml:space="preserve">[31]  MITRE Center for Threat-Informed Defense. (2024). Attack Flow (v2) and the Attack Flow corpus [Software and data]. https://github.com/center-for-threat-informed-defense/attack-flow</w:t>
             </w:r>
           </w:p>
           <w:p>
@@ -26484,7 +26817,7 @@
                 <w:sz w:val="19"/>
                 <w:szCs w:val="19"/>
               </w:rPr>
-              <w:t xml:space="preserve">[32]  Barkoutsos, P. K., Nannicini, G., Robert, A., Tavernelli, I., &amp; Woerner, S. (2020). Improving Variational Quantum Optimization using CVaR. Quantum, 4, 256. https://doi.org/10.22331/q-2020-04-20-256</w:t>
+              <w:t xml:space="preserve">[32]  Cybersecurity and Infrastructure Security Agency (CISA). (2013–2026). Cybersecurity Advisories. https://www.cisa.gov/news-events/cybersecurity-advisories</w:t>
             </w:r>
           </w:p>
           <w:p>
@@ -26500,63 +26833,7 @@
                 <w:sz w:val="19"/>
                 <w:szCs w:val="19"/>
               </w:rPr>
-              <w:t xml:space="preserve">[33]  National Institute of Standards and Technology. (2024). Module-Lattice-Based Digital Signature Standard (FIPS 204). https://doi.org/10.6028/NIST.FIPS.204</w:t>
-            </w:r>
-          </w:p>
-          <w:p>
-            <w:pPr>
-              <w:bidi/>
-              <w:spacing w:after="50" w:line="300" w:lineRule="auto"/>
-              <w:ind w:start="520" w:hanging="520"/>
-              <w:jc w:val="start"/>
-              <w:rPr>
-                <w:rFonts w:ascii="Arial" w:hAnsi="Arial" w:cs="Arial"/>
-                <w:sz w:val="19"/>
-                <w:szCs w:val="19"/>
-                <w:rtl/>
-              </w:rPr>
-            </w:pPr>
-            <w:r>
-              <w:rPr>
-                <w:rFonts w:ascii="Arial" w:hAnsi="Arial" w:cs="Arial"/>
-                <w:sz w:val="19"/>
-                <w:szCs w:val="19"/>
-              </w:rPr>
-              <w:t xml:space="preserve">[34]</w:t>
-            </w:r>
-            <w:r>
-              <w:rPr>
-                <w:rFonts w:ascii="Arial" w:hAnsi="Arial" w:cs="Arial"/>
-                <w:sz w:val="19"/>
-                <w:szCs w:val="19"/>
-                <w:rtl/>
-              </w:rPr>
-              <w:t xml:space="preserve">  الهيئة السعودية للبيانات والذكاء الاصطناعي (سدايا). (</w:t>
-            </w:r>
-            <w:r>
-              <w:rPr>
-                <w:rFonts w:ascii="Arial" w:hAnsi="Arial" w:cs="Arial"/>
-                <w:sz w:val="19"/>
-                <w:szCs w:val="19"/>
-              </w:rPr>
-              <w:t xml:space="preserve">2023)</w:t>
-            </w:r>
-            <w:r>
-              <w:rPr>
-                <w:rFonts w:ascii="Arial" w:hAnsi="Arial" w:cs="Arial"/>
-                <w:sz w:val="19"/>
-                <w:szCs w:val="19"/>
-                <w:rtl/>
-              </w:rPr>
-              <w:t xml:space="preserve">. مبادئ أخلاقيات الذكاء الاصطناعي (الإصدار </w:t>
-            </w:r>
-            <w:r>
-              <w:rPr>
-                <w:rFonts w:ascii="Arial" w:hAnsi="Arial" w:cs="Arial"/>
-                <w:sz w:val="19"/>
-                <w:szCs w:val="19"/>
-              </w:rPr>
-              <w:t xml:space="preserve">1.0). https://sdaia.gov.sa/en/SDAIA/about/Documents/ai-principles.pdf</w:t>
+              <w:t xml:space="preserve">[33]  Barkoutsos, P. K., Nannicini, G., Robert, A., Tavernelli, I., &amp; Woerner, S. (2020). Improving Variational Quantum Optimization using CVaR. Quantum, 4, 256. https://doi.org/10.22331/q-2020-04-20-256</w:t>
             </w:r>
           </w:p>
           <w:p>
@@ -26572,7 +26849,63 @@
                 <w:sz w:val="19"/>
                 <w:szCs w:val="19"/>
               </w:rPr>
-              <w:t xml:space="preserve">[35]  Sharafaldin, I., Lashkari, A. H., &amp; Ghorbani, A. A. (2018). Toward Generating a New Intrusion Detection Dataset and Intrusion Traffic Characterization. In Proceedings of ICISSP 2018, 108–116. https://doi.org/10.5220/0006639801080116</w:t>
+              <w:t xml:space="preserve">[34]  National Institute of Standards and Technology. (2024). Module-Lattice-Based Digital Signature Standard (FIPS 204). https://doi.org/10.6028/NIST.FIPS.204</w:t>
+            </w:r>
+          </w:p>
+          <w:p>
+            <w:pPr>
+              <w:bidi/>
+              <w:spacing w:after="50" w:line="300" w:lineRule="auto"/>
+              <w:ind w:start="520" w:hanging="520"/>
+              <w:jc w:val="start"/>
+              <w:rPr>
+                <w:rFonts w:ascii="Arial" w:hAnsi="Arial" w:cs="Arial"/>
+                <w:sz w:val="19"/>
+                <w:szCs w:val="19"/>
+                <w:rtl/>
+              </w:rPr>
+            </w:pPr>
+            <w:r>
+              <w:rPr>
+                <w:rFonts w:ascii="Arial" w:hAnsi="Arial" w:cs="Arial"/>
+                <w:sz w:val="19"/>
+                <w:szCs w:val="19"/>
+              </w:rPr>
+              <w:t xml:space="preserve">[35]</w:t>
+            </w:r>
+            <w:r>
+              <w:rPr>
+                <w:rFonts w:ascii="Arial" w:hAnsi="Arial" w:cs="Arial"/>
+                <w:sz w:val="19"/>
+                <w:szCs w:val="19"/>
+                <w:rtl/>
+              </w:rPr>
+              <w:t xml:space="preserve">  الهيئة السعودية للبيانات والذكاء الاصطناعي (سدايا). (</w:t>
+            </w:r>
+            <w:r>
+              <w:rPr>
+                <w:rFonts w:ascii="Arial" w:hAnsi="Arial" w:cs="Arial"/>
+                <w:sz w:val="19"/>
+                <w:szCs w:val="19"/>
+              </w:rPr>
+              <w:t xml:space="preserve">2023)</w:t>
+            </w:r>
+            <w:r>
+              <w:rPr>
+                <w:rFonts w:ascii="Arial" w:hAnsi="Arial" w:cs="Arial"/>
+                <w:sz w:val="19"/>
+                <w:szCs w:val="19"/>
+                <w:rtl/>
+              </w:rPr>
+              <w:t xml:space="preserve">. مبادئ أخلاقيات الذكاء الاصطناعي (الإصدار </w:t>
+            </w:r>
+            <w:r>
+              <w:rPr>
+                <w:rFonts w:ascii="Arial" w:hAnsi="Arial" w:cs="Arial"/>
+                <w:sz w:val="19"/>
+                <w:szCs w:val="19"/>
+              </w:rPr>
+              <w:t xml:space="preserve">1.0). https://sdaia.gov.sa/en/SDAIA/about/Documents/ai-principles.pdf</w:t>
             </w:r>
           </w:p>
           <w:p>
@@ -26588,7 +26921,7 @@
                 <w:sz w:val="19"/>
                 <w:szCs w:val="19"/>
               </w:rPr>
-              <w:t xml:space="preserve">[36]  Anthropic. (2026). Claude (Opus) [Large language model]. Used September–October 2026 for code assistance, analysis, source search and drafting support, as disclosed in this section. https://claude.ai</w:t>
+              <w:t xml:space="preserve">[36]  Sharafaldin, I., Lashkari, A. H., &amp; Ghorbani, A. A. (2018). Toward Generating a New Intrusion Detection Dataset and Intrusion Traffic Characterization. In Proceedings of ICISSP 2018, 108–116. https://doi.org/10.5220/0006639801080116</w:t>
             </w:r>
           </w:p>
           <w:p>
@@ -26604,7 +26937,23 @@
                 <w:sz w:val="19"/>
                 <w:szCs w:val="19"/>
               </w:rPr>
-              <w:t xml:space="preserve">[37]  OpenAI. (2026). ChatGPT and Codex [Large language models]. Used September–October 2026 as an independent reviewer of text and code. https://chatgpt.com</w:t>
+              <w:t xml:space="preserve">[37]  Anthropic. (2026). Claude (Opus) [Large language model]. Used September–October 2026 for code assistance, analysis, source search and drafting support, as disclosed in this section. https://claude.ai</w:t>
+            </w:r>
+          </w:p>
+          <w:p>
+            <w:pPr>
+              <w:bidi w:val="0"/>
+              <w:spacing w:after="50" w:line="276" w:lineRule="auto"/>
+              <w:ind w:left="520" w:hanging="520"/>
+              <w:jc w:val="left"/>
+            </w:pPr>
+            <w:r>
+              <w:rPr>
+                <w:rFonts w:ascii="Arial" w:hAnsi="Arial" w:cs="Arial"/>
+                <w:sz w:val="19"/>
+                <w:szCs w:val="19"/>
+              </w:rPr>
+              <w:t xml:space="preserve">[38]  OpenAI. (2026). ChatGPT and Codex [Large language models]. Used September–October 2026 as an independent reviewer of text and code. https://chatgpt.com</w:t>
             </w:r>
           </w:p>
           <w:p>
@@ -26688,7 +27037,7 @@
                 <w:sz w:val="22"/>
                 <w:szCs w:val="22"/>
               </w:rPr>
-              <w:t xml:space="preserve">Anthropic) [36]</w:t>
+              <w:t xml:space="preserve">Anthropic) [37]</w:t>
             </w:r>
             <w:r>
               <w:rPr>
@@ -26722,7 +27071,7 @@
                 <w:sz w:val="22"/>
                 <w:szCs w:val="22"/>
               </w:rPr>
-              <w:t xml:space="preserve">OpenAI) [37]</w:t>
+              <w:t xml:space="preserve">OpenAI) [38]</w:t>
             </w:r>
             <w:r>
               <w:rPr>
@@ -26841,7 +27190,7 @@
                 <w:szCs w:val="22"/>
                 <w:rtl/>
               </w:rPr>
-              <w:t xml:space="preserve">–  تشغيل تجارب المحاكاة ونواة </w:t>
+              <w:t xml:space="preserve">–  توجيه تجارب المحاكاة ونواة </w:t>
             </w:r>
             <w:r>
               <w:rPr>
@@ -26858,7 +27207,7 @@
                 <w:szCs w:val="22"/>
                 <w:rtl/>
               </w:rPr>
-              <w:t xml:space="preserve"> على حاسوبه، والتجارب على حواسيب </w:t>
+              <w:t xml:space="preserve">، وتشغيل التجارب على حواسيب </w:t>
             </w:r>
             <w:r>
               <w:rPr>
@@ -27006,7 +27355,24 @@
                 <w:szCs w:val="22"/>
                 <w:rtl/>
               </w:rPr>
-              <w:t xml:space="preserve">–  كتابة معظم الكود والاختبارات الآلية.</w:t>
+              <w:t xml:space="preserve">–  كتابة معظم الكود والاختبارات الآلية، وتشغيل تجارب المحاكاة ونواة </w:t>
+            </w:r>
+            <w:r>
+              <w:rPr>
+                <w:rFonts w:ascii="Arial" w:hAnsi="Arial" w:cs="Arial"/>
+                <w:sz w:val="22"/>
+                <w:szCs w:val="22"/>
+              </w:rPr>
+              <w:t xml:space="preserve">Linux</w:t>
+            </w:r>
+            <w:r>
+              <w:rPr>
+                <w:rFonts w:ascii="Arial" w:hAnsi="Arial" w:cs="Arial"/>
+                <w:sz w:val="22"/>
+                <w:szCs w:val="22"/>
+                <w:rtl/>
+              </w:rPr>
+              <w:t xml:space="preserve"> في بيئته البرمجية بتوجيه الطالب.</w:t>
             </w:r>
           </w:p>
           <w:p>

</xml_diff>

<commit_message>
form v20: fix Table 1 escalation value, scope abstract claims
Co-Authored-By: Claude Opus 5.5 <noreply@anthropic.com>
Claude-Session: https://claude.ai/code/session_011J2KrGUp2npQo9Tosx1KRc
</commit_message>
<xml_diff>
--- a/docs/qacrs/form_drafts/IBDAA_2027_FORM_ACRS_v20.docx
+++ b/docs/qacrs/form_drafts/IBDAA_2027_FORM_ACRS_v20.docx
@@ -3292,7 +3292,41 @@
                 <w:szCs w:val="22"/>
                 <w:rtl/>
               </w:rPr>
-              <w:t xml:space="preserve"> أجهزة إجباره على إيقاف أي خدمة.</w:t>
+              <w:t xml:space="preserve"> أجهزة (شبكتا </w:t>
+            </w:r>
+            <w:r>
+              <w:rPr>
+                <w:rFonts w:ascii="Arial" w:hAnsi="Arial" w:cs="Arial"/>
+                <w:sz w:val="22"/>
+                <w:szCs w:val="22"/>
+              </w:rPr>
+              <w:t xml:space="preserve">12</w:t>
+            </w:r>
+            <w:r>
+              <w:rPr>
+                <w:rFonts w:ascii="Arial" w:hAnsi="Arial" w:cs="Arial"/>
+                <w:sz w:val="22"/>
+                <w:szCs w:val="22"/>
+                <w:rtl/>
+              </w:rPr>
+              <w:t xml:space="preserve"> و</w:t>
+            </w:r>
+            <w:r>
+              <w:rPr>
+                <w:rFonts w:ascii="Arial" w:hAnsi="Arial" w:cs="Arial"/>
+                <w:sz w:val="22"/>
+                <w:szCs w:val="22"/>
+              </w:rPr>
+              <w:t xml:space="preserve">22</w:t>
+            </w:r>
+            <w:r>
+              <w:rPr>
+                <w:rFonts w:ascii="Arial" w:hAnsi="Arial" w:cs="Arial"/>
+                <w:sz w:val="22"/>
+                <w:szCs w:val="22"/>
+                <w:rtl/>
+              </w:rPr>
+              <w:t xml:space="preserve"> جهازًا) إجباره على إيقاف أي خدمة.</w:t>
             </w:r>
           </w:p>
           <w:p>
@@ -3349,7 +3383,41 @@
                 <w:szCs w:val="22"/>
                 <w:rtl/>
               </w:rPr>
-              <w:t xml:space="preserve"> من الحالات التركيبية، و</w:t>
+              <w:t xml:space="preserve"> من الحالات التركيبية (دون هدفنا </w:t>
+            </w:r>
+            <w:r>
+              <w:rPr>
+                <w:rFonts w:ascii="Arial" w:hAnsi="Arial" w:cs="Arial"/>
+                <w:sz w:val="22"/>
+                <w:szCs w:val="22"/>
+              </w:rPr>
+              <w:t xml:space="preserve">50)</w:t>
+            </w:r>
+            <w:r>
+              <w:rPr>
+                <w:rFonts w:ascii="Arial" w:hAnsi="Arial" w:cs="Arial"/>
+                <w:sz w:val="22"/>
+                <w:szCs w:val="22"/>
+                <w:rtl/>
+              </w:rPr>
+              <w:t xml:space="preserve">، أما على </w:t>
+            </w:r>
+            <w:r>
+              <w:rPr>
+                <w:rFonts w:ascii="Arial" w:hAnsi="Arial" w:cs="Arial"/>
+                <w:sz w:val="22"/>
+                <w:szCs w:val="22"/>
+              </w:rPr>
+              <w:t xml:space="preserve">66</w:t>
+            </w:r>
+            <w:r>
+              <w:rPr>
+                <w:rFonts w:ascii="Arial" w:hAnsi="Arial" w:cs="Arial"/>
+                <w:sz w:val="22"/>
+                <w:szCs w:val="22"/>
+                <w:rtl/>
+              </w:rPr>
+              <w:t xml:space="preserve"> حالة حقيقية وواقعية فبلغ </w:t>
             </w:r>
             <w:r>
               <w:rPr>
@@ -3366,41 +3434,7 @@
                 <w:szCs w:val="22"/>
                 <w:rtl/>
               </w:rPr>
-              <w:t xml:space="preserve"> على </w:t>
-            </w:r>
-            <w:r>
-              <w:rPr>
-                <w:rFonts w:ascii="Arial" w:hAnsi="Arial" w:cs="Arial"/>
-                <w:sz w:val="22"/>
-                <w:szCs w:val="22"/>
-              </w:rPr>
-              <w:t xml:space="preserve">66</w:t>
-            </w:r>
-            <w:r>
-              <w:rPr>
-                <w:rFonts w:ascii="Arial" w:hAnsi="Arial" w:cs="Arial"/>
-                <w:sz w:val="22"/>
-                <w:szCs w:val="22"/>
-                <w:rtl/>
-              </w:rPr>
-              <w:t xml:space="preserve"> حالة حقيقية وواقعية، فوق هدفنا (</w:t>
-            </w:r>
-            <w:r>
-              <w:rPr>
-                <w:rFonts w:ascii="Arial" w:hAnsi="Arial" w:cs="Arial"/>
-                <w:sz w:val="22"/>
-                <w:szCs w:val="22"/>
-              </w:rPr>
-              <w:t xml:space="preserve">50)</w:t>
-            </w:r>
-            <w:r>
-              <w:rPr>
-                <w:rFonts w:ascii="Arial" w:hAnsi="Arial" w:cs="Arial"/>
-                <w:sz w:val="22"/>
-                <w:szCs w:val="22"/>
-                <w:rtl/>
-              </w:rPr>
-              <w:t xml:space="preserve">.</w:t>
+              <w:t xml:space="preserve"> ولم يتحقق الهدف.</w:t>
             </w:r>
           </w:p>
           <w:p>
@@ -3531,7 +3565,7 @@
                 <w:szCs w:val="22"/>
                 <w:rtl/>
               </w:rPr>
-              <w:t xml:space="preserve"> فحص، وأثبتنا رياضيًا خمس خصائص سلامة لكل المدخلات.</w:t>
+              <w:t xml:space="preserve"> فحص، وأثبتنا رياضيًا خمس خصائص سلامة لكل المدخلات على خمس شبكات اختبار.</w:t>
             </w:r>
           </w:p>
           <w:p>
@@ -17282,7 +17316,7 @@
                       <w:sz w:val="19"/>
                       <w:szCs w:val="19"/>
                     </w:rPr>
-                    <w:t xml:space="preserve">164</w:t>
+                    <w:t xml:space="preserve">0</w:t>
                   </w:r>
                 </w:p>
               </w:tc>

</xml_diff>

<commit_message>
form v20: close blind-review gaps (H1 split, why-QUBO, hypothesis-sample map, recent prior work, silent-failure transparency, factory analysis, plan spread)
Co-Authored-By: Claude Opus 5.5 <noreply@anthropic.com>
Claude-Session: https://claude.ai/code/session_011J2KrGUp2npQo9Tosx1KRc
</commit_message>
<xml_diff>
--- a/docs/qacrs/form_drafts/IBDAA_2027_FORM_ACRS_v20.docx
+++ b/docs/qacrs/form_drafts/IBDAA_2027_FORM_ACRS_v20.docx
@@ -3059,24 +3059,7 @@
                 <w:szCs w:val="22"/>
                 <w:rtl/>
               </w:rPr>
-              <w:t xml:space="preserve">. وفي النسخة النهائية (</w:t>
-            </w:r>
-            <w:r>
-              <w:rPr>
-                <w:rFonts w:ascii="Arial" w:hAnsi="Arial" w:cs="Arial"/>
-                <w:sz w:val="22"/>
-                <w:szCs w:val="22"/>
-              </w:rPr>
-              <w:t xml:space="preserve">v12)</w:t>
-            </w:r>
-            <w:r>
-              <w:rPr>
-                <w:rFonts w:ascii="Arial" w:hAnsi="Arial" w:cs="Arial"/>
-                <w:sz w:val="22"/>
-                <w:szCs w:val="22"/>
-                <w:rtl/>
-              </w:rPr>
-              <w:t xml:space="preserve"> أوقف على </w:t>
+              <w:t xml:space="preserve">، وعلى </w:t>
             </w:r>
             <w:r>
               <w:rPr>
@@ -3093,7 +3076,7 @@
                 <w:szCs w:val="22"/>
                 <w:rtl/>
               </w:rPr>
-              <w:t xml:space="preserve"> سلسلة أخرى </w:t>
+              <w:t xml:space="preserve"> سلسلة أخرى أوقفت نسخته النهائية </w:t>
             </w:r>
             <w:r>
               <w:rPr>
@@ -3110,7 +3093,7 @@
                 <w:szCs w:val="22"/>
                 <w:rtl/>
               </w:rPr>
-              <w:t xml:space="preserve"> خدمات بعد موافقة البشر، مقابل </w:t>
+              <w:t xml:space="preserve"> خدمات مقابل </w:t>
             </w:r>
             <w:r>
               <w:rPr>
@@ -3127,24 +3110,7 @@
                 <w:szCs w:val="22"/>
                 <w:rtl/>
               </w:rPr>
-              <w:t xml:space="preserve"> للعزل الكامل و</w:t>
-            </w:r>
-            <w:r>
-              <w:rPr>
-                <w:rFonts w:ascii="Arial" w:hAnsi="Arial" w:cs="Arial"/>
-                <w:sz w:val="22"/>
-                <w:szCs w:val="22"/>
-              </w:rPr>
-              <w:t xml:space="preserve">12</w:t>
-            </w:r>
-            <w:r>
-              <w:rPr>
-                <w:rFonts w:ascii="Arial" w:hAnsi="Arial" w:cs="Arial"/>
-                <w:sz w:val="22"/>
-                <w:szCs w:val="22"/>
-                <w:rtl/>
-              </w:rPr>
-              <w:t xml:space="preserve"> لقاعدة بسيطة.</w:t>
+              <w:t xml:space="preserve"> للعزل الكامل.</w:t>
             </w:r>
           </w:p>
           <w:p>
@@ -3639,7 +3605,7 @@
                 <w:szCs w:val="22"/>
                 <w:rtl/>
               </w:rPr>
-              <w:t xml:space="preserve"> مسألة فرعية مترابطة (</w:t>
+              <w:t xml:space="preserve"> مسألة فرعية (</w:t>
             </w:r>
             <w:r>
               <w:rPr>
@@ -3656,7 +3622,7 @@
                 <w:szCs w:val="22"/>
                 <w:rtl/>
               </w:rPr>
-              <w:t xml:space="preserve"> كيوبت) من حادثة في شبكة </w:t>
+              <w:t xml:space="preserve"> كيوبت) من شبكة </w:t>
             </w:r>
             <w:r>
               <w:rPr>
@@ -3673,7 +3639,7 @@
                 <w:szCs w:val="22"/>
                 <w:rtl/>
               </w:rPr>
-              <w:t xml:space="preserve"> جهازًا، وحُسم الباقي كلاسيكيًا، بعد أن أثبتنا أن تصغير عقوبة السلامة لا يغيّر الحل الأمثل، دون ادعاء تفوق كمّي.</w:t>
+              <w:t xml:space="preserve"> جهازًا، دون ادعاء تفوق كمّي.</w:t>
             </w:r>
           </w:p>
           <w:p>
@@ -4188,7 +4154,7 @@
                 <w:szCs w:val="22"/>
                 <w:rtl/>
               </w:rPr>
-              <w:t xml:space="preserve"> لأن بعض الأنظمة إذا توقفت ولو لوقت قصير قد تؤدي إلى خسائر بشرية؛ فقد وجدت دراسة على المستشفيات الأمريكية أن وفيات المرضى المنوّمين وقت بدء هجوم الفدية ارتفعت </w:t>
+              <w:t xml:space="preserve"> لأن بعض الأنظمة إذا توقفت ولو لوقت قصير قد تؤدي إلى خسائر بشرية؛ فقد وجدت دراسة محكّمة على مستشفيات أمريكية أن الوفيات داخل المستشفى، بين المرضى المنوّمين لحظة بدء هجوم الفدية، ارتفعت </w:t>
             </w:r>
             <w:r>
               <w:rPr>
@@ -5533,7 +5499,24 @@
                 <w:szCs w:val="22"/>
                 <w:rtl/>
               </w:rPr>
-              <w:t xml:space="preserve">وتنقسم طرق اختيار الرد في هذه المراجعات إلى أربع عائلات: قواعد ثابتة يكتبها الخبير، واختيار بحسب التكلفة والفائدة، ونماذج الألعاب والتعلم المعزز التي تتعلم الرد من التجربة، والتجزئة المسبقة للشبكة. ولكل عائلة قصور: القواعد لا ترى الشبكة كاملة، والتكلفة والفائدة تُحسب لكل هجوم وحده، والتعلم يصعب إثبات سلامته، والتجزئة المسبقة لا تتغير أثناء الهجوم.</w:t>
+              <w:t xml:space="preserve">وتنقسم طرق اختيار الرد في هذه المراجعات إلى أربع عائلات: قواعد ثابتة يكتبها الخبير، واختيار بحسب التكلفة والفائدة، ونماذج الألعاب والتعلم المعزز التي تتعلم الرد من التجربة، وهي أنشط اتجاه بحثي حاليًا </w:t>
+            </w:r>
+            <w:r>
+              <w:rPr>
+                <w:rFonts w:ascii="Arial" w:hAnsi="Arial" w:cs="Arial"/>
+                <w:sz w:val="22"/>
+                <w:szCs w:val="22"/>
+              </w:rPr>
+              <w:t xml:space="preserve">[12][13]</w:t>
+            </w:r>
+            <w:r>
+              <w:rPr>
+                <w:rFonts w:ascii="Arial" w:hAnsi="Arial" w:cs="Arial"/>
+                <w:sz w:val="22"/>
+                <w:szCs w:val="22"/>
+                <w:rtl/>
+              </w:rPr>
+              <w:t xml:space="preserve">، والتجزئة المسبقة للشبكة. ولكل عائلة قصور: القواعد لا ترى الشبكة كاملة، والتكلفة والفائدة تُحسب لكل هجوم وحده، والتعلم يصعب إثبات سلامته، والتجزئة المسبقة لا تتغير أثناء الهجوم.</w:t>
             </w:r>
           </w:p>
           <w:p>
@@ -5707,7 +5690,7 @@
                       <w:sz w:val="19"/>
                       <w:szCs w:val="19"/>
                     </w:rPr>
-                    <w:t xml:space="preserve">Microsoft Defender [12]</w:t>
+                    <w:t xml:space="preserve">Microsoft Defender [14]</w:t>
                   </w:r>
                 </w:p>
               </w:tc>
@@ -5801,7 +5784,7 @@
                       <w:sz w:val="19"/>
                       <w:szCs w:val="19"/>
                     </w:rPr>
-                    <w:t xml:space="preserve">CrowdStrike [13]</w:t>
+                    <w:t xml:space="preserve">CrowdStrike [15]</w:t>
                   </w:r>
                 </w:p>
               </w:tc>
@@ -5903,7 +5886,7 @@
                       <w:sz w:val="19"/>
                       <w:szCs w:val="19"/>
                     </w:rPr>
-                    <w:t xml:space="preserve">2018 [14]</w:t>
+                    <w:t xml:space="preserve">2018 [16]</w:t>
                   </w:r>
                 </w:p>
               </w:tc>
@@ -6005,7 +5988,7 @@
                       <w:sz w:val="19"/>
                       <w:szCs w:val="19"/>
                     </w:rPr>
-                    <w:t xml:space="preserve">2024 [15]</w:t>
+                    <w:t xml:space="preserve">2024 [17]</w:t>
                   </w:r>
                 </w:p>
               </w:tc>
@@ -6132,7 +6115,24 @@
                       <w:sz w:val="19"/>
                       <w:szCs w:val="19"/>
                     </w:rPr>
-                    <w:t xml:space="preserve">2022 [16]</w:t>
+                    <w:t xml:space="preserve">2022</w:t>
+                  </w:r>
+                  <w:r>
+                    <w:rPr>
+                      <w:rFonts w:ascii="Arial" w:hAnsi="Arial" w:cs="Arial"/>
+                      <w:sz w:val="19"/>
+                      <w:szCs w:val="19"/>
+                      <w:rtl/>
+                    </w:rPr>
+                    <w:t xml:space="preserve"> و</w:t>
+                  </w:r>
+                  <w:r>
+                    <w:rPr>
+                      <w:rFonts w:ascii="Arial" w:hAnsi="Arial" w:cs="Arial"/>
+                      <w:sz w:val="19"/>
+                      <w:szCs w:val="19"/>
+                    </w:rPr>
+                    <w:t xml:space="preserve">2024 [18][12]</w:t>
                   </w:r>
                 </w:p>
               </w:tc>
@@ -6159,7 +6159,7 @@
                       <w:szCs w:val="19"/>
                       <w:rtl/>
                     </w:rPr>
-                    <w:t xml:space="preserve">متى يتدخل المدافع (التوقف الأمثل)</w:t>
+                    <w:t xml:space="preserve">تعلّم توقيت الاستجابة الأمثل أمام مهاجم يغيّر سلوكه</w:t>
                   </w:r>
                 </w:p>
               </w:tc>
@@ -6186,7 +6186,7 @@
                       <w:szCs w:val="19"/>
                       <w:rtl/>
                     </w:rPr>
-                    <w:t xml:space="preserve">متى، لا أي إجراء على أي جهاز</w:t>
+                    <w:t xml:space="preserve">متى يتدخل، لا أي درجة احتواء لكل جهاز؛ والسياسة متعلَّمة بلا بوابة مثبتة</w:t>
                   </w:r>
                 </w:p>
               </w:tc>
@@ -6217,24 +6217,24 @@
                       <w:sz w:val="19"/>
                       <w:szCs w:val="19"/>
                     </w:rPr>
-                    <w:t xml:space="preserve">CybORG</w:t>
-                  </w:r>
-                  <w:r>
-                    <w:rPr>
-                      <w:rFonts w:ascii="Arial" w:hAnsi="Arial" w:cs="Arial"/>
-                      <w:sz w:val="19"/>
-                      <w:szCs w:val="19"/>
-                      <w:rtl/>
-                    </w:rPr>
-                    <w:t xml:space="preserve">، </w:t>
-                  </w:r>
-                  <w:r>
-                    <w:rPr>
-                      <w:rFonts w:ascii="Arial" w:hAnsi="Arial" w:cs="Arial"/>
-                      <w:sz w:val="19"/>
-                      <w:szCs w:val="19"/>
-                    </w:rPr>
-                    <w:t xml:space="preserve">2021 [17]</w:t>
+                    <w:t xml:space="preserve">Hammar</w:t>
+                  </w:r>
+                  <w:r>
+                    <w:rPr>
+                      <w:rFonts w:ascii="Arial" w:hAnsi="Arial" w:cs="Arial"/>
+                      <w:sz w:val="19"/>
+                      <w:szCs w:val="19"/>
+                      <w:rtl/>
+                    </w:rPr>
+                    <w:t xml:space="preserve"> وزملاؤه، </w:t>
+                  </w:r>
+                  <w:r>
+                    <w:rPr>
+                      <w:rFonts w:ascii="Arial" w:hAnsi="Arial" w:cs="Arial"/>
+                      <w:sz w:val="19"/>
+                      <w:szCs w:val="19"/>
+                    </w:rPr>
+                    <w:t xml:space="preserve">2025 [13]</w:t>
                   </w:r>
                 </w:p>
               </w:tc>
@@ -6261,7 +6261,7 @@
                       <w:szCs w:val="19"/>
                       <w:rtl/>
                     </w:rPr>
-                    <w:t xml:space="preserve">بيئة لتدريب وكلاء دفاع بالتعلم المعزز</w:t>
+                    <w:t xml:space="preserve">استجابة تتكيف آنيًا مع نموذج المهاجم</w:t>
                   </w:r>
                 </w:p>
               </w:tc>
@@ -6288,7 +6288,7 @@
                       <w:szCs w:val="19"/>
                       <w:rtl/>
                     </w:rPr>
-                    <w:t xml:space="preserve">سلامة القرار المتعلَّم يصعب إثباتها قبل التنفيذ</w:t>
+                    <w:t xml:space="preserve">لا تجزئة للخادم الحرج، ولا إثبات سلامة قبل التنفيذ</w:t>
                   </w:r>
                 </w:p>
               </w:tc>
@@ -6318,17 +6318,25 @@
                       <w:rFonts w:ascii="Arial" w:hAnsi="Arial" w:cs="Arial"/>
                       <w:sz w:val="19"/>
                       <w:szCs w:val="19"/>
-                      <w:rtl/>
-                    </w:rPr>
-                    <w:t xml:space="preserve">الثقة المعدومة، </w:t>
-                  </w:r>
-                  <w:r>
-                    <w:rPr>
-                      <w:rFonts w:ascii="Arial" w:hAnsi="Arial" w:cs="Arial"/>
-                      <w:sz w:val="19"/>
-                      <w:szCs w:val="19"/>
-                    </w:rPr>
-                    <w:t xml:space="preserve">NIST [18]</w:t>
+                    </w:rPr>
+                    <w:t xml:space="preserve">CybORG</w:t>
+                  </w:r>
+                  <w:r>
+                    <w:rPr>
+                      <w:rFonts w:ascii="Arial" w:hAnsi="Arial" w:cs="Arial"/>
+                      <w:sz w:val="19"/>
+                      <w:szCs w:val="19"/>
+                      <w:rtl/>
+                    </w:rPr>
+                    <w:t xml:space="preserve">، </w:t>
+                  </w:r>
+                  <w:r>
+                    <w:rPr>
+                      <w:rFonts w:ascii="Arial" w:hAnsi="Arial" w:cs="Arial"/>
+                      <w:sz w:val="19"/>
+                      <w:szCs w:val="19"/>
+                    </w:rPr>
+                    <w:t xml:space="preserve">2021 [19]</w:t>
                   </w:r>
                 </w:p>
               </w:tc>
@@ -6355,7 +6363,7 @@
                       <w:szCs w:val="19"/>
                       <w:rtl/>
                     </w:rPr>
-                    <w:t xml:space="preserve">تجزئة الشبكة مسبقًا</w:t>
+                    <w:t xml:space="preserve">بيئة لتدريب وكلاء دفاع بالتعلم المعزز</w:t>
                   </w:r>
                 </w:p>
               </w:tc>
@@ -6382,7 +6390,7 @@
                       <w:szCs w:val="19"/>
                       <w:rtl/>
                     </w:rPr>
-                    <w:t xml:space="preserve">لا تحدد أي جهاز يُعزل أثناء الهجوم</w:t>
+                    <w:t xml:space="preserve">سلامة القرار المتعلَّم يصعب إثباتها قبل التنفيذ</w:t>
                   </w:r>
                 </w:p>
               </w:tc>
@@ -6412,25 +6420,17 @@
                       <w:rFonts w:ascii="Arial" w:hAnsi="Arial" w:cs="Arial"/>
                       <w:sz w:val="19"/>
                       <w:szCs w:val="19"/>
-                    </w:rPr>
-                    <w:t xml:space="preserve">Cogburn</w:t>
-                  </w:r>
-                  <w:r>
-                    <w:rPr>
-                      <w:rFonts w:ascii="Arial" w:hAnsi="Arial" w:cs="Arial"/>
-                      <w:sz w:val="19"/>
-                      <w:szCs w:val="19"/>
-                      <w:rtl/>
-                    </w:rPr>
-                    <w:t xml:space="preserve"> وزملاؤه، </w:t>
-                  </w:r>
-                  <w:r>
-                    <w:rPr>
-                      <w:rFonts w:ascii="Arial" w:hAnsi="Arial" w:cs="Arial"/>
-                      <w:sz w:val="19"/>
-                      <w:szCs w:val="19"/>
-                    </w:rPr>
-                    <w:t xml:space="preserve">2026 [19]</w:t>
+                      <w:rtl/>
+                    </w:rPr>
+                    <w:t xml:space="preserve">الثقة المعدومة، </w:t>
+                  </w:r>
+                  <w:r>
+                    <w:rPr>
+                      <w:rFonts w:ascii="Arial" w:hAnsi="Arial" w:cs="Arial"/>
+                      <w:sz w:val="19"/>
+                      <w:szCs w:val="19"/>
+                    </w:rPr>
+                    <w:t xml:space="preserve">NIST [20]</w:t>
                   </w:r>
                 </w:p>
               </w:tc>
@@ -6455,34 +6455,9 @@
                       <w:rFonts w:ascii="Arial" w:hAnsi="Arial" w:cs="Arial"/>
                       <w:sz w:val="19"/>
                       <w:szCs w:val="19"/>
-                    </w:rPr>
-                    <w:t xml:space="preserve">QAOA</w:t>
-                  </w:r>
-                  <w:r>
-                    <w:rPr>
-                      <w:rFonts w:ascii="Arial" w:hAnsi="Arial" w:cs="Arial"/>
-                      <w:sz w:val="19"/>
-                      <w:szCs w:val="19"/>
-                      <w:rtl/>
-                    </w:rPr>
-                    <w:t xml:space="preserve"> على حاسوب </w:t>
-                  </w:r>
-                  <w:r>
-                    <w:rPr>
-                      <w:rFonts w:ascii="Arial" w:hAnsi="Arial" w:cs="Arial"/>
-                      <w:sz w:val="19"/>
-                      <w:szCs w:val="19"/>
-                    </w:rPr>
-                    <w:t xml:space="preserve">IBM</w:t>
-                  </w:r>
-                  <w:r>
-                    <w:rPr>
-                      <w:rFonts w:ascii="Arial" w:hAnsi="Arial" w:cs="Arial"/>
-                      <w:sz w:val="19"/>
-                      <w:szCs w:val="19"/>
-                      <w:rtl/>
-                    </w:rPr>
-                    <w:t xml:space="preserve"> لتقسيم حركة شبكة مصائد</w:t>
+                      <w:rtl/>
+                    </w:rPr>
+                    <w:t xml:space="preserve">تجزئة الشبكة مسبقًا</w:t>
                   </w:r>
                 </w:p>
               </w:tc>
@@ -6509,6 +6484,133 @@
                       <w:szCs w:val="19"/>
                       <w:rtl/>
                     </w:rPr>
+                    <w:t xml:space="preserve">لا تحدد أي جهاز يُعزل أثناء الهجوم</w:t>
+                  </w:r>
+                </w:p>
+              </w:tc>
+            </w:tr>
+            <w:tr>
+              <w:trPr>
+                <w:cantSplit/>
+              </w:trPr>
+              <w:tc>
+                <w:tcPr>
+                  <w:tcW w:w="2936" w:type="dxa"/>
+                </w:tcPr>
+                <w:p>
+                  <w:pPr>
+                    <w:bidi/>
+                    <w:spacing w:after="0" w:line="300" w:lineRule="auto"/>
+                    <w:jc w:val="start"/>
+                    <w:rPr>
+                      <w:rFonts w:ascii="Arial" w:hAnsi="Arial" w:cs="Arial"/>
+                      <w:sz w:val="19"/>
+                      <w:szCs w:val="19"/>
+                      <w:rtl/>
+                    </w:rPr>
+                  </w:pPr>
+                  <w:r>
+                    <w:rPr>
+                      <w:rFonts w:ascii="Arial" w:hAnsi="Arial" w:cs="Arial"/>
+                      <w:sz w:val="19"/>
+                      <w:szCs w:val="19"/>
+                    </w:rPr>
+                    <w:t xml:space="preserve">Cogburn</w:t>
+                  </w:r>
+                  <w:r>
+                    <w:rPr>
+                      <w:rFonts w:ascii="Arial" w:hAnsi="Arial" w:cs="Arial"/>
+                      <w:sz w:val="19"/>
+                      <w:szCs w:val="19"/>
+                      <w:rtl/>
+                    </w:rPr>
+                    <w:t xml:space="preserve"> وزملاؤه، </w:t>
+                  </w:r>
+                  <w:r>
+                    <w:rPr>
+                      <w:rFonts w:ascii="Arial" w:hAnsi="Arial" w:cs="Arial"/>
+                      <w:sz w:val="19"/>
+                      <w:szCs w:val="19"/>
+                    </w:rPr>
+                    <w:t xml:space="preserve">2026 [21]</w:t>
+                  </w:r>
+                </w:p>
+              </w:tc>
+              <w:tc>
+                <w:tcPr>
+                  <w:tcW w:w="3230" w:type="dxa"/>
+                </w:tcPr>
+                <w:p>
+                  <w:pPr>
+                    <w:bidi/>
+                    <w:spacing w:after="0" w:line="300" w:lineRule="auto"/>
+                    <w:jc w:val="start"/>
+                    <w:rPr>
+                      <w:rFonts w:ascii="Arial" w:hAnsi="Arial" w:cs="Arial"/>
+                      <w:sz w:val="19"/>
+                      <w:szCs w:val="19"/>
+                      <w:rtl/>
+                    </w:rPr>
+                  </w:pPr>
+                  <w:r>
+                    <w:rPr>
+                      <w:rFonts w:ascii="Arial" w:hAnsi="Arial" w:cs="Arial"/>
+                      <w:sz w:val="19"/>
+                      <w:szCs w:val="19"/>
+                    </w:rPr>
+                    <w:t xml:space="preserve">QAOA</w:t>
+                  </w:r>
+                  <w:r>
+                    <w:rPr>
+                      <w:rFonts w:ascii="Arial" w:hAnsi="Arial" w:cs="Arial"/>
+                      <w:sz w:val="19"/>
+                      <w:szCs w:val="19"/>
+                      <w:rtl/>
+                    </w:rPr>
+                    <w:t xml:space="preserve"> على حاسوب </w:t>
+                  </w:r>
+                  <w:r>
+                    <w:rPr>
+                      <w:rFonts w:ascii="Arial" w:hAnsi="Arial" w:cs="Arial"/>
+                      <w:sz w:val="19"/>
+                      <w:szCs w:val="19"/>
+                    </w:rPr>
+                    <w:t xml:space="preserve">IBM</w:t>
+                  </w:r>
+                  <w:r>
+                    <w:rPr>
+                      <w:rFonts w:ascii="Arial" w:hAnsi="Arial" w:cs="Arial"/>
+                      <w:sz w:val="19"/>
+                      <w:szCs w:val="19"/>
+                      <w:rtl/>
+                    </w:rPr>
+                    <w:t xml:space="preserve"> لتقسيم حركة شبكة مصائد</w:t>
+                  </w:r>
+                </w:p>
+              </w:tc>
+              <w:tc>
+                <w:tcPr>
+                  <w:tcW w:w="3132" w:type="dxa"/>
+                </w:tcPr>
+                <w:p>
+                  <w:pPr>
+                    <w:bidi/>
+                    <w:spacing w:after="0" w:line="300" w:lineRule="auto"/>
+                    <w:jc w:val="start"/>
+                    <w:rPr>
+                      <w:rFonts w:ascii="Arial" w:hAnsi="Arial" w:cs="Arial"/>
+                      <w:sz w:val="19"/>
+                      <w:szCs w:val="19"/>
+                      <w:rtl/>
+                    </w:rPr>
+                  </w:pPr>
+                  <w:r>
+                    <w:rPr>
+                      <w:rFonts w:ascii="Arial" w:hAnsi="Arial" w:cs="Arial"/>
+                      <w:sz w:val="19"/>
+                      <w:szCs w:val="19"/>
+                      <w:rtl/>
+                    </w:rPr>
                     <w:t xml:space="preserve">بلا قيود سلامة، ونسبة تكلفة </w:t>
                   </w:r>
                   <w:r>
@@ -6644,7 +6746,7 @@
                 <w:sz w:val="22"/>
                 <w:szCs w:val="22"/>
               </w:rPr>
-              <w:t xml:space="preserve">[20][21]</w:t>
+              <w:t xml:space="preserve">[22][23]</w:t>
             </w:r>
             <w:r>
               <w:rPr>
@@ -6678,7 +6780,7 @@
                 <w:sz w:val="22"/>
                 <w:szCs w:val="22"/>
               </w:rPr>
-              <w:t xml:space="preserve">QAOA [22]</w:t>
+              <w:t xml:space="preserve">QAOA [24]</w:t>
             </w:r>
             <w:r>
               <w:rPr>
@@ -6731,7 +6833,7 @@
                 <w:sz w:val="22"/>
                 <w:szCs w:val="22"/>
               </w:rPr>
-              <w:t xml:space="preserve">Simplex [23]</w:t>
+              <w:t xml:space="preserve">Simplex [25]</w:t>
             </w:r>
             <w:r>
               <w:rPr>
@@ -6776,7 +6878,7 @@
                 <w:sz w:val="22"/>
                 <w:szCs w:val="22"/>
               </w:rPr>
-              <w:t xml:space="preserve">HiGHS [24]</w:t>
+              <w:t xml:space="preserve">HiGHS [26]</w:t>
             </w:r>
             <w:r>
               <w:rPr>
@@ -6793,7 +6895,7 @@
                 <w:sz w:val="22"/>
                 <w:szCs w:val="22"/>
               </w:rPr>
-              <w:t xml:space="preserve">Z3 [25]</w:t>
+              <w:t xml:space="preserve">Z3 [27]</w:t>
             </w:r>
             <w:r>
               <w:rPr>
@@ -6810,7 +6912,7 @@
                 <w:sz w:val="22"/>
                 <w:szCs w:val="22"/>
               </w:rPr>
-              <w:t xml:space="preserve">[26]</w:t>
+              <w:t xml:space="preserve">[28]</w:t>
             </w:r>
             <w:r>
               <w:rPr>
@@ -7440,24 +7542,41 @@
                 <w:szCs w:val="22"/>
                 <w:rtl/>
               </w:rPr>
-              <w:t xml:space="preserve"> ≥ </w:t>
-            </w:r>
-            <w:r>
-              <w:rPr>
-                <w:rFonts w:ascii="Arial" w:hAnsi="Arial" w:cs="Arial"/>
-                <w:sz w:val="22"/>
-                <w:szCs w:val="22"/>
-              </w:rPr>
-              <w:t xml:space="preserve">80%</w:t>
-            </w:r>
-            <w:r>
-              <w:rPr>
-                <w:rFonts w:ascii="Arial" w:hAnsi="Arial" w:cs="Arial"/>
-                <w:sz w:val="22"/>
-                <w:szCs w:val="22"/>
-                <w:rtl/>
-              </w:rPr>
-              <w:t xml:space="preserve"> مما يحتويه العزل الكامل، مع خدمات متوقفة أقل (</w:t>
+              <w:t xml:space="preserve"> (أ) نسبة الاحتواء ≥ </w:t>
+            </w:r>
+            <w:r>
+              <w:rPr>
+                <w:rFonts w:ascii="Arial" w:hAnsi="Arial" w:cs="Arial"/>
+                <w:sz w:val="22"/>
+                <w:szCs w:val="22"/>
+              </w:rPr>
+              <w:t xml:space="preserve">0.80</w:t>
+            </w:r>
+            <w:r>
+              <w:rPr>
+                <w:rFonts w:ascii="Arial" w:hAnsi="Arial" w:cs="Arial"/>
+                <w:sz w:val="22"/>
+                <w:szCs w:val="22"/>
+                <w:rtl/>
+              </w:rPr>
+              <w:t xml:space="preserve"> من العزل الكامل (فترة </w:t>
+            </w:r>
+            <w:r>
+              <w:rPr>
+                <w:rFonts w:ascii="Arial" w:hAnsi="Arial" w:cs="Arial"/>
+                <w:sz w:val="22"/>
+                <w:szCs w:val="22"/>
+              </w:rPr>
+              <w:t xml:space="preserve">Wilson 95%)</w:t>
+            </w:r>
+            <w:r>
+              <w:rPr>
+                <w:rFonts w:ascii="Arial" w:hAnsi="Arial" w:cs="Arial"/>
+                <w:sz w:val="22"/>
+                <w:szCs w:val="22"/>
+                <w:rtl/>
+              </w:rPr>
+              <w:t xml:space="preserve">؛ (ب) خدمات متوقفة أقل منه (</w:t>
             </w:r>
             <w:r>
               <w:rPr>
@@ -7880,7 +7999,7 @@
                 <w:sz w:val="22"/>
                 <w:szCs w:val="22"/>
               </w:rPr>
-              <w:t xml:space="preserve">CVSS [27])</w:t>
+              <w:t xml:space="preserve">CVSS [29])</w:t>
             </w:r>
             <w:r>
               <w:rPr>
@@ -8598,7 +8717,7 @@
                 <w:sz w:val="22"/>
                 <w:szCs w:val="22"/>
               </w:rPr>
-              <w:t xml:space="preserve">[18]</w:t>
+              <w:t xml:space="preserve">[20]</w:t>
             </w:r>
             <w:r>
               <w:rPr>
@@ -8752,7 +8871,7 @@
                 <w:sz w:val="22"/>
                 <w:szCs w:val="22"/>
               </w:rPr>
-              <w:t xml:space="preserve">[19]</w:t>
+              <w:t xml:space="preserve">[21]</w:t>
             </w:r>
             <w:r>
               <w:rPr>
@@ -8945,7 +9064,7 @@
                       <w:sz w:val="19"/>
                       <w:szCs w:val="19"/>
                     </w:rPr>
-                    <w:t xml:space="preserve">[14]</w:t>
+                    <w:t xml:space="preserve">[16]</w:t>
                   </w:r>
                 </w:p>
               </w:tc>
@@ -8974,7 +9093,7 @@
                       <w:sz w:val="19"/>
                       <w:szCs w:val="19"/>
                     </w:rPr>
-                    <w:t xml:space="preserve">[15]</w:t>
+                    <w:t xml:space="preserve">[17]</w:t>
                   </w:r>
                 </w:p>
               </w:tc>
@@ -9003,7 +9122,7 @@
                       <w:sz w:val="19"/>
                       <w:szCs w:val="19"/>
                     </w:rPr>
-                    <w:t xml:space="preserve">Defender [12]</w:t>
+                    <w:t xml:space="preserve">Defender [14]</w:t>
                   </w:r>
                 </w:p>
               </w:tc>
@@ -9032,7 +9151,7 @@
                       <w:sz w:val="19"/>
                       <w:szCs w:val="19"/>
                     </w:rPr>
-                    <w:t xml:space="preserve">CrowdStrike [13]</w:t>
+                    <w:t xml:space="preserve">CrowdStrike [15]</w:t>
                   </w:r>
                 </w:p>
               </w:tc>
@@ -9763,11 +9882,56 @@
             <w:r>
               <w:rPr>
                 <w:rFonts w:ascii="Arial" w:hAnsi="Arial" w:cs="Arial"/>
-                <w:sz w:val="22"/>
-                <w:szCs w:val="22"/>
-                <w:rtl/>
-              </w:rPr>
-              <w:t xml:space="preserve">ولا ندّعي أن </w:t>
+                <w:b/>
+                <w:bCs/>
+                <w:sz w:val="22"/>
+                <w:szCs w:val="22"/>
+                <w:rtl/>
+              </w:rPr>
+              <w:t xml:space="preserve">أين الإضافة إذن؟</w:t>
+            </w:r>
+            <w:r>
+              <w:rPr>
+                <w:rFonts w:ascii="Arial" w:hAnsi="Arial" w:cs="Arial"/>
+                <w:sz w:val="22"/>
+                <w:szCs w:val="22"/>
+                <w:rtl/>
+              </w:rPr>
+              <w:t xml:space="preserve"> ليست في الحلّال: الحلّال الجشع وجد الأمثل أيضًا في </w:t>
+            </w:r>
+            <w:r>
+              <w:rPr>
+                <w:rFonts w:ascii="Arial" w:hAnsi="Arial" w:cs="Arial"/>
+                <w:sz w:val="22"/>
+                <w:szCs w:val="22"/>
+              </w:rPr>
+              <w:t xml:space="preserve">1,017</w:t>
+            </w:r>
+            <w:r>
+              <w:rPr>
+                <w:rFonts w:ascii="Arial" w:hAnsi="Arial" w:cs="Arial"/>
+                <w:sz w:val="22"/>
+                <w:szCs w:val="22"/>
+                <w:rtl/>
+              </w:rPr>
+              <w:t xml:space="preserve"> مسألة (القسم </w:t>
+            </w:r>
+            <w:r>
+              <w:rPr>
+                <w:rFonts w:ascii="Arial" w:hAnsi="Arial" w:cs="Arial"/>
+                <w:sz w:val="22"/>
+                <w:szCs w:val="22"/>
+              </w:rPr>
+              <w:t xml:space="preserve">7)</w:t>
+            </w:r>
+            <w:r>
+              <w:rPr>
+                <w:rFonts w:ascii="Arial" w:hAnsi="Arial" w:cs="Arial"/>
+                <w:sz w:val="22"/>
+                <w:szCs w:val="22"/>
+                <w:rtl/>
+              </w:rPr>
+              <w:t xml:space="preserve">. الإضافة في صياغة القرار الموحّدة، وبوابة السلامة المثبتة، واختبار التزوير. واخترنا </w:t>
             </w:r>
             <w:r>
               <w:rPr>
@@ -9784,6 +9948,23 @@
                 <w:szCs w:val="22"/>
                 <w:rtl/>
               </w:rPr>
+              <w:t xml:space="preserve"> لأنها صياغة واحدة تحلها الحلّالات الدقيقة والتقريبية والكمّية، فنتحقق من كل قرار بأكثر من طريقة. ولا ندّعي أن </w:t>
+            </w:r>
+            <w:r>
+              <w:rPr>
+                <w:rFonts w:ascii="Arial" w:hAnsi="Arial" w:cs="Arial"/>
+                <w:sz w:val="22"/>
+                <w:szCs w:val="22"/>
+              </w:rPr>
+              <w:t xml:space="preserve">QUBO</w:t>
+            </w:r>
+            <w:r>
+              <w:rPr>
+                <w:rFonts w:ascii="Arial" w:hAnsi="Arial" w:cs="Arial"/>
+                <w:sz w:val="22"/>
+                <w:szCs w:val="22"/>
+                <w:rtl/>
+              </w:rPr>
               <w:t xml:space="preserve"> أو </w:t>
             </w:r>
             <w:r>
@@ -9801,7 +9982,7 @@
                 <w:szCs w:val="22"/>
                 <w:rtl/>
               </w:rPr>
-              <w:t xml:space="preserve"> جديدتان، ولا تفوقًا كمّيًا.</w:t>
+              <w:t xml:space="preserve"> جديدتان.</w:t>
             </w:r>
           </w:p>
           <w:p>
@@ -10875,9 +11056,9 @@
             </w:tblPr>
             <w:tblGrid>
               <w:gridCol w:w="1076"/>
-              <w:gridCol w:w="3524"/>
-              <w:gridCol w:w="2251"/>
-              <w:gridCol w:w="2447"/>
+              <w:gridCol w:w="3328"/>
+              <w:gridCol w:w="3426"/>
+              <w:gridCol w:w="1468"/>
             </w:tblGrid>
             <w:tr>
               <w:trPr>
@@ -10916,7 +11097,7 @@
               </w:tc>
               <w:tc>
                 <w:tcPr>
-                  <w:tcW w:w="3524" w:type="dxa"/>
+                  <w:tcW w:w="3328" w:type="dxa"/>
                   <w:shd w:val="clear" w:color="auto" w:fill="E8EEF3"/>
                 </w:tcPr>
                 <w:p>
@@ -10946,7 +11127,7 @@
               </w:tc>
               <w:tc>
                 <w:tcPr>
-                  <w:tcW w:w="2251" w:type="dxa"/>
+                  <w:tcW w:w="3426" w:type="dxa"/>
                   <w:shd w:val="clear" w:color="auto" w:fill="E8EEF3"/>
                 </w:tcPr>
                 <w:p>
@@ -10970,13 +11151,13 @@
                       <w:szCs w:val="19"/>
                       <w:rtl/>
                     </w:rPr>
-                    <w:t xml:space="preserve">المنصّة</w:t>
+                    <w:t xml:space="preserve">العينة النهائية (البذرة)</w:t>
                   </w:r>
                 </w:p>
               </w:tc>
               <w:tc>
                 <w:tcPr>
-                  <w:tcW w:w="2447" w:type="dxa"/>
+                  <w:tcW w:w="1468" w:type="dxa"/>
                   <w:shd w:val="clear" w:color="auto" w:fill="E8EEF3"/>
                 </w:tcPr>
                 <w:p>
@@ -11000,7 +11181,7 @@
                       <w:szCs w:val="19"/>
                       <w:rtl/>
                     </w:rPr>
-                    <w:t xml:space="preserve">ما يُقاس</w:t>
+                    <w:t xml:space="preserve">الفرضية</w:t>
                   </w:r>
                 </w:p>
               </w:tc>
@@ -11038,7 +11219,7 @@
               </w:tc>
               <w:tc>
                 <w:tcPr>
-                  <w:tcW w:w="3524" w:type="dxa"/>
+                  <w:tcW w:w="3328" w:type="dxa"/>
                 </w:tcPr>
                 <w:p>
                   <w:pPr>
@@ -11059,13 +11240,13 @@
                       <w:szCs w:val="19"/>
                       <w:rtl/>
                     </w:rPr>
-                    <w:t xml:space="preserve">بلا حماية</w:t>
+                    <w:t xml:space="preserve">الهجوم بلا حماية</w:t>
                   </w:r>
                 </w:p>
               </w:tc>
               <w:tc>
                 <w:tcPr>
-                  <w:tcW w:w="2251" w:type="dxa"/>
+                  <w:tcW w:w="3426" w:type="dxa"/>
                 </w:tcPr>
                 <w:p>
                   <w:pPr>
@@ -11084,15 +11265,6 @@
                       <w:rFonts w:ascii="Arial" w:hAnsi="Arial" w:cs="Arial"/>
                       <w:sz w:val="19"/>
                       <w:szCs w:val="19"/>
-                      <w:rtl/>
-                    </w:rPr>
-                    <w:t xml:space="preserve">محاكاة (</w:t>
-                  </w:r>
-                  <w:r>
-                    <w:rPr>
-                      <w:rFonts w:ascii="Arial" w:hAnsi="Arial" w:cs="Arial"/>
-                      <w:sz w:val="19"/>
-                      <w:szCs w:val="19"/>
                     </w:rPr>
                     <w:t xml:space="preserve">16</w:t>
                   </w:r>
@@ -11103,13 +11275,13 @@
                       <w:szCs w:val="19"/>
                       <w:rtl/>
                     </w:rPr>
-                    <w:t xml:space="preserve"> لحظة حقيقية)</w:t>
+                    <w:t xml:space="preserve"> لحظة حقيقية</w:t>
                   </w:r>
                 </w:p>
               </w:tc>
               <w:tc>
                 <w:tcPr>
-                  <w:tcW w:w="2447" w:type="dxa"/>
+                  <w:tcW w:w="1468" w:type="dxa"/>
                 </w:tcPr>
                 <w:p>
                   <w:pPr>
@@ -11130,7 +11302,7 @@
                       <w:szCs w:val="19"/>
                       <w:rtl/>
                     </w:rPr>
-                    <w:t xml:space="preserve">المسارات المفتوحة إلى الخوادم الحرجة</w:t>
+                    <w:t xml:space="preserve">خط الأساس</w:t>
                   </w:r>
                 </w:p>
               </w:tc>
@@ -11168,7 +11340,7 @@
               </w:tc>
               <w:tc>
                 <w:tcPr>
-                  <w:tcW w:w="3524" w:type="dxa"/>
+                  <w:tcW w:w="3328" w:type="dxa"/>
                 </w:tcPr>
                 <w:p>
                   <w:pPr>
@@ -11203,7 +11375,7 @@
               </w:tc>
               <w:tc>
                 <w:tcPr>
-                  <w:tcW w:w="2251" w:type="dxa"/>
+                  <w:tcW w:w="3426" w:type="dxa"/>
                 </w:tcPr>
                 <w:p>
                   <w:pPr>
@@ -11222,26 +11394,51 @@
                       <w:rFonts w:ascii="Arial" w:hAnsi="Arial" w:cs="Arial"/>
                       <w:sz w:val="19"/>
                       <w:szCs w:val="19"/>
-                      <w:rtl/>
-                    </w:rPr>
-                    <w:t xml:space="preserve">محاكاة (</w:t>
-                  </w:r>
-                  <w:r>
-                    <w:rPr>
-                      <w:rFonts w:ascii="Arial" w:hAnsi="Arial" w:cs="Arial"/>
-                      <w:sz w:val="19"/>
-                      <w:szCs w:val="19"/>
-                    </w:rPr>
-                    <w:t xml:space="preserve">4,000</w:t>
-                  </w:r>
-                  <w:r>
-                    <w:rPr>
-                      <w:rFonts w:ascii="Arial" w:hAnsi="Arial" w:cs="Arial"/>
-                      <w:sz w:val="19"/>
-                      <w:szCs w:val="19"/>
-                      <w:rtl/>
-                    </w:rPr>
-                    <w:t xml:space="preserve">+ تركيبي و</w:t>
+                    </w:rPr>
+                    <w:t xml:space="preserve">259</w:t>
+                  </w:r>
+                  <w:r>
+                    <w:rPr>
+                      <w:rFonts w:ascii="Arial" w:hAnsi="Arial" w:cs="Arial"/>
+                      <w:sz w:val="19"/>
+                      <w:szCs w:val="19"/>
+                      <w:rtl/>
+                    </w:rPr>
+                    <w:t xml:space="preserve"> سلسلة (</w:t>
+                  </w:r>
+                  <w:r>
+                    <w:rPr>
+                      <w:rFonts w:ascii="Arial" w:hAnsi="Arial" w:cs="Arial"/>
+                      <w:sz w:val="19"/>
+                      <w:szCs w:val="19"/>
+                    </w:rPr>
+                    <w:t xml:space="preserve">7008)</w:t>
+                  </w:r>
+                  <w:r>
+                    <w:rPr>
+                      <w:rFonts w:ascii="Arial" w:hAnsi="Arial" w:cs="Arial"/>
+                      <w:sz w:val="19"/>
+                      <w:szCs w:val="19"/>
+                      <w:rtl/>
+                    </w:rPr>
+                    <w:t xml:space="preserve">، وللتأكيد </w:t>
+                  </w:r>
+                  <w:r>
+                    <w:rPr>
+                      <w:rFonts w:ascii="Arial" w:hAnsi="Arial" w:cs="Arial"/>
+                      <w:sz w:val="19"/>
+                      <w:szCs w:val="19"/>
+                    </w:rPr>
+                    <w:t xml:space="preserve">253 (v9)</w:t>
+                  </w:r>
+                  <w:r>
+                    <w:rPr>
+                      <w:rFonts w:ascii="Arial" w:hAnsi="Arial" w:cs="Arial"/>
+                      <w:sz w:val="19"/>
+                      <w:szCs w:val="19"/>
+                      <w:rtl/>
+                    </w:rPr>
+                    <w:t xml:space="preserve">، و</w:t>
                   </w:r>
                   <w:r>
                     <w:rPr>
@@ -11258,13 +11455,47 @@
                       <w:szCs w:val="19"/>
                       <w:rtl/>
                     </w:rPr>
-                    <w:t xml:space="preserve"> واقعي)</w:t>
+                    <w:t xml:space="preserve"> واقعيًا (</w:t>
+                  </w:r>
+                  <w:r>
+                    <w:rPr>
+                      <w:rFonts w:ascii="Arial" w:hAnsi="Arial" w:cs="Arial"/>
+                      <w:sz w:val="19"/>
+                      <w:szCs w:val="19"/>
+                    </w:rPr>
+                    <w:t xml:space="preserve">12012)</w:t>
+                  </w:r>
+                  <w:r>
+                    <w:rPr>
+                      <w:rFonts w:ascii="Arial" w:hAnsi="Arial" w:cs="Arial"/>
+                      <w:sz w:val="19"/>
+                      <w:szCs w:val="19"/>
+                      <w:rtl/>
+                    </w:rPr>
+                    <w:t xml:space="preserve">، وكل تزوير لـ</w:t>
+                  </w:r>
+                  <w:r>
+                    <w:rPr>
+                      <w:rFonts w:ascii="Arial" w:hAnsi="Arial" w:cs="Arial"/>
+                      <w:sz w:val="19"/>
+                      <w:szCs w:val="19"/>
+                    </w:rPr>
+                    <w:t xml:space="preserve">1–3</w:t>
+                  </w:r>
+                  <w:r>
+                    <w:rPr>
+                      <w:rFonts w:ascii="Arial" w:hAnsi="Arial" w:cs="Arial"/>
+                      <w:sz w:val="19"/>
+                      <w:szCs w:val="19"/>
+                      <w:rtl/>
+                    </w:rPr>
+                    <w:t xml:space="preserve"> أجهزة</w:t>
                   </w:r>
                 </w:p>
               </w:tc>
               <w:tc>
                 <w:tcPr>
-                  <w:tcW w:w="2447" w:type="dxa"/>
+                  <w:tcW w:w="1468" w:type="dxa"/>
                 </w:tcPr>
                 <w:p>
                   <w:pPr>
@@ -11283,9 +11514,42 @@
                       <w:rFonts w:ascii="Arial" w:hAnsi="Arial" w:cs="Arial"/>
                       <w:sz w:val="19"/>
                       <w:szCs w:val="19"/>
-                      <w:rtl/>
-                    </w:rPr>
-                    <w:t xml:space="preserve">الاحتواء، الخدمات المتوقفة، الفشل الصامت، غير الآمن</w:t>
+                    </w:rPr>
+                    <w:t xml:space="preserve">H1</w:t>
+                  </w:r>
+                  <w:r>
+                    <w:rPr>
+                      <w:rFonts w:ascii="Arial" w:hAnsi="Arial" w:cs="Arial"/>
+                      <w:sz w:val="19"/>
+                      <w:szCs w:val="19"/>
+                      <w:rtl/>
+                    </w:rPr>
+                    <w:t xml:space="preserve">، </w:t>
+                  </w:r>
+                  <w:r>
+                    <w:rPr>
+                      <w:rFonts w:ascii="Arial" w:hAnsi="Arial" w:cs="Arial"/>
+                      <w:sz w:val="19"/>
+                      <w:szCs w:val="19"/>
+                    </w:rPr>
+                    <w:t xml:space="preserve">H2</w:t>
+                  </w:r>
+                  <w:r>
+                    <w:rPr>
+                      <w:rFonts w:ascii="Arial" w:hAnsi="Arial" w:cs="Arial"/>
+                      <w:sz w:val="19"/>
+                      <w:szCs w:val="19"/>
+                      <w:rtl/>
+                    </w:rPr>
+                    <w:t xml:space="preserve">، </w:t>
+                  </w:r>
+                  <w:r>
+                    <w:rPr>
+                      <w:rFonts w:ascii="Arial" w:hAnsi="Arial" w:cs="Arial"/>
+                      <w:sz w:val="19"/>
+                      <w:szCs w:val="19"/>
+                    </w:rPr>
+                    <w:t xml:space="preserve">H5</w:t>
                   </w:r>
                 </w:p>
               </w:tc>
@@ -11323,7 +11587,7 @@
               </w:tc>
               <w:tc>
                 <w:tcPr>
-                  <w:tcW w:w="3524" w:type="dxa"/>
+                  <w:tcW w:w="3328" w:type="dxa"/>
                 </w:tcPr>
                 <w:p>
                   <w:pPr>
@@ -11384,7 +11648,7 @@
               </w:tc>
               <w:tc>
                 <w:tcPr>
-                  <w:tcW w:w="2251" w:type="dxa"/>
+                  <w:tcW w:w="3426" w:type="dxa"/>
                 </w:tcPr>
                 <w:p>
                   <w:pPr>
@@ -11422,13 +11686,47 @@
                       <w:szCs w:val="19"/>
                       <w:rtl/>
                     </w:rPr>
-                    <w:t xml:space="preserve"> معزولة</w:t>
+                    <w:t xml:space="preserve"> معزولة: </w:t>
+                  </w:r>
+                  <w:r>
+                    <w:rPr>
+                      <w:rFonts w:ascii="Arial" w:hAnsi="Arial" w:cs="Arial"/>
+                      <w:sz w:val="19"/>
+                      <w:szCs w:val="19"/>
+                    </w:rPr>
+                    <w:t xml:space="preserve">6,002</w:t>
+                  </w:r>
+                  <w:r>
+                    <w:rPr>
+                      <w:rFonts w:ascii="Arial" w:hAnsi="Arial" w:cs="Arial"/>
+                      <w:sz w:val="19"/>
+                      <w:szCs w:val="19"/>
+                      <w:rtl/>
+                    </w:rPr>
+                    <w:t xml:space="preserve"> فحص و</w:t>
+                  </w:r>
+                  <w:r>
+                    <w:rPr>
+                      <w:rFonts w:ascii="Arial" w:hAnsi="Arial" w:cs="Arial"/>
+                      <w:sz w:val="19"/>
+                      <w:szCs w:val="19"/>
+                    </w:rPr>
+                    <w:t xml:space="preserve">66</w:t>
+                  </w:r>
+                  <w:r>
+                    <w:rPr>
+                      <w:rFonts w:ascii="Arial" w:hAnsi="Arial" w:cs="Arial"/>
+                      <w:sz w:val="19"/>
+                      <w:szCs w:val="19"/>
+                      <w:rtl/>
+                    </w:rPr>
+                    <w:t xml:space="preserve"> سيناريو</w:t>
                   </w:r>
                 </w:p>
               </w:tc>
               <w:tc>
                 <w:tcPr>
-                  <w:tcW w:w="2447" w:type="dxa"/>
+                  <w:tcW w:w="1468" w:type="dxa"/>
                 </w:tcPr>
                 <w:p>
                   <w:pPr>
@@ -11447,9 +11745,25 @@
                       <w:rFonts w:ascii="Arial" w:hAnsi="Arial" w:cs="Arial"/>
                       <w:sz w:val="19"/>
                       <w:szCs w:val="19"/>
-                      <w:rtl/>
-                    </w:rPr>
-                    <w:t xml:space="preserve">التطابق، زمن القطع، التسريب</w:t>
+                    </w:rPr>
+                    <w:t xml:space="preserve">H2</w:t>
+                  </w:r>
+                  <w:r>
+                    <w:rPr>
+                      <w:rFonts w:ascii="Arial" w:hAnsi="Arial" w:cs="Arial"/>
+                      <w:sz w:val="19"/>
+                      <w:szCs w:val="19"/>
+                      <w:rtl/>
+                    </w:rPr>
+                    <w:t xml:space="preserve">، </w:t>
+                  </w:r>
+                  <w:r>
+                    <w:rPr>
+                      <w:rFonts w:ascii="Arial" w:hAnsi="Arial" w:cs="Arial"/>
+                      <w:sz w:val="19"/>
+                      <w:szCs w:val="19"/>
+                    </w:rPr>
+                    <w:t xml:space="preserve">H3</w:t>
                   </w:r>
                 </w:p>
               </w:tc>
@@ -11487,7 +11801,7 @@
               </w:tc>
               <w:tc>
                 <w:tcPr>
-                  <w:tcW w:w="3524" w:type="dxa"/>
+                  <w:tcW w:w="3328" w:type="dxa"/>
                 </w:tcPr>
                 <w:p>
                   <w:pPr>
@@ -11514,7 +11828,7 @@
               </w:tc>
               <w:tc>
                 <w:tcPr>
-                  <w:tcW w:w="2251" w:type="dxa"/>
+                  <w:tcW w:w="3426" w:type="dxa"/>
                 </w:tcPr>
                 <w:p>
                   <w:pPr>
@@ -11545,11 +11859,45 @@
                     </w:rPr>
                     <w:t xml:space="preserve">IBM</w:t>
                   </w:r>
+                  <w:r>
+                    <w:rPr>
+                      <w:rFonts w:ascii="Arial" w:hAnsi="Arial" w:cs="Arial"/>
+                      <w:sz w:val="19"/>
+                      <w:szCs w:val="19"/>
+                      <w:rtl/>
+                    </w:rPr>
+                    <w:t xml:space="preserve">؛ </w:t>
+                  </w:r>
+                  <w:r>
+                    <w:rPr>
+                      <w:rFonts w:ascii="Arial" w:hAnsi="Arial" w:cs="Arial"/>
+                      <w:sz w:val="19"/>
+                      <w:szCs w:val="19"/>
+                    </w:rPr>
+                    <w:t xml:space="preserve">11</w:t>
+                  </w:r>
+                  <w:r>
+                    <w:rPr>
+                      <w:rFonts w:ascii="Arial" w:hAnsi="Arial" w:cs="Arial"/>
+                      <w:sz w:val="19"/>
+                      <w:szCs w:val="19"/>
+                      <w:rtl/>
+                    </w:rPr>
+                    <w:t xml:space="preserve"> مسألة (</w:t>
+                  </w:r>
+                  <w:r>
+                    <w:rPr>
+                      <w:rFonts w:ascii="Arial" w:hAnsi="Arial" w:cs="Arial"/>
+                      <w:sz w:val="19"/>
+                      <w:szCs w:val="19"/>
+                    </w:rPr>
+                    <w:t xml:space="preserve">E9)</w:t>
+                  </w:r>
                 </w:p>
               </w:tc>
               <w:tc>
                 <w:tcPr>
-                  <w:tcW w:w="2447" w:type="dxa"/>
+                  <w:tcW w:w="1468" w:type="dxa"/>
                 </w:tcPr>
                 <w:p>
                   <w:pPr>
@@ -11568,9 +11916,8 @@
                       <w:rFonts w:ascii="Arial" w:hAnsi="Arial" w:cs="Arial"/>
                       <w:sz w:val="19"/>
                       <w:szCs w:val="19"/>
-                      <w:rtl/>
-                    </w:rPr>
-                    <w:t xml:space="preserve">احتمال الأمثل لكل قراءة</w:t>
+                    </w:rPr>
+                    <w:t xml:space="preserve">H4</w:t>
                   </w:r>
                 </w:p>
               </w:tc>
@@ -11608,7 +11955,7 @@
               </w:tc>
               <w:tc>
                 <w:tcPr>
-                  <w:tcW w:w="3524" w:type="dxa"/>
+                  <w:tcW w:w="3328" w:type="dxa"/>
                 </w:tcPr>
                 <w:p>
                   <w:pPr>
@@ -11637,13 +11984,13 @@
                       <w:sz w:val="19"/>
                       <w:szCs w:val="19"/>
                     </w:rPr>
-                    <w:t xml:space="preserve">v12/v13</w:t>
+                    <w:t xml:space="preserve">v12</w:t>
                   </w:r>
                 </w:p>
               </w:tc>
               <w:tc>
                 <w:tcPr>
-                  <w:tcW w:w="2251" w:type="dxa"/>
+                  <w:tcW w:w="3426" w:type="dxa"/>
                 </w:tcPr>
                 <w:p>
                   <w:pPr>
@@ -11680,13 +12027,22 @@
                       <w:sz w:val="19"/>
                       <w:szCs w:val="19"/>
                     </w:rPr>
-                    <w:t xml:space="preserve">2013–2026</w:t>
+                    <w:t xml:space="preserve">2013–2026 (223</w:t>
+                  </w:r>
+                  <w:r>
+                    <w:rPr>
+                      <w:rFonts w:ascii="Arial" w:hAnsi="Arial" w:cs="Arial"/>
+                      <w:sz w:val="19"/>
+                      <w:szCs w:val="19"/>
+                      <w:rtl/>
+                    </w:rPr>
+                    <w:t xml:space="preserve"> لحظة)</w:t>
                   </w:r>
                 </w:p>
               </w:tc>
               <w:tc>
                 <w:tcPr>
-                  <w:tcW w:w="2447" w:type="dxa"/>
+                  <w:tcW w:w="1468" w:type="dxa"/>
                 </w:tcPr>
                 <w:p>
                   <w:pPr>
@@ -11705,9 +12061,25 @@
                       <w:rFonts w:ascii="Arial" w:hAnsi="Arial" w:cs="Arial"/>
                       <w:sz w:val="19"/>
                       <w:szCs w:val="19"/>
-                      <w:rtl/>
-                    </w:rPr>
-                    <w:t xml:space="preserve">مقاييس (أ) + البقاء بعد الأعطال</w:t>
+                    </w:rPr>
+                    <w:t xml:space="preserve">H1</w:t>
+                  </w:r>
+                  <w:r>
+                    <w:rPr>
+                      <w:rFonts w:ascii="Arial" w:hAnsi="Arial" w:cs="Arial"/>
+                      <w:sz w:val="19"/>
+                      <w:szCs w:val="19"/>
+                      <w:rtl/>
+                    </w:rPr>
+                    <w:t xml:space="preserve">، </w:t>
+                  </w:r>
+                  <w:r>
+                    <w:rPr>
+                      <w:rFonts w:ascii="Arial" w:hAnsi="Arial" w:cs="Arial"/>
+                      <w:sz w:val="19"/>
+                      <w:szCs w:val="19"/>
+                    </w:rPr>
+                    <w:t xml:space="preserve">H2</w:t>
                   </w:r>
                 </w:p>
               </w:tc>
@@ -12767,30 +13139,16 @@
                 <w:szCs w:val="22"/>
                 <w:rtl/>
               </w:rPr>
-              <w:t xml:space="preserve">. خطوات كل سيناريو.</w:t>
-            </w:r>
-          </w:p>
-          <w:p>
-            <w:pPr>
-              <w:bidi/>
-              <w:spacing w:after="60" w:line="300" w:lineRule="auto"/>
-              <w:ind w:start="340" w:hanging="340"/>
-              <w:jc w:val="both"/>
-              <w:rPr>
-                <w:rFonts w:ascii="Arial" w:hAnsi="Arial" w:cs="Arial"/>
-                <w:sz w:val="22"/>
-                <w:szCs w:val="22"/>
-                <w:rtl/>
-              </w:rPr>
-            </w:pPr>
-            <w:r>
-              <w:rPr>
-                <w:rFonts w:ascii="Arial" w:hAnsi="Arial" w:cs="Arial"/>
-                <w:sz w:val="22"/>
-                <w:szCs w:val="22"/>
-                <w:rtl/>
-              </w:rPr>
-              <w:t xml:space="preserve">–  بناء مسألة </w:t>
+              <w:t xml:space="preserve">. خطوات كل سيناريو:</w:t>
+            </w:r>
+            <w:r>
+              <w:rPr>
+                <w:rFonts w:ascii="Arial" w:hAnsi="Arial" w:cs="Arial"/>
+                <w:sz w:val="22"/>
+                <w:szCs w:val="22"/>
+                <w:rtl/>
+              </w:rPr>
+              <w:t xml:space="preserve"> بناء </w:t>
             </w:r>
             <w:r>
               <w:rPr>
@@ -12807,30 +13165,7 @@
                 <w:szCs w:val="22"/>
                 <w:rtl/>
               </w:rPr>
-              <w:t xml:space="preserve"> من الشبكة والأجهزة المخترقة.</w:t>
-            </w:r>
-          </w:p>
-          <w:p>
-            <w:pPr>
-              <w:bidi/>
-              <w:spacing w:after="60" w:line="300" w:lineRule="auto"/>
-              <w:ind w:start="340" w:hanging="340"/>
-              <w:jc w:val="both"/>
-              <w:rPr>
-                <w:rFonts w:ascii="Arial" w:hAnsi="Arial" w:cs="Arial"/>
-                <w:sz w:val="22"/>
-                <w:szCs w:val="22"/>
-                <w:rtl/>
-              </w:rPr>
-            </w:pPr>
-            <w:r>
-              <w:rPr>
-                <w:rFonts w:ascii="Arial" w:hAnsi="Arial" w:cs="Arial"/>
-                <w:sz w:val="22"/>
-                <w:szCs w:val="22"/>
-                <w:rtl/>
-              </w:rPr>
-              <w:t xml:space="preserve">–  الحل: بحث شامل حتى </w:t>
+              <w:t xml:space="preserve"> من الشبكة ← الحل (بحث شامل حتى </w:t>
             </w:r>
             <w:r>
               <w:rPr>
@@ -12847,7 +13182,7 @@
                 <w:szCs w:val="22"/>
                 <w:rtl/>
               </w:rPr>
-              <w:t xml:space="preserve"> متغيرًا، ثم تلدين محاكى، أو </w:t>
+              <w:t xml:space="preserve"> متغيرًا، أو تلدين محاكى، أو </w:t>
             </w:r>
             <w:r>
               <w:rPr>
@@ -12864,7 +13199,7 @@
                 <w:szCs w:val="22"/>
                 <w:rtl/>
               </w:rPr>
-              <w:t xml:space="preserve">، مع التحقق من الأمثل بحلّال خطي صحيح دقيق (</w:t>
+              <w:t xml:space="preserve">، والتحقق بحلّال دقيق </w:t>
             </w:r>
             <w:r>
               <w:rPr>
@@ -12881,53 +13216,7 @@
                 <w:szCs w:val="22"/>
                 <w:rtl/>
               </w:rPr>
-              <w:t xml:space="preserve">.</w:t>
-            </w:r>
-          </w:p>
-          <w:p>
-            <w:pPr>
-              <w:bidi/>
-              <w:spacing w:after="60" w:line="300" w:lineRule="auto"/>
-              <w:ind w:start="340" w:hanging="340"/>
-              <w:jc w:val="both"/>
-              <w:rPr>
-                <w:rFonts w:ascii="Arial" w:hAnsi="Arial" w:cs="Arial"/>
-                <w:sz w:val="22"/>
-                <w:szCs w:val="22"/>
-                <w:rtl/>
-              </w:rPr>
-            </w:pPr>
-            <w:r>
-              <w:rPr>
-                <w:rFonts w:ascii="Arial" w:hAnsi="Arial" w:cs="Arial"/>
-                <w:sz w:val="22"/>
-                <w:szCs w:val="22"/>
-                <w:rtl/>
-              </w:rPr>
-              <w:t xml:space="preserve">–  بوابة السلامة تصنّف القرار: مرفوض، أو محتوى، أو موافقة شخصين، أو فشل صامت.</w:t>
-            </w:r>
-          </w:p>
-          <w:p>
-            <w:pPr>
-              <w:bidi/>
-              <w:spacing w:after="60" w:line="300" w:lineRule="auto"/>
-              <w:ind w:start="340" w:hanging="340"/>
-              <w:jc w:val="both"/>
-              <w:rPr>
-                <w:rFonts w:ascii="Arial" w:hAnsi="Arial" w:cs="Arial"/>
-                <w:sz w:val="22"/>
-                <w:szCs w:val="22"/>
-                <w:rtl/>
-              </w:rPr>
-            </w:pPr>
-            <w:r>
-              <w:rPr>
-                <w:rFonts w:ascii="Arial" w:hAnsi="Arial" w:cs="Arial"/>
-                <w:sz w:val="22"/>
-                <w:szCs w:val="22"/>
-                <w:rtl/>
-              </w:rPr>
-              <w:t xml:space="preserve">–  التوقيع (</w:t>
+              <w:t xml:space="preserve"> ← تصنيف بوابة السلامة: مرفوض، أو محتوى، أو موافقة شخصين، أو فشل صامت ← التوقيع (</w:t>
             </w:r>
             <w:r>
               <w:rPr>
@@ -12944,7 +13233,7 @@
                 <w:szCs w:val="22"/>
                 <w:rtl/>
               </w:rPr>
-              <w:t xml:space="preserve"> والسجل المتسلسل، ثم التنفيذ، ثم القياس.</w:t>
+              <w:t xml:space="preserve"> والسجل ← التنفيذ والقياس.</w:t>
             </w:r>
           </w:p>
           <w:p>
@@ -13233,7 +13522,7 @@
                 <w:sz w:val="22"/>
                 <w:szCs w:val="22"/>
               </w:rPr>
-              <w:t xml:space="preserve">MITRE ATT&amp;CK [28]</w:t>
+              <w:t xml:space="preserve">MITRE ATT&amp;CK [30]</w:t>
             </w:r>
             <w:r>
               <w:rPr>
@@ -13437,7 +13726,7 @@
                 <w:sz w:val="22"/>
                 <w:szCs w:val="22"/>
               </w:rPr>
-              <w:t xml:space="preserve">PwC [29]</w:t>
+              <w:t xml:space="preserve">PwC [31]</w:t>
             </w:r>
             <w:r>
               <w:rPr>
@@ -13454,7 +13743,7 @@
                 <w:sz w:val="22"/>
                 <w:szCs w:val="22"/>
               </w:rPr>
-              <w:t xml:space="preserve">The DFIR Report [30]</w:t>
+              <w:t xml:space="preserve">The DFIR Report [32]</w:t>
             </w:r>
             <w:r>
               <w:rPr>
@@ -13471,7 +13760,7 @@
                 <w:sz w:val="22"/>
                 <w:szCs w:val="22"/>
               </w:rPr>
-              <w:t xml:space="preserve">MITRE Attack Flow [31]</w:t>
+              <w:t xml:space="preserve">MITRE Attack Flow [33]</w:t>
             </w:r>
             <w:r>
               <w:rPr>
@@ -13488,7 +13777,7 @@
                 <w:sz w:val="22"/>
                 <w:szCs w:val="22"/>
               </w:rPr>
-              <w:t xml:space="preserve">CISA [32]: 8</w:t>
+              <w:t xml:space="preserve">CISA [34]: 8</w:t>
             </w:r>
             <w:r>
               <w:rPr>
@@ -13901,7 +14190,7 @@
                 <w:sz w:val="22"/>
                 <w:szCs w:val="22"/>
               </w:rPr>
-              <w:t xml:space="preserve">HiGHS [24]</w:t>
+              <w:t xml:space="preserve">HiGHS [26]</w:t>
             </w:r>
             <w:r>
               <w:rPr>
@@ -14080,7 +14369,7 @@
                 <w:sz w:val="22"/>
                 <w:szCs w:val="22"/>
               </w:rPr>
-              <w:t xml:space="preserve">CVaR [33])</w:t>
+              <w:t xml:space="preserve">CVaR [35])</w:t>
             </w:r>
             <w:r>
               <w:rPr>
@@ -19058,7 +19347,7 @@
                 <w:szCs w:val="22"/>
                 <w:rtl/>
               </w:rPr>
-              <w:t xml:space="preserve">. وفي المصنع كانت كل الحالات غير المحتواة إحالات للبشر، أغلبها لخوادم حرجة أو لنظام </w:t>
+              <w:t xml:space="preserve">. وفي المصنع كانت كل الحالات غير المحتواة إحالات للبشر لا قرارات خاطئة، أغلبها لخوادم حرجة أو لنظام </w:t>
             </w:r>
             <w:r>
               <w:rPr>
@@ -19075,7 +19364,24 @@
                 <w:szCs w:val="22"/>
                 <w:rtl/>
               </w:rPr>
-              <w:t xml:space="preserve"> بنسخة واحدة.</w:t>
+              <w:t xml:space="preserve"> بنسخة واحدة: حين لا يوجد إجراء آلي آمن يختار النظام الإحالة عمدًا، فتنخفض النسبة. أي أن نقص المصنع ثمن قاعدة السلامة لا خلل في القرار، ورفعه يحتاج تجزئة أدق لأنظمة التحكم الصناعي، وهو هدف مسجّل في القسم </w:t>
+            </w:r>
+            <w:r>
+              <w:rPr>
+                <w:rFonts w:ascii="Arial" w:hAnsi="Arial" w:cs="Arial"/>
+                <w:sz w:val="22"/>
+                <w:szCs w:val="22"/>
+              </w:rPr>
+              <w:t xml:space="preserve">8</w:t>
+            </w:r>
+            <w:r>
+              <w:rPr>
+                <w:rFonts w:ascii="Arial" w:hAnsi="Arial" w:cs="Arial"/>
+                <w:sz w:val="22"/>
+                <w:szCs w:val="22"/>
+                <w:rtl/>
+              </w:rPr>
+              <w:t xml:space="preserve">.</w:t>
             </w:r>
           </w:p>
           <w:p>
@@ -20091,17 +20397,9 @@
                       <w:rFonts w:ascii="Arial" w:hAnsi="Arial" w:cs="Arial"/>
                       <w:sz w:val="19"/>
                       <w:szCs w:val="19"/>
-                    </w:rPr>
-                    <w:t xml:space="preserve">894</w:t>
-                  </w:r>
-                  <w:r>
-                    <w:rPr>
-                      <w:rFonts w:ascii="Arial" w:hAnsi="Arial" w:cs="Arial"/>
-                      <w:sz w:val="19"/>
-                      <w:szCs w:val="19"/>
-                      <w:rtl/>
-                    </w:rPr>
-                    <w:t xml:space="preserve"> سيناريو واقعي: خدمات متوقفة / غير آمن</w:t>
+                      <w:rtl/>
+                    </w:rPr>
+                    <w:t xml:space="preserve">— غير آمن / فشل صامت</w:t>
                   </w:r>
                 </w:p>
               </w:tc>
@@ -20127,7 +20425,7 @@
                       <w:sz w:val="19"/>
                       <w:szCs w:val="19"/>
                     </w:rPr>
-                    <w:t xml:space="preserve">114 / 0</w:t>
+                    <w:t xml:space="preserve">0 / 0</w:t>
                   </w:r>
                 </w:p>
               </w:tc>
@@ -20153,7 +20451,7 @@
                       <w:sz w:val="19"/>
                       <w:szCs w:val="19"/>
                     </w:rPr>
-                    <w:t xml:space="preserve">165 / 0</w:t>
+                    <w:t xml:space="preserve">0 / 1</w:t>
                   </w:r>
                 </w:p>
               </w:tc>
@@ -20179,7 +20477,7 @@
                       <w:sz w:val="19"/>
                       <w:szCs w:val="19"/>
                     </w:rPr>
-                    <w:t xml:space="preserve">131 / 0</w:t>
+                    <w:t xml:space="preserve">0 / 0</w:t>
                   </w:r>
                 </w:p>
               </w:tc>
@@ -20205,7 +20503,7 @@
                       <w:sz w:val="19"/>
                       <w:szCs w:val="19"/>
                     </w:rPr>
-                    <w:t xml:space="preserve">890 / 12</w:t>
+                    <w:t xml:space="preserve">1 / 0</w:t>
                   </w:r>
                 </w:p>
               </w:tc>
@@ -20231,7 +20529,177 @@
                       <w:sz w:val="19"/>
                       <w:szCs w:val="19"/>
                     </w:rPr>
-                    <w:t xml:space="preserve">890 / 0</w:t>
+                    <w:t xml:space="preserve">0 / 0</w:t>
+                  </w:r>
+                </w:p>
+              </w:tc>
+            </w:tr>
+            <w:tr>
+              <w:trPr>
+                <w:cantSplit/>
+              </w:trPr>
+              <w:tc>
+                <w:tcPr>
+                  <w:tcW w:w="3230" w:type="dxa"/>
+                </w:tcPr>
+                <w:p>
+                  <w:pPr>
+                    <w:bidi/>
+                    <w:spacing w:after="0" w:line="300" w:lineRule="auto"/>
+                    <w:jc w:val="start"/>
+                    <w:rPr>
+                      <w:rFonts w:ascii="Arial" w:hAnsi="Arial" w:cs="Arial"/>
+                      <w:sz w:val="19"/>
+                      <w:szCs w:val="19"/>
+                      <w:rtl/>
+                    </w:rPr>
+                  </w:pPr>
+                  <w:r>
+                    <w:rPr>
+                      <w:rFonts w:ascii="Arial" w:hAnsi="Arial" w:cs="Arial"/>
+                      <w:sz w:val="19"/>
+                      <w:szCs w:val="19"/>
+                    </w:rPr>
+                    <w:t xml:space="preserve">894</w:t>
+                  </w:r>
+                  <w:r>
+                    <w:rPr>
+                      <w:rFonts w:ascii="Arial" w:hAnsi="Arial" w:cs="Arial"/>
+                      <w:sz w:val="19"/>
+                      <w:szCs w:val="19"/>
+                      <w:rtl/>
+                    </w:rPr>
+                    <w:t xml:space="preserve"> سيناريو واقعي: خدمات متوقفة / غير آمن / صامت</w:t>
+                  </w:r>
+                </w:p>
+              </w:tc>
+              <w:tc>
+                <w:tcPr>
+                  <w:tcW w:w="1174" w:type="dxa"/>
+                </w:tcPr>
+                <w:p>
+                  <w:pPr>
+                    <w:bidi/>
+                    <w:spacing w:after="0" w:line="300" w:lineRule="auto"/>
+                    <w:jc w:val="start"/>
+                    <w:rPr>
+                      <w:rFonts w:ascii="Arial" w:hAnsi="Arial" w:cs="Arial"/>
+                      <w:sz w:val="19"/>
+                      <w:szCs w:val="19"/>
+                      <w:rtl/>
+                    </w:rPr>
+                  </w:pPr>
+                  <w:r>
+                    <w:rPr>
+                      <w:rFonts w:ascii="Arial" w:hAnsi="Arial" w:cs="Arial"/>
+                      <w:sz w:val="19"/>
+                      <w:szCs w:val="19"/>
+                    </w:rPr>
+                    <w:t xml:space="preserve">114 / 0 / 0</w:t>
+                  </w:r>
+                </w:p>
+              </w:tc>
+              <w:tc>
+                <w:tcPr>
+                  <w:tcW w:w="1174" w:type="dxa"/>
+                </w:tcPr>
+                <w:p>
+                  <w:pPr>
+                    <w:bidi/>
+                    <w:spacing w:after="0" w:line="300" w:lineRule="auto"/>
+                    <w:jc w:val="start"/>
+                    <w:rPr>
+                      <w:rFonts w:ascii="Arial" w:hAnsi="Arial" w:cs="Arial"/>
+                      <w:sz w:val="19"/>
+                      <w:szCs w:val="19"/>
+                      <w:rtl/>
+                    </w:rPr>
+                  </w:pPr>
+                  <w:r>
+                    <w:rPr>
+                      <w:rFonts w:ascii="Arial" w:hAnsi="Arial" w:cs="Arial"/>
+                      <w:sz w:val="19"/>
+                      <w:szCs w:val="19"/>
+                    </w:rPr>
+                    <w:t xml:space="preserve">165 / 0 / 6</w:t>
+                  </w:r>
+                </w:p>
+              </w:tc>
+              <w:tc>
+                <w:tcPr>
+                  <w:tcW w:w="1272" w:type="dxa"/>
+                </w:tcPr>
+                <w:p>
+                  <w:pPr>
+                    <w:bidi/>
+                    <w:spacing w:after="0" w:line="300" w:lineRule="auto"/>
+                    <w:jc w:val="start"/>
+                    <w:rPr>
+                      <w:rFonts w:ascii="Arial" w:hAnsi="Arial" w:cs="Arial"/>
+                      <w:sz w:val="19"/>
+                      <w:szCs w:val="19"/>
+                      <w:rtl/>
+                    </w:rPr>
+                  </w:pPr>
+                  <w:r>
+                    <w:rPr>
+                      <w:rFonts w:ascii="Arial" w:hAnsi="Arial" w:cs="Arial"/>
+                      <w:sz w:val="19"/>
+                      <w:szCs w:val="19"/>
+                    </w:rPr>
+                    <w:t xml:space="preserve">131 / 0 / 0</w:t>
+                  </w:r>
+                </w:p>
+              </w:tc>
+              <w:tc>
+                <w:tcPr>
+                  <w:tcW w:w="1370" w:type="dxa"/>
+                </w:tcPr>
+                <w:p>
+                  <w:pPr>
+                    <w:bidi/>
+                    <w:spacing w:after="0" w:line="300" w:lineRule="auto"/>
+                    <w:jc w:val="start"/>
+                    <w:rPr>
+                      <w:rFonts w:ascii="Arial" w:hAnsi="Arial" w:cs="Arial"/>
+                      <w:sz w:val="19"/>
+                      <w:szCs w:val="19"/>
+                      <w:rtl/>
+                    </w:rPr>
+                  </w:pPr>
+                  <w:r>
+                    <w:rPr>
+                      <w:rFonts w:ascii="Arial" w:hAnsi="Arial" w:cs="Arial"/>
+                      <w:sz w:val="19"/>
+                      <w:szCs w:val="19"/>
+                    </w:rPr>
+                    <w:t xml:space="preserve">890 / 12 / 0</w:t>
+                  </w:r>
+                </w:p>
+              </w:tc>
+              <w:tc>
+                <w:tcPr>
+                  <w:tcW w:w="1076" w:type="dxa"/>
+                </w:tcPr>
+                <w:p>
+                  <w:pPr>
+                    <w:bidi/>
+                    <w:spacing w:after="0" w:line="300" w:lineRule="auto"/>
+                    <w:jc w:val="start"/>
+                    <w:rPr>
+                      <w:rFonts w:ascii="Arial" w:hAnsi="Arial" w:cs="Arial"/>
+                      <w:sz w:val="19"/>
+                      <w:szCs w:val="19"/>
+                      <w:rtl/>
+                    </w:rPr>
+                  </w:pPr>
+                  <w:r>
+                    <w:rPr>
+                      <w:rFonts w:ascii="Arial" w:hAnsi="Arial" w:cs="Arial"/>
+                      <w:sz w:val="19"/>
+                      <w:szCs w:val="19"/>
+                    </w:rPr>
+                    <w:t xml:space="preserve">890 / 0 / 0</w:t>
                   </w:r>
                 </w:p>
               </w:tc>
@@ -20518,7 +20986,92 @@
                 <w:szCs w:val="22"/>
                 <w:rtl/>
               </w:rPr>
-              <w:t xml:space="preserve"> قرارًا غير آمن. وبلا حماية بقي </w:t>
+              <w:t xml:space="preserve"> قرارًا غير آمن (</w:t>
+            </w:r>
+            <w:r>
+              <w:rPr>
+                <w:rFonts w:ascii="Arial" w:hAnsi="Arial" w:cs="Arial"/>
+                <w:sz w:val="22"/>
+                <w:szCs w:val="22"/>
+              </w:rPr>
+              <w:t xml:space="preserve">12</w:t>
+            </w:r>
+            <w:r>
+              <w:rPr>
+                <w:rFonts w:ascii="Arial" w:hAnsi="Arial" w:cs="Arial"/>
+                <w:sz w:val="22"/>
+                <w:szCs w:val="22"/>
+                <w:rtl/>
+              </w:rPr>
+              <w:t xml:space="preserve"> واقعيًا و</w:t>
+            </w:r>
+            <w:r>
+              <w:rPr>
+                <w:rFonts w:ascii="Arial" w:hAnsi="Arial" w:cs="Arial"/>
+                <w:sz w:val="22"/>
+                <w:szCs w:val="22"/>
+              </w:rPr>
+              <w:t xml:space="preserve">1</w:t>
+            </w:r>
+            <w:r>
+              <w:rPr>
+                <w:rFonts w:ascii="Arial" w:hAnsi="Arial" w:cs="Arial"/>
+                <w:sz w:val="22"/>
+                <w:szCs w:val="22"/>
+                <w:rtl/>
+              </w:rPr>
+              <w:t xml:space="preserve"> حقيقيًا)، وترك </w:t>
+            </w:r>
+            <w:r>
+              <w:rPr>
+                <w:rFonts w:ascii="Arial" w:hAnsi="Arial" w:cs="Arial"/>
+                <w:sz w:val="22"/>
+                <w:szCs w:val="22"/>
+              </w:rPr>
+              <w:t xml:space="preserve">v9</w:t>
+            </w:r>
+            <w:r>
+              <w:rPr>
+                <w:rFonts w:ascii="Arial" w:hAnsi="Arial" w:cs="Arial"/>
+                <w:sz w:val="22"/>
+                <w:szCs w:val="22"/>
+                <w:rtl/>
+              </w:rPr>
+              <w:t xml:space="preserve"> المقفل </w:t>
+            </w:r>
+            <w:r>
+              <w:rPr>
+                <w:rFonts w:ascii="Arial" w:hAnsi="Arial" w:cs="Arial"/>
+                <w:sz w:val="22"/>
+                <w:szCs w:val="22"/>
+              </w:rPr>
+              <w:t xml:space="preserve">7</w:t>
+            </w:r>
+            <w:r>
+              <w:rPr>
+                <w:rFonts w:ascii="Arial" w:hAnsi="Arial" w:cs="Arial"/>
+                <w:sz w:val="22"/>
+                <w:szCs w:val="22"/>
+                <w:rtl/>
+              </w:rPr>
+              <w:t xml:space="preserve"> حالات فشل صامت عالجها </w:t>
+            </w:r>
+            <w:r>
+              <w:rPr>
+                <w:rFonts w:ascii="Arial" w:hAnsi="Arial" w:cs="Arial"/>
+                <w:sz w:val="22"/>
+                <w:szCs w:val="22"/>
+              </w:rPr>
+              <w:t xml:space="preserve">v12 (0)</w:t>
+            </w:r>
+            <w:r>
+              <w:rPr>
+                <w:rFonts w:ascii="Arial" w:hAnsi="Arial" w:cs="Arial"/>
+                <w:sz w:val="22"/>
+                <w:szCs w:val="22"/>
+                <w:rtl/>
+              </w:rPr>
+              <w:t xml:space="preserve">. وبلا حماية بقي </w:t>
             </w:r>
             <w:r>
               <w:rPr>
@@ -20628,7 +21181,7 @@
                 <w:sz w:val="22"/>
                 <w:szCs w:val="22"/>
               </w:rPr>
-              <w:t xml:space="preserve">[29]</w:t>
+              <w:t xml:space="preserve">[31]</w:t>
             </w:r>
             <w:r>
               <w:rPr>
@@ -23453,7 +24006,7 @@
                 <w:sz w:val="22"/>
                 <w:szCs w:val="22"/>
               </w:rPr>
-              <w:t xml:space="preserve">ML-DSA-65 [34] (71–98</w:t>
+              <w:t xml:space="preserve">ML-DSA-65 [36] (71–98</w:t>
             </w:r>
             <w:r>
               <w:rPr>
@@ -23694,7 +24247,7 @@
                 <w:sz w:val="22"/>
                 <w:szCs w:val="22"/>
               </w:rPr>
-              <w:t xml:space="preserve">[12]</w:t>
+              <w:t xml:space="preserve">[14]</w:t>
             </w:r>
             <w:r>
               <w:rPr>
@@ -23711,7 +24264,7 @@
                 <w:sz w:val="22"/>
                 <w:szCs w:val="22"/>
               </w:rPr>
-              <w:t xml:space="preserve">[13]</w:t>
+              <w:t xml:space="preserve">[15]</w:t>
             </w:r>
             <w:r>
               <w:rPr>
@@ -23745,67 +24298,50 @@
                 <w:sz w:val="22"/>
                 <w:szCs w:val="22"/>
               </w:rPr>
-              <w:t xml:space="preserve">[14][15]</w:t>
-            </w:r>
-            <w:r>
-              <w:rPr>
-                <w:rFonts w:ascii="Arial" w:hAnsi="Arial" w:cs="Arial"/>
-                <w:sz w:val="22"/>
-                <w:szCs w:val="22"/>
-                <w:rtl/>
-              </w:rPr>
-              <w:t xml:space="preserve"> لديه بوابة سلامة مثبتة واختبار للتزوير. ومقارنة بأقرب عمل كمّي </w:t>
-            </w:r>
-            <w:r>
-              <w:rPr>
-                <w:rFonts w:ascii="Arial" w:hAnsi="Arial" w:cs="Arial"/>
-                <w:sz w:val="22"/>
-                <w:szCs w:val="22"/>
-              </w:rPr>
-              <w:t xml:space="preserve">[19]</w:t>
-            </w:r>
-            <w:r>
-              <w:rPr>
-                <w:rFonts w:ascii="Arial" w:hAnsi="Arial" w:cs="Arial"/>
-                <w:sz w:val="22"/>
-                <w:szCs w:val="22"/>
-                <w:rtl/>
-              </w:rPr>
-              <w:t xml:space="preserve"> (متوسط نسبة تكلفة </w:t>
-            </w:r>
-            <w:r>
-              <w:rPr>
-                <w:rFonts w:ascii="Arial" w:hAnsi="Arial" w:cs="Arial"/>
-                <w:sz w:val="22"/>
-                <w:szCs w:val="22"/>
-              </w:rPr>
-              <w:t xml:space="preserve">0.96</w:t>
-            </w:r>
-            <w:r>
-              <w:rPr>
-                <w:rFonts w:ascii="Arial" w:hAnsi="Arial" w:cs="Arial"/>
-                <w:sz w:val="22"/>
-                <w:szCs w:val="22"/>
-                <w:rtl/>
-              </w:rPr>
-              <w:t xml:space="preserve"> عند </w:t>
-            </w:r>
-            <w:r>
-              <w:rPr>
-                <w:rFonts w:ascii="Arial" w:hAnsi="Arial" w:cs="Arial"/>
-                <w:sz w:val="22"/>
-                <w:szCs w:val="22"/>
-              </w:rPr>
-              <w:t xml:space="preserve">16</w:t>
-            </w:r>
-            <w:r>
-              <w:rPr>
-                <w:rFonts w:ascii="Arial" w:hAnsi="Arial" w:cs="Arial"/>
-                <w:sz w:val="22"/>
-                <w:szCs w:val="22"/>
-                <w:rtl/>
-              </w:rPr>
-              <w:t xml:space="preserve"> كيوبت) وصلنا إلى الأمثل الدقيق مع قيود السلامة، بمقياس أفضل قراءة.</w:t>
+              <w:t xml:space="preserve">[16][17]</w:t>
+            </w:r>
+            <w:r>
+              <w:rPr>
+                <w:rFonts w:ascii="Arial" w:hAnsi="Arial" w:cs="Arial"/>
+                <w:sz w:val="22"/>
+                <w:szCs w:val="22"/>
+                <w:rtl/>
+              </w:rPr>
+              <w:t xml:space="preserve"> لديه بوابة سلامة مثبتة واختبار للتزوير. وبخلاف أقرب عمل كمّي </w:t>
+            </w:r>
+            <w:r>
+              <w:rPr>
+                <w:rFonts w:ascii="Arial" w:hAnsi="Arial" w:cs="Arial"/>
+                <w:sz w:val="22"/>
+                <w:szCs w:val="22"/>
+              </w:rPr>
+              <w:t xml:space="preserve">[21]</w:t>
+            </w:r>
+            <w:r>
+              <w:rPr>
+                <w:rFonts w:ascii="Arial" w:hAnsi="Arial" w:cs="Arial"/>
+                <w:sz w:val="22"/>
+                <w:szCs w:val="22"/>
+                <w:rtl/>
+              </w:rPr>
+              <w:t xml:space="preserve"> أدخلنا قيود السلامة في المسألة الكمّية نفسها (المقارنة الرقمية تقريبية، القسم </w:t>
+            </w:r>
+            <w:r>
+              <w:rPr>
+                <w:rFonts w:ascii="Arial" w:hAnsi="Arial" w:cs="Arial"/>
+                <w:sz w:val="22"/>
+                <w:szCs w:val="22"/>
+              </w:rPr>
+              <w:t xml:space="preserve">5)</w:t>
+            </w:r>
+            <w:r>
+              <w:rPr>
+                <w:rFonts w:ascii="Arial" w:hAnsi="Arial" w:cs="Arial"/>
+                <w:sz w:val="22"/>
+                <w:szCs w:val="22"/>
+                <w:rtl/>
+              </w:rPr>
+              <w:t xml:space="preserve">.</w:t>
             </w:r>
           </w:p>
           <w:p>
@@ -24037,7 +24573,7 @@
                 <w:sz w:val="22"/>
                 <w:szCs w:val="22"/>
               </w:rPr>
-              <w:t xml:space="preserve">[14]</w:t>
+              <w:t xml:space="preserve">[16]</w:t>
             </w:r>
             <w:r>
               <w:rPr>
@@ -24189,7 +24725,7 @@
                 <w:sz w:val="22"/>
                 <w:szCs w:val="22"/>
               </w:rPr>
-              <w:t xml:space="preserve">[35]</w:t>
+              <w:t xml:space="preserve">[37]</w:t>
             </w:r>
             <w:r>
               <w:rPr>
@@ -25274,7 +25810,7 @@
                       <w:szCs w:val="19"/>
                       <w:rtl/>
                     </w:rPr>
-                    <w:t xml:space="preserve">أهداف مسجلة: زمن القطع الحقيقي &lt; </w:t>
+                    <w:t xml:space="preserve">هدف مسجّل: زمن القطع الحقيقي &lt; </w:t>
                   </w:r>
                   <w:r>
                     <w:rPr>
@@ -25300,57 +25836,6 @@
                       <w:szCs w:val="19"/>
                     </w:rPr>
                     <w:t xml:space="preserve">nftables)</w:t>
-                  </w:r>
-                  <w:r>
-                    <w:rPr>
-                      <w:rFonts w:ascii="Arial" w:hAnsi="Arial" w:cs="Arial"/>
-                      <w:sz w:val="19"/>
-                      <w:szCs w:val="19"/>
-                      <w:rtl/>
-                    </w:rPr>
-                    <w:t xml:space="preserve">، و</w:t>
-                  </w:r>
-                  <w:r>
-                    <w:rPr>
-                      <w:rFonts w:ascii="Arial" w:hAnsi="Arial" w:cs="Arial"/>
-                      <w:sz w:val="19"/>
-                      <w:szCs w:val="19"/>
-                    </w:rPr>
-                    <w:t xml:space="preserve">ML-DSA</w:t>
-                  </w:r>
-                  <w:r>
-                    <w:rPr>
-                      <w:rFonts w:ascii="Arial" w:hAnsi="Arial" w:cs="Arial"/>
-                      <w:sz w:val="19"/>
-                      <w:szCs w:val="19"/>
-                      <w:rtl/>
-                    </w:rPr>
-                    <w:t xml:space="preserve"> بلغة </w:t>
-                  </w:r>
-                  <w:r>
-                    <w:rPr>
-                      <w:rFonts w:ascii="Arial" w:hAnsi="Arial" w:cs="Arial"/>
-                      <w:sz w:val="19"/>
-                      <w:szCs w:val="19"/>
-                    </w:rPr>
-                    <w:t xml:space="preserve">C &lt; 50</w:t>
-                  </w:r>
-                  <w:r>
-                    <w:rPr>
-                      <w:rFonts w:ascii="Arial" w:hAnsi="Arial" w:cs="Arial"/>
-                      <w:sz w:val="19"/>
-                      <w:szCs w:val="19"/>
-                      <w:rtl/>
-                    </w:rPr>
-                    <w:t xml:space="preserve">، والمصنع ≥ </w:t>
-                  </w:r>
-                  <w:r>
-                    <w:rPr>
-                      <w:rFonts w:ascii="Arial" w:hAnsi="Arial" w:cs="Arial"/>
-                      <w:sz w:val="19"/>
-                      <w:szCs w:val="19"/>
-                    </w:rPr>
-                    <w:t xml:space="preserve">0.80</w:t>
                   </w:r>
                 </w:p>
               </w:tc>
@@ -25521,23 +26006,6 @@
                     </w:rPr>
                     <w:t xml:space="preserve">2026</w:t>
                   </w:r>
-                  <w:r>
-                    <w:rPr>
-                      <w:rFonts w:ascii="Arial" w:hAnsi="Arial" w:cs="Arial"/>
-                      <w:sz w:val="19"/>
-                      <w:szCs w:val="19"/>
-                      <w:rtl/>
-                    </w:rPr>
-                    <w:t xml:space="preserve"> – يناير </w:t>
-                  </w:r>
-                  <w:r>
-                    <w:rPr>
-                      <w:rFonts w:ascii="Arial" w:hAnsi="Arial" w:cs="Arial"/>
-                      <w:sz w:val="19"/>
-                      <w:szCs w:val="19"/>
-                    </w:rPr>
-                    <w:t xml:space="preserve">2027</w:t>
-                  </w:r>
                 </w:p>
               </w:tc>
               <w:tc>
@@ -25563,6 +26031,151 @@
                       <w:szCs w:val="19"/>
                       <w:rtl/>
                     </w:rPr>
+                    <w:t xml:space="preserve">أهداف مسجّلة: </w:t>
+                  </w:r>
+                  <w:r>
+                    <w:rPr>
+                      <w:rFonts w:ascii="Arial" w:hAnsi="Arial" w:cs="Arial"/>
+                      <w:sz w:val="19"/>
+                      <w:szCs w:val="19"/>
+                    </w:rPr>
+                    <w:t xml:space="preserve">ML-DSA</w:t>
+                  </w:r>
+                  <w:r>
+                    <w:rPr>
+                      <w:rFonts w:ascii="Arial" w:hAnsi="Arial" w:cs="Arial"/>
+                      <w:sz w:val="19"/>
+                      <w:szCs w:val="19"/>
+                      <w:rtl/>
+                    </w:rPr>
+                    <w:t xml:space="preserve"> بلغة </w:t>
+                  </w:r>
+                  <w:r>
+                    <w:rPr>
+                      <w:rFonts w:ascii="Arial" w:hAnsi="Arial" w:cs="Arial"/>
+                      <w:sz w:val="19"/>
+                      <w:szCs w:val="19"/>
+                    </w:rPr>
+                    <w:t xml:space="preserve">C &lt; 50</w:t>
+                  </w:r>
+                  <w:r>
+                    <w:rPr>
+                      <w:rFonts w:ascii="Arial" w:hAnsi="Arial" w:cs="Arial"/>
+                      <w:sz w:val="19"/>
+                      <w:szCs w:val="19"/>
+                      <w:rtl/>
+                    </w:rPr>
+                    <w:t xml:space="preserve"> مللي ثانية، والمصنع ≥ </w:t>
+                  </w:r>
+                  <w:r>
+                    <w:rPr>
+                      <w:rFonts w:ascii="Arial" w:hAnsi="Arial" w:cs="Arial"/>
+                      <w:sz w:val="19"/>
+                      <w:szCs w:val="19"/>
+                    </w:rPr>
+                    <w:t xml:space="preserve">0.80</w:t>
+                  </w:r>
+                  <w:r>
+                    <w:rPr>
+                      <w:rFonts w:ascii="Arial" w:hAnsi="Arial" w:cs="Arial"/>
+                      <w:sz w:val="19"/>
+                      <w:szCs w:val="19"/>
+                      <w:rtl/>
+                    </w:rPr>
+                    <w:t xml:space="preserve"> بتجزئة أنظمة التحكم</w:t>
+                  </w:r>
+                </w:p>
+              </w:tc>
+              <w:tc>
+                <w:tcPr>
+                  <w:tcW w:w="2251" w:type="dxa"/>
+                </w:tcPr>
+                <w:p>
+                  <w:pPr>
+                    <w:bidi/>
+                    <w:spacing w:after="0" w:line="300" w:lineRule="auto"/>
+                    <w:jc w:val="start"/>
+                    <w:rPr>
+                      <w:rFonts w:ascii="Arial" w:hAnsi="Arial" w:cs="Arial"/>
+                      <w:sz w:val="19"/>
+                      <w:szCs w:val="19"/>
+                      <w:rtl/>
+                    </w:rPr>
+                  </w:pPr>
+                  <w:r>
+                    <w:rPr>
+                      <w:rFonts w:ascii="Arial" w:hAnsi="Arial" w:cs="Arial"/>
+                      <w:sz w:val="19"/>
+                      <w:szCs w:val="19"/>
+                      <w:rtl/>
+                    </w:rPr>
+                    <w:t xml:space="preserve">المنزل؛ حاسوب شخصي</w:t>
+                  </w:r>
+                </w:p>
+              </w:tc>
+            </w:tr>
+            <w:tr>
+              <w:trPr>
+                <w:cantSplit/>
+              </w:trPr>
+              <w:tc>
+                <w:tcPr>
+                  <w:tcW w:w="1957" w:type="dxa"/>
+                </w:tcPr>
+                <w:p>
+                  <w:pPr>
+                    <w:bidi/>
+                    <w:spacing w:after="0" w:line="300" w:lineRule="auto"/>
+                    <w:jc w:val="start"/>
+                    <w:rPr>
+                      <w:rFonts w:ascii="Arial" w:hAnsi="Arial" w:cs="Arial"/>
+                      <w:sz w:val="19"/>
+                      <w:szCs w:val="19"/>
+                      <w:rtl/>
+                    </w:rPr>
+                  </w:pPr>
+                  <w:r>
+                    <w:rPr>
+                      <w:rFonts w:ascii="Arial" w:hAnsi="Arial" w:cs="Arial"/>
+                      <w:sz w:val="19"/>
+                      <w:szCs w:val="19"/>
+                      <w:rtl/>
+                    </w:rPr>
+                    <w:t xml:space="preserve">يناير </w:t>
+                  </w:r>
+                  <w:r>
+                    <w:rPr>
+                      <w:rFonts w:ascii="Arial" w:hAnsi="Arial" w:cs="Arial"/>
+                      <w:sz w:val="19"/>
+                      <w:szCs w:val="19"/>
+                    </w:rPr>
+                    <w:t xml:space="preserve">2027</w:t>
+                  </w:r>
+                </w:p>
+              </w:tc>
+              <w:tc>
+                <w:tcPr>
+                  <w:tcW w:w="5090" w:type="dxa"/>
+                </w:tcPr>
+                <w:p>
+                  <w:pPr>
+                    <w:bidi/>
+                    <w:spacing w:after="0" w:line="300" w:lineRule="auto"/>
+                    <w:jc w:val="start"/>
+                    <w:rPr>
+                      <w:rFonts w:ascii="Arial" w:hAnsi="Arial" w:cs="Arial"/>
+                      <w:sz w:val="19"/>
+                      <w:szCs w:val="19"/>
+                      <w:rtl/>
+                    </w:rPr>
+                  </w:pPr>
+                  <w:r>
+                    <w:rPr>
+                      <w:rFonts w:ascii="Arial" w:hAnsi="Arial" w:cs="Arial"/>
+                      <w:sz w:val="19"/>
+                      <w:szCs w:val="19"/>
+                      <w:rtl/>
+                    </w:rPr>
                     <w:t xml:space="preserve">اختبار </w:t>
                   </w:r>
                   <w:r>
@@ -25588,7 +26201,7 @@
                       <w:sz w:val="19"/>
                       <w:szCs w:val="19"/>
                     </w:rPr>
-                    <w:t xml:space="preserve">CIC-IDS2017 [36])</w:t>
+                    <w:t xml:space="preserve">CIC-IDS2017 [38])</w:t>
                   </w:r>
                   <w:r>
                     <w:rPr>
@@ -26531,7 +27144,7 @@
                 <w:sz w:val="19"/>
                 <w:szCs w:val="19"/>
               </w:rPr>
-              <w:t xml:space="preserve">[12]  Microsoft. (n.d.). Automatic attack disruption in Microsoft Defender; Exclude assets from automated response in attack disruption. Microsoft Learn. Retrieved October 14, 2026, from https://learn.microsoft.com/en-us/defender-xdr/automatic-attack-disruption-exclusions</w:t>
+              <w:t xml:space="preserve">[12]  Hammar, K., &amp; Stadler, R. (2024). Learning Near-Optimal Intrusion Responses Against Dynamic Attackers. IEEE Transactions on Network and Service Management, 21(1). https://doi.org/10.1109/TNSM.2023.3293413</w:t>
             </w:r>
           </w:p>
           <w:p>
@@ -26547,7 +27160,7 @@
                 <w:sz w:val="19"/>
                 <w:szCs w:val="19"/>
               </w:rPr>
-              <w:t xml:space="preserve">[13]  Meyer, P., Gutman, C., &amp; Kooker, J. R. (2020). Network containment of compromised machines (U.S. Patent No. 10,659,432). CrowdStrike, Inc. https://patents.justia.com/patent/10659432</w:t>
+              <w:t xml:space="preserve">[13]  Hammar, K., Li, T., Stadler, R., &amp; Zhu, Q. (2025). Adaptive Security Response Strategies Through Conjectural Online Learning. IEEE Transactions on Information Forensics and Security, 20, 4055–4070. https://doi.org/10.1109/TIFS.2025.3558600</w:t>
             </w:r>
           </w:p>
           <w:p>
@@ -26563,7 +27176,7 @@
                 <w:sz w:val="19"/>
                 <w:szCs w:val="19"/>
               </w:rPr>
-              <w:t xml:space="preserve">[14]  Shameli-Sendi, A., Louafi, H., He, W., &amp; Cheriet, M. (2018). Dynamic optimal countermeasure selection for intrusion response system. IEEE Transactions on Dependable and Secure Computing, 15(5), 755–770. https://doi.org/10.1109/TDSC.2016.2615622</w:t>
+              <w:t xml:space="preserve">[14]  Microsoft. (n.d.). Automatic attack disruption in Microsoft Defender; Exclude assets from automated response in attack disruption. Microsoft Learn. Retrieved October 14, 2026, from https://learn.microsoft.com/en-us/defender-xdr/automatic-attack-disruption-exclusions</w:t>
             </w:r>
           </w:p>
           <w:p>
@@ -26579,7 +27192,7 @@
                 <w:sz w:val="19"/>
                 <w:szCs w:val="19"/>
               </w:rPr>
-              <w:t xml:space="preserve">[15]  Bozorgchenani, A., Zarakovitis, C. C., Chien, S. F., Ni, Q., Gouglidis, A., Mallouli, W., &amp; Lim, H. S. (2024). Intrusion Response Systems for the 5G Networks and Beyond: A New Joint Security-vs-QoS Optimization Approach. IEEE Transactions on Network Science and Engineering, 11(3), 3039–3052. https://doi.org/10.1109/TNSE.2024.3358170</w:t>
+              <w:t xml:space="preserve">[15]  Meyer, P., Gutman, C., &amp; Kooker, J. R. (2020). Network containment of compromised machines (U.S. Patent No. 10,659,432). CrowdStrike, Inc. https://patents.justia.com/patent/10659432</w:t>
             </w:r>
           </w:p>
           <w:p>
@@ -26595,7 +27208,7 @@
                 <w:sz w:val="19"/>
                 <w:szCs w:val="19"/>
               </w:rPr>
-              <w:t xml:space="preserve">[16]  Hammar, K., &amp; Stadler, R. (2022). Intrusion Prevention Through Optimal Stopping. IEEE Transactions on Network and Service Management, 19(3). https://doi.org/10.1109/TNSM.2022.3176781</w:t>
+              <w:t xml:space="preserve">[16]  Shameli-Sendi, A., Louafi, H., He, W., &amp; Cheriet, M. (2018). Dynamic optimal countermeasure selection for intrusion response system. IEEE Transactions on Dependable and Secure Computing, 15(5), 755–770. https://doi.org/10.1109/TDSC.2016.2615622</w:t>
             </w:r>
           </w:p>
           <w:p>
@@ -26611,7 +27224,7 @@
                 <w:sz w:val="19"/>
                 <w:szCs w:val="19"/>
               </w:rPr>
-              <w:t xml:space="preserve">[17]  Standen, M., Lucas, M., Bowman, D., Richer, T. J., Kim, J., &amp; Marriott, D. (2021). CybORG: A Gym for the Development of Autonomous Cyber Agents. arXiv:2108.09118. https://arxiv.org/abs/2108.09118</w:t>
+              <w:t xml:space="preserve">[17]  Bozorgchenani, A., Zarakovitis, C. C., Chien, S. F., Ni, Q., Gouglidis, A., Mallouli, W., &amp; Lim, H. S. (2024). Intrusion Response Systems for the 5G Networks and Beyond: A New Joint Security-vs-QoS Optimization Approach. IEEE Transactions on Network Science and Engineering, 11(3), 3039–3052. https://doi.org/10.1109/TNSE.2024.3358170</w:t>
             </w:r>
           </w:p>
           <w:p>
@@ -26627,7 +27240,7 @@
                 <w:sz w:val="19"/>
                 <w:szCs w:val="19"/>
               </w:rPr>
-              <w:t xml:space="preserve">[18]  Rose, S., Borchert, O., Mitchell, S., &amp; Connelly, S. (2020). Zero Trust Architecture (NIST Special Publication 800-207). National Institute of Standards and Technology. https://doi.org/10.6028/NIST.SP.800-207</w:t>
+              <w:t xml:space="preserve">[18]  Hammar, K., &amp; Stadler, R. (2022). Intrusion Prevention Through Optimal Stopping. IEEE Transactions on Network and Service Management, 19(3). https://doi.org/10.1109/TNSM.2022.3176781</w:t>
             </w:r>
           </w:p>
           <w:p>
@@ -26643,7 +27256,7 @@
                 <w:sz w:val="19"/>
                 <w:szCs w:val="19"/>
               </w:rPr>
-              <w:t xml:space="preserve">[19]  Cogburn, C. V., DeCusatis, C., &amp; Spillane, E. (2026). Hardware-Aware QAOA for Honeypot Traffic Partitioning on 100+ Qubit IBM Quantum Processors. arXiv:2606.09469. https://arxiv.org/abs/2606.09469</w:t>
+              <w:t xml:space="preserve">[19]  Standen, M., Lucas, M., Bowman, D., Richer, T. J., Kim, J., &amp; Marriott, D. (2021). CybORG: A Gym for the Development of Autonomous Cyber Agents. arXiv:2108.09118. https://arxiv.org/abs/2108.09118</w:t>
             </w:r>
           </w:p>
           <w:p>
@@ -26659,7 +27272,7 @@
                 <w:sz w:val="19"/>
                 <w:szCs w:val="19"/>
               </w:rPr>
-              <w:t xml:space="preserve">[20]  Lucas, A. (2014). Ising formulations of many NP problems. Frontiers in Physics, 2, 5. https://doi.org/10.3389/fphy.2014.00005</w:t>
+              <w:t xml:space="preserve">[20]  Rose, S., Borchert, O., Mitchell, S., &amp; Connelly, S. (2020). Zero Trust Architecture (NIST Special Publication 800-207). National Institute of Standards and Technology. https://doi.org/10.6028/NIST.SP.800-207</w:t>
             </w:r>
           </w:p>
           <w:p>
@@ -26675,7 +27288,7 @@
                 <w:sz w:val="19"/>
                 <w:szCs w:val="19"/>
               </w:rPr>
-              <w:t xml:space="preserve">[21]  Glover, F., Kochenberger, G., &amp; Du, Y. (2019). Quantum Bridge Analytics I: a tutorial on formulating and using QUBO models. 4OR, 17(4), 335–371. https://doi.org/10.1007/s10288-019-00424-y</w:t>
+              <w:t xml:space="preserve">[21]  Cogburn, C. V., DeCusatis, C., &amp; Spillane, E. (2026). Hardware-Aware QAOA for Honeypot Traffic Partitioning on 100+ Qubit IBM Quantum Processors. arXiv:2606.09469. https://arxiv.org/abs/2606.09469</w:t>
             </w:r>
           </w:p>
           <w:p>
@@ -26691,7 +27304,7 @@
                 <w:sz w:val="19"/>
                 <w:szCs w:val="19"/>
               </w:rPr>
-              <w:t xml:space="preserve">[22]  Farhi, E., Goldstone, J., &amp; Gutmann, S. (2014). A Quantum Approximate Optimization Algorithm. arXiv:1411.4028. https://arxiv.org/abs/1411.4028</w:t>
+              <w:t xml:space="preserve">[22]  Lucas, A. (2014). Ising formulations of many NP problems. Frontiers in Physics, 2, 5. https://doi.org/10.3389/fphy.2014.00005</w:t>
             </w:r>
           </w:p>
           <w:p>
@@ -26707,7 +27320,7 @@
                 <w:sz w:val="19"/>
                 <w:szCs w:val="19"/>
               </w:rPr>
-              <w:t xml:space="preserve">[23]  Sha, L. (2001). Using simplicity to control complexity. IEEE Software, 18(4), 20–28. https://doi.org/10.1109/MS.2001.936213</w:t>
+              <w:t xml:space="preserve">[23]  Glover, F., Kochenberger, G., &amp; Du, Y. (2019). Quantum Bridge Analytics I: a tutorial on formulating and using QUBO models. 4OR, 17(4), 335–371. https://doi.org/10.1007/s10288-019-00424-y</w:t>
             </w:r>
           </w:p>
           <w:p>
@@ -26723,7 +27336,7 @@
                 <w:sz w:val="19"/>
                 <w:szCs w:val="19"/>
               </w:rPr>
-              <w:t xml:space="preserve">[24]  Huangfu, Q., &amp; Hall, J. A. J. (2018). Parallelizing the dual revised simplex method. Mathematical Programming Computation, 10(1), 119–142. https://doi.org/10.1007/s12532-017-0130-5</w:t>
+              <w:t xml:space="preserve">[24]  Farhi, E., Goldstone, J., &amp; Gutmann, S. (2014). A Quantum Approximate Optimization Algorithm. arXiv:1411.4028. https://arxiv.org/abs/1411.4028</w:t>
             </w:r>
           </w:p>
           <w:p>
@@ -26739,7 +27352,7 @@
                 <w:sz w:val="19"/>
                 <w:szCs w:val="19"/>
               </w:rPr>
-              <w:t xml:space="preserve">[25]  de Moura, L., &amp; Bjørner, N. (2008). Z3: An Efficient SMT Solver. In Tools and Algorithms for the Construction and Analysis of Systems (TACAS 2008), LNCS 4963, 337–340. Springer. https://doi.org/10.1007/978-3-540-78800-3_24</w:t>
+              <w:t xml:space="preserve">[25]  Sha, L. (2001). Using simplicity to control complexity. IEEE Software, 18(4), 20–28. https://doi.org/10.1109/MS.2001.936213</w:t>
             </w:r>
           </w:p>
           <w:p>
@@ -26755,7 +27368,7 @@
                 <w:sz w:val="19"/>
                 <w:szCs w:val="19"/>
               </w:rPr>
-              <w:t xml:space="preserve">[26]  Alshiekh, M., Bloem, R., Ehlers, R., Könighofer, B., Niekum, S., &amp; Topcu, U. (2018). Safe Reinforcement Learning via Shielding. Proceedings of the AAAI Conference on Artificial Intelligence, 32(1). https://doi.org/10.1609/aaai.v32i1.11797</w:t>
+              <w:t xml:space="preserve">[26]  Huangfu, Q., &amp; Hall, J. A. J. (2018). Parallelizing the dual revised simplex method. Mathematical Programming Computation, 10(1), 119–142. https://doi.org/10.1007/s12532-017-0130-5</w:t>
             </w:r>
           </w:p>
           <w:p>
@@ -26771,7 +27384,7 @@
                 <w:sz w:val="19"/>
                 <w:szCs w:val="19"/>
               </w:rPr>
-              <w:t xml:space="preserve">[27]  FIRST. (2019). Common Vulnerability Scoring System v3.1: Specification Document. https://www.first.org/cvss/v3-1/specification-document</w:t>
+              <w:t xml:space="preserve">[27]  de Moura, L., &amp; Bjørner, N. (2008). Z3: An Efficient SMT Solver. In Tools and Algorithms for the Construction and Analysis of Systems (TACAS 2008), LNCS 4963, 337–340. Springer. https://doi.org/10.1007/978-3-540-78800-3_24</w:t>
             </w:r>
           </w:p>
           <w:p>
@@ -26787,7 +27400,7 @@
                 <w:sz w:val="19"/>
                 <w:szCs w:val="19"/>
               </w:rPr>
-              <w:t xml:space="preserve">[28]  MITRE. (2026). MITRE ATT&amp;CK® (Enterprise and ICS matrices). https://attack.mitre.org/</w:t>
+              <w:t xml:space="preserve">[28]  Alshiekh, M., Bloem, R., Ehlers, R., Könighofer, B., Niekum, S., &amp; Topcu, U. (2018). Safe Reinforcement Learning via Shielding. Proceedings of the AAAI Conference on Artificial Intelligence, 32(1). https://doi.org/10.1609/aaai.v32i1.11797</w:t>
             </w:r>
           </w:p>
           <w:p>
@@ -26803,7 +27416,7 @@
                 <w:sz w:val="19"/>
                 <w:szCs w:val="19"/>
               </w:rPr>
-              <w:t xml:space="preserve">[29]  PwC. (2021). Conti cyber attack on the HSE: Independent post incident review. Health Service Executive (Ireland). https://www.hse.ie/eng/services/publications/conti-cyber-attack-on-the-hse-full-report.pdf</w:t>
+              <w:t xml:space="preserve">[29]  FIRST. (2019). Common Vulnerability Scoring System v3.1: Specification Document. https://www.first.org/cvss/v3-1/specification-document</w:t>
             </w:r>
           </w:p>
           <w:p>
@@ -26819,7 +27432,7 @@
                 <w:sz w:val="19"/>
                 <w:szCs w:val="19"/>
               </w:rPr>
-              <w:t xml:space="preserve">[30]  The DFIR Report. (2021–2026). Intrusion reports. https://thedfirreport.com/</w:t>
+              <w:t xml:space="preserve">[30]  MITRE. (2026). MITRE ATT&amp;CK® (Enterprise and ICS matrices). https://attack.mitre.org/</w:t>
             </w:r>
           </w:p>
           <w:p>
@@ -26835,7 +27448,7 @@
                 <w:sz w:val="19"/>
                 <w:szCs w:val="19"/>
               </w:rPr>
-              <w:t xml:space="preserve">[31]  MITRE Center for Threat-Informed Defense. (2024). Attack Flow (v2) and the Attack Flow corpus [Software and data]. https://github.com/center-for-threat-informed-defense/attack-flow</w:t>
+              <w:t xml:space="preserve">[31]  PwC. (2021). Conti cyber attack on the HSE: Independent post incident review. Health Service Executive (Ireland). https://www.hse.ie/eng/services/publications/conti-cyber-attack-on-the-hse-full-report.pdf</w:t>
             </w:r>
           </w:p>
           <w:p>
@@ -26851,7 +27464,7 @@
                 <w:sz w:val="19"/>
                 <w:szCs w:val="19"/>
               </w:rPr>
-              <w:t xml:space="preserve">[32]  Cybersecurity and Infrastructure Security Agency (CISA). (2013–2026). Cybersecurity Advisories. https://www.cisa.gov/news-events/cybersecurity-advisories</w:t>
+              <w:t xml:space="preserve">[32]  The DFIR Report. (2021–2026). Intrusion reports. https://thedfirreport.com/</w:t>
             </w:r>
           </w:p>
           <w:p>
@@ -26867,7 +27480,7 @@
                 <w:sz w:val="19"/>
                 <w:szCs w:val="19"/>
               </w:rPr>
-              <w:t xml:space="preserve">[33]  Barkoutsos, P. K., Nannicini, G., Robert, A., Tavernelli, I., &amp; Woerner, S. (2020). Improving Variational Quantum Optimization using CVaR. Quantum, 4, 256. https://doi.org/10.22331/q-2020-04-20-256</w:t>
+              <w:t xml:space="preserve">[33]  MITRE Center for Threat-Informed Defense. (2024). Attack Flow (v2) and the Attack Flow corpus [Software and data]. https://github.com/center-for-threat-informed-defense/attack-flow</w:t>
             </w:r>
           </w:p>
           <w:p>
@@ -26883,63 +27496,7 @@
                 <w:sz w:val="19"/>
                 <w:szCs w:val="19"/>
               </w:rPr>
-              <w:t xml:space="preserve">[34]  National Institute of Standards and Technology. (2024). Module-Lattice-Based Digital Signature Standard (FIPS 204). https://doi.org/10.6028/NIST.FIPS.204</w:t>
-            </w:r>
-          </w:p>
-          <w:p>
-            <w:pPr>
-              <w:bidi/>
-              <w:spacing w:after="50" w:line="300" w:lineRule="auto"/>
-              <w:ind w:start="520" w:hanging="520"/>
-              <w:jc w:val="start"/>
-              <w:rPr>
-                <w:rFonts w:ascii="Arial" w:hAnsi="Arial" w:cs="Arial"/>
-                <w:sz w:val="19"/>
-                <w:szCs w:val="19"/>
-                <w:rtl/>
-              </w:rPr>
-            </w:pPr>
-            <w:r>
-              <w:rPr>
-                <w:rFonts w:ascii="Arial" w:hAnsi="Arial" w:cs="Arial"/>
-                <w:sz w:val="19"/>
-                <w:szCs w:val="19"/>
-              </w:rPr>
-              <w:t xml:space="preserve">[35]</w:t>
-            </w:r>
-            <w:r>
-              <w:rPr>
-                <w:rFonts w:ascii="Arial" w:hAnsi="Arial" w:cs="Arial"/>
-                <w:sz w:val="19"/>
-                <w:szCs w:val="19"/>
-                <w:rtl/>
-              </w:rPr>
-              <w:t xml:space="preserve">  الهيئة السعودية للبيانات والذكاء الاصطناعي (سدايا). (</w:t>
-            </w:r>
-            <w:r>
-              <w:rPr>
-                <w:rFonts w:ascii="Arial" w:hAnsi="Arial" w:cs="Arial"/>
-                <w:sz w:val="19"/>
-                <w:szCs w:val="19"/>
-              </w:rPr>
-              <w:t xml:space="preserve">2023)</w:t>
-            </w:r>
-            <w:r>
-              <w:rPr>
-                <w:rFonts w:ascii="Arial" w:hAnsi="Arial" w:cs="Arial"/>
-                <w:sz w:val="19"/>
-                <w:szCs w:val="19"/>
-                <w:rtl/>
-              </w:rPr>
-              <w:t xml:space="preserve">. مبادئ أخلاقيات الذكاء الاصطناعي (الإصدار </w:t>
-            </w:r>
-            <w:r>
-              <w:rPr>
-                <w:rFonts w:ascii="Arial" w:hAnsi="Arial" w:cs="Arial"/>
-                <w:sz w:val="19"/>
-                <w:szCs w:val="19"/>
-              </w:rPr>
-              <w:t xml:space="preserve">1.0). https://sdaia.gov.sa/en/SDAIA/about/Documents/ai-principles.pdf</w:t>
+              <w:t xml:space="preserve">[34]  Cybersecurity and Infrastructure Security Agency (CISA). (2013–2026). Cybersecurity Advisories. https://www.cisa.gov/news-events/cybersecurity-advisories</w:t>
             </w:r>
           </w:p>
           <w:p>
@@ -26955,7 +27512,7 @@
                 <w:sz w:val="19"/>
                 <w:szCs w:val="19"/>
               </w:rPr>
-              <w:t xml:space="preserve">[36]  Sharafaldin, I., Lashkari, A. H., &amp; Ghorbani, A. A. (2018). Toward Generating a New Intrusion Detection Dataset and Intrusion Traffic Characterization. In Proceedings of ICISSP 2018, 108–116. https://doi.org/10.5220/0006639801080116</w:t>
+              <w:t xml:space="preserve">[35]  Barkoutsos, P. K., Nannicini, G., Robert, A., Tavernelli, I., &amp; Woerner, S. (2020). Improving Variational Quantum Optimization using CVaR. Quantum, 4, 256. https://doi.org/10.22331/q-2020-04-20-256</w:t>
             </w:r>
           </w:p>
           <w:p>
@@ -26971,7 +27528,63 @@
                 <w:sz w:val="19"/>
                 <w:szCs w:val="19"/>
               </w:rPr>
-              <w:t xml:space="preserve">[37]  Anthropic. (2026). Claude (Opus) [Large language model]. Used September–October 2026 for code assistance, analysis, source search and drafting support, as disclosed in this section. https://claude.ai</w:t>
+              <w:t xml:space="preserve">[36]  National Institute of Standards and Technology. (2024). Module-Lattice-Based Digital Signature Standard (FIPS 204). https://doi.org/10.6028/NIST.FIPS.204</w:t>
+            </w:r>
+          </w:p>
+          <w:p>
+            <w:pPr>
+              <w:bidi/>
+              <w:spacing w:after="50" w:line="300" w:lineRule="auto"/>
+              <w:ind w:start="520" w:hanging="520"/>
+              <w:jc w:val="start"/>
+              <w:rPr>
+                <w:rFonts w:ascii="Arial" w:hAnsi="Arial" w:cs="Arial"/>
+                <w:sz w:val="19"/>
+                <w:szCs w:val="19"/>
+                <w:rtl/>
+              </w:rPr>
+            </w:pPr>
+            <w:r>
+              <w:rPr>
+                <w:rFonts w:ascii="Arial" w:hAnsi="Arial" w:cs="Arial"/>
+                <w:sz w:val="19"/>
+                <w:szCs w:val="19"/>
+              </w:rPr>
+              <w:t xml:space="preserve">[37]</w:t>
+            </w:r>
+            <w:r>
+              <w:rPr>
+                <w:rFonts w:ascii="Arial" w:hAnsi="Arial" w:cs="Arial"/>
+                <w:sz w:val="19"/>
+                <w:szCs w:val="19"/>
+                <w:rtl/>
+              </w:rPr>
+              <w:t xml:space="preserve">  الهيئة السعودية للبيانات والذكاء الاصطناعي (سدايا). (</w:t>
+            </w:r>
+            <w:r>
+              <w:rPr>
+                <w:rFonts w:ascii="Arial" w:hAnsi="Arial" w:cs="Arial"/>
+                <w:sz w:val="19"/>
+                <w:szCs w:val="19"/>
+              </w:rPr>
+              <w:t xml:space="preserve">2023)</w:t>
+            </w:r>
+            <w:r>
+              <w:rPr>
+                <w:rFonts w:ascii="Arial" w:hAnsi="Arial" w:cs="Arial"/>
+                <w:sz w:val="19"/>
+                <w:szCs w:val="19"/>
+                <w:rtl/>
+              </w:rPr>
+              <w:t xml:space="preserve">. مبادئ أخلاقيات الذكاء الاصطناعي (الإصدار </w:t>
+            </w:r>
+            <w:r>
+              <w:rPr>
+                <w:rFonts w:ascii="Arial" w:hAnsi="Arial" w:cs="Arial"/>
+                <w:sz w:val="19"/>
+                <w:szCs w:val="19"/>
+              </w:rPr>
+              <w:t xml:space="preserve">1.0). https://sdaia.gov.sa/en/SDAIA/about/Documents/ai-principles.pdf</w:t>
             </w:r>
           </w:p>
           <w:p>
@@ -26987,7 +27600,39 @@
                 <w:sz w:val="19"/>
                 <w:szCs w:val="19"/>
               </w:rPr>
-              <w:t xml:space="preserve">[38]  OpenAI. (2026). ChatGPT and Codex [Large language models]. Used September–October 2026 as an independent reviewer of text and code. https://chatgpt.com</w:t>
+              <w:t xml:space="preserve">[38]  Sharafaldin, I., Lashkari, A. H., &amp; Ghorbani, A. A. (2018). Toward Generating a New Intrusion Detection Dataset and Intrusion Traffic Characterization. In Proceedings of ICISSP 2018, 108–116. https://doi.org/10.5220/0006639801080116</w:t>
+            </w:r>
+          </w:p>
+          <w:p>
+            <w:pPr>
+              <w:bidi w:val="0"/>
+              <w:spacing w:after="50" w:line="276" w:lineRule="auto"/>
+              <w:ind w:left="520" w:hanging="520"/>
+              <w:jc w:val="left"/>
+            </w:pPr>
+            <w:r>
+              <w:rPr>
+                <w:rFonts w:ascii="Arial" w:hAnsi="Arial" w:cs="Arial"/>
+                <w:sz w:val="19"/>
+                <w:szCs w:val="19"/>
+              </w:rPr>
+              <w:t xml:space="preserve">[39]  Anthropic. (2026). Claude (Opus) [Large language model]. Used September–October 2026 for code assistance, analysis, source search and drafting support, as disclosed in this section. https://claude.ai</w:t>
+            </w:r>
+          </w:p>
+          <w:p>
+            <w:pPr>
+              <w:bidi w:val="0"/>
+              <w:spacing w:after="50" w:line="276" w:lineRule="auto"/>
+              <w:ind w:left="520" w:hanging="520"/>
+              <w:jc w:val="left"/>
+            </w:pPr>
+            <w:r>
+              <w:rPr>
+                <w:rFonts w:ascii="Arial" w:hAnsi="Arial" w:cs="Arial"/>
+                <w:sz w:val="19"/>
+                <w:szCs w:val="19"/>
+              </w:rPr>
+              <w:t xml:space="preserve">[40]  OpenAI. (2026). ChatGPT and Codex [Large language models]. Used September–October 2026 as an independent reviewer of text and code. https://chatgpt.com</w:t>
             </w:r>
           </w:p>
           <w:p>
@@ -27071,7 +27716,7 @@
                 <w:sz w:val="22"/>
                 <w:szCs w:val="22"/>
               </w:rPr>
-              <w:t xml:space="preserve">Anthropic) [37]</w:t>
+              <w:t xml:space="preserve">Anthropic) [39]</w:t>
             </w:r>
             <w:r>
               <w:rPr>
@@ -27105,7 +27750,7 @@
                 <w:sz w:val="22"/>
                 <w:szCs w:val="22"/>
               </w:rPr>
-              <w:t xml:space="preserve">OpenAI) [38]</w:t>
+              <w:t xml:space="preserve">OpenAI) [40]</w:t>
             </w:r>
             <w:r>
               <w:rPr>

</xml_diff>

<commit_message>
form v20: second-judge fixes (Z3 wording, best-shot wording, in/out-of-sample label, plan spread)
Co-Authored-By: Claude Opus 5.5 <noreply@anthropic.com>
Claude-Session: https://claude.ai/code/session_011J2KrGUp2npQo9Tosx1KRc
</commit_message>
<xml_diff>
--- a/docs/qacrs/form_drafts/IBDAA_2027_FORM_ACRS_v20.docx
+++ b/docs/qacrs/form_drafts/IBDAA_2027_FORM_ACRS_v20.docx
@@ -3571,7 +3571,7 @@
                 <w:szCs w:val="22"/>
                 <w:rtl/>
               </w:rPr>
-              <w:t xml:space="preserve"> الكمّي وجد الحل الأمثل في </w:t>
+              <w:t xml:space="preserve"> الكمّي وجدت أفضل قراءة الحل الأمثل في </w:t>
             </w:r>
             <w:r>
               <w:rPr>
@@ -3622,7 +3622,7 @@
                 <w:szCs w:val="22"/>
                 <w:rtl/>
               </w:rPr>
-              <w:t xml:space="preserve"> كيوبت) من شبكة </w:t>
+              <w:t xml:space="preserve"> كيوبت مجتمعة) من شبكة </w:t>
             </w:r>
             <w:r>
               <w:rPr>
@@ -6870,24 +6870,41 @@
                 <w:szCs w:val="22"/>
                 <w:rtl/>
               </w:rPr>
-              <w:t xml:space="preserve"> هو المُحسِّن، والبسيط هو بوابة السلامة؛ فإذا انخدع المُحسِّن بتنبيهات مزوّرة وقرر عزل خادم حرج، أوقفت البوابة القرار حتى يوافق عليه شخصان. واخترناه لأن البوابة البسيطة يمكن إثبات خصائصها رياضيًا بحلّال دقيق مثل </w:t>
-            </w:r>
-            <w:r>
-              <w:rPr>
-                <w:rFonts w:ascii="Arial" w:hAnsi="Arial" w:cs="Arial"/>
-                <w:sz w:val="22"/>
-                <w:szCs w:val="22"/>
-              </w:rPr>
-              <w:t xml:space="preserve">HiGHS [26]</w:t>
-            </w:r>
-            <w:r>
-              <w:rPr>
-                <w:rFonts w:ascii="Arial" w:hAnsi="Arial" w:cs="Arial"/>
-                <w:sz w:val="22"/>
-                <w:szCs w:val="22"/>
-                <w:rtl/>
-              </w:rPr>
-              <w:t xml:space="preserve"> وأدوات مثل </w:t>
+              <w:t xml:space="preserve"> هو المُحسِّن، والبسيط هو بوابة السلامة؛ فإذا انخدع المُحسِّن بتنبيهات مزوّرة وقرر عزل خادم حرج، أوقفت البوابة القرار حتى يوافق عليه شخصان. واخترناه لأن البوابة البسيطة يمكن إثبات خصائصها رياضيًا، أما المُحسِّن فلا؛ وأثبتناها بحلّال </w:t>
+            </w:r>
+            <w:r>
+              <w:rPr>
+                <w:rFonts w:ascii="Arial" w:hAnsi="Arial" w:cs="Arial"/>
+                <w:sz w:val="22"/>
+                <w:szCs w:val="22"/>
+              </w:rPr>
+              <w:t xml:space="preserve">HiGHS</w:t>
+            </w:r>
+            <w:r>
+              <w:rPr>
+                <w:rFonts w:ascii="Arial" w:hAnsi="Arial" w:cs="Arial"/>
+                <w:sz w:val="22"/>
+                <w:szCs w:val="22"/>
+                <w:rtl/>
+              </w:rPr>
+              <w:t xml:space="preserve"> الدقيق </w:t>
+            </w:r>
+            <w:r>
+              <w:rPr>
+                <w:rFonts w:ascii="Arial" w:hAnsi="Arial" w:cs="Arial"/>
+                <w:sz w:val="22"/>
+                <w:szCs w:val="22"/>
+              </w:rPr>
+              <w:t xml:space="preserve">[26]</w:t>
+            </w:r>
+            <w:r>
+              <w:rPr>
+                <w:rFonts w:ascii="Arial" w:hAnsi="Arial" w:cs="Arial"/>
+                <w:sz w:val="22"/>
+                <w:szCs w:val="22"/>
+                <w:rtl/>
+              </w:rPr>
+              <w:t xml:space="preserve">، وأدوات مثل </w:t>
             </w:r>
             <w:r>
               <w:rPr>
@@ -6904,7 +6921,7 @@
                 <w:szCs w:val="22"/>
                 <w:rtl/>
               </w:rPr>
-              <w:t xml:space="preserve">، أما المُحسِّن فلا. وفكرة «الدرع» في التعلم المعزز الآمن </w:t>
+              <w:t xml:space="preserve"> بديل معروف لذلك. وفكرة «الدرع» في التعلم المعزز الآمن </w:t>
             </w:r>
             <w:r>
               <w:rPr>
@@ -10988,7 +11005,7 @@
                 <w:szCs w:val="22"/>
                 <w:rtl/>
               </w:rPr>
-              <w:t xml:space="preserve">، والاختبار الأعمى)، فتاريخ كل خطوة مثبت في سجل المستودع.</w:t>
+              <w:t xml:space="preserve">، والاختبار الأعمى المسجّل الذي يُنفَّذ في نوفمبر)، فتاريخ كل خطوة مثبت في سجل المستودع.</w:t>
             </w:r>
           </w:p>
           <w:p>
@@ -12019,24 +12036,41 @@
                       <w:szCs w:val="19"/>
                       <w:rtl/>
                     </w:rPr>
-                    <w:t xml:space="preserve"> حادثة </w:t>
-                  </w:r>
-                  <w:r>
-                    <w:rPr>
-                      <w:rFonts w:ascii="Arial" w:hAnsi="Arial" w:cs="Arial"/>
-                      <w:sz w:val="19"/>
-                      <w:szCs w:val="19"/>
-                    </w:rPr>
-                    <w:t xml:space="preserve">2013–2026 (223</w:t>
-                  </w:r>
-                  <w:r>
-                    <w:rPr>
-                      <w:rFonts w:ascii="Arial" w:hAnsi="Arial" w:cs="Arial"/>
-                      <w:sz w:val="19"/>
-                      <w:szCs w:val="19"/>
-                      <w:rtl/>
-                    </w:rPr>
-                    <w:t xml:space="preserve"> لحظة)</w:t>
+                    <w:t xml:space="preserve"> حادثة: </w:t>
+                  </w:r>
+                  <w:r>
+                    <w:rPr>
+                      <w:rFonts w:ascii="Arial" w:hAnsi="Arial" w:cs="Arial"/>
+                      <w:sz w:val="19"/>
+                      <w:szCs w:val="19"/>
+                    </w:rPr>
+                    <w:t xml:space="preserve">16</w:t>
+                  </w:r>
+                  <w:r>
+                    <w:rPr>
+                      <w:rFonts w:ascii="Arial" w:hAnsi="Arial" w:cs="Arial"/>
+                      <w:sz w:val="19"/>
+                      <w:szCs w:val="19"/>
+                      <w:rtl/>
+                    </w:rPr>
+                    <w:t xml:space="preserve"> لحظة داخل العينة + </w:t>
+                  </w:r>
+                  <w:r>
+                    <w:rPr>
+                      <w:rFonts w:ascii="Arial" w:hAnsi="Arial" w:cs="Arial"/>
+                      <w:sz w:val="19"/>
+                      <w:szCs w:val="19"/>
+                    </w:rPr>
+                    <w:t xml:space="preserve">207</w:t>
+                  </w:r>
+                  <w:r>
+                    <w:rPr>
+                      <w:rFonts w:ascii="Arial" w:hAnsi="Arial" w:cs="Arial"/>
+                      <w:sz w:val="19"/>
+                      <w:szCs w:val="19"/>
+                      <w:rtl/>
+                    </w:rPr>
+                    <w:t xml:space="preserve"> خارجها</w:t>
                   </w:r>
                 </w:p>
               </w:tc>
@@ -25773,9 +25807,17 @@
                       <w:rFonts w:ascii="Arial" w:hAnsi="Arial" w:cs="Arial"/>
                       <w:sz w:val="19"/>
                       <w:szCs w:val="19"/>
-                      <w:rtl/>
-                    </w:rPr>
-                    <w:t xml:space="preserve">نوفمبر </w:t>
+                    </w:rPr>
+                    <w:t xml:space="preserve">24–26</w:t>
+                  </w:r>
+                  <w:r>
+                    <w:rPr>
+                      <w:rFonts w:ascii="Arial" w:hAnsi="Arial" w:cs="Arial"/>
+                      <w:sz w:val="19"/>
+                      <w:szCs w:val="19"/>
+                      <w:rtl/>
+                    </w:rPr>
+                    <w:t xml:space="preserve"> نوفمبر </w:t>
                   </w:r>
                   <w:r>
                     <w:rPr>
@@ -25810,32 +25852,7 @@
                       <w:szCs w:val="19"/>
                       <w:rtl/>
                     </w:rPr>
-                    <w:t xml:space="preserve">هدف مسجّل: زمن القطع الحقيقي &lt; </w:t>
-                  </w:r>
-                  <w:r>
-                    <w:rPr>
-                      <w:rFonts w:ascii="Arial" w:hAnsi="Arial" w:cs="Arial"/>
-                      <w:sz w:val="19"/>
-                      <w:szCs w:val="19"/>
-                    </w:rPr>
-                    <w:t xml:space="preserve">50</w:t>
-                  </w:r>
-                  <w:r>
-                    <w:rPr>
-                      <w:rFonts w:ascii="Arial" w:hAnsi="Arial" w:cs="Arial"/>
-                      <w:sz w:val="19"/>
-                      <w:szCs w:val="19"/>
-                      <w:rtl/>
-                    </w:rPr>
-                    <w:t xml:space="preserve"> مللي ثانية (</w:t>
-                  </w:r>
-                  <w:r>
-                    <w:rPr>
-                      <w:rFonts w:ascii="Arial" w:hAnsi="Arial" w:cs="Arial"/>
-                      <w:sz w:val="19"/>
-                      <w:szCs w:val="19"/>
-                    </w:rPr>
-                    <w:t xml:space="preserve">nftables)</w:t>
+                    <w:t xml:space="preserve">عرض حي في معرض سيف</w:t>
                   </w:r>
                 </w:p>
               </w:tc>
@@ -25862,7 +25879,7 @@
                       <w:szCs w:val="19"/>
                       <w:rtl/>
                     </w:rPr>
-                    <w:t xml:space="preserve">المنزل؛ حاسوب شخصي</w:t>
+                    <w:t xml:space="preserve">الرياض؛ حاسوبان</w:t>
                   </w:r>
                 </w:p>
               </w:tc>
@@ -25892,17 +25909,9 @@
                       <w:rFonts w:ascii="Arial" w:hAnsi="Arial" w:cs="Arial"/>
                       <w:sz w:val="19"/>
                       <w:szCs w:val="19"/>
-                    </w:rPr>
-                    <w:t xml:space="preserve">24–26</w:t>
-                  </w:r>
-                  <w:r>
-                    <w:rPr>
-                      <w:rFonts w:ascii="Arial" w:hAnsi="Arial" w:cs="Arial"/>
-                      <w:sz w:val="19"/>
-                      <w:szCs w:val="19"/>
-                      <w:rtl/>
-                    </w:rPr>
-                    <w:t xml:space="preserve"> نوفمبر </w:t>
+                      <w:rtl/>
+                    </w:rPr>
+                    <w:t xml:space="preserve">ديسمبر </w:t>
                   </w:r>
                   <w:r>
                     <w:rPr>
@@ -25937,101 +25946,41 @@
                       <w:szCs w:val="19"/>
                       <w:rtl/>
                     </w:rPr>
-                    <w:t xml:space="preserve">عرض حي في معرض سيف</w:t>
-                  </w:r>
-                </w:p>
-              </w:tc>
-              <w:tc>
-                <w:tcPr>
-                  <w:tcW w:w="2251" w:type="dxa"/>
-                </w:tcPr>
-                <w:p>
-                  <w:pPr>
-                    <w:bidi/>
-                    <w:spacing w:after="0" w:line="300" w:lineRule="auto"/>
-                    <w:jc w:val="start"/>
-                    <w:rPr>
-                      <w:rFonts w:ascii="Arial" w:hAnsi="Arial" w:cs="Arial"/>
-                      <w:sz w:val="19"/>
-                      <w:szCs w:val="19"/>
-                      <w:rtl/>
-                    </w:rPr>
-                  </w:pPr>
-                  <w:r>
-                    <w:rPr>
-                      <w:rFonts w:ascii="Arial" w:hAnsi="Arial" w:cs="Arial"/>
-                      <w:sz w:val="19"/>
-                      <w:szCs w:val="19"/>
-                      <w:rtl/>
-                    </w:rPr>
-                    <w:t xml:space="preserve">الرياض؛ حاسوبان</w:t>
-                  </w:r>
-                </w:p>
-              </w:tc>
-            </w:tr>
-            <w:tr>
-              <w:trPr>
-                <w:cantSplit/>
-              </w:trPr>
-              <w:tc>
-                <w:tcPr>
-                  <w:tcW w:w="1957" w:type="dxa"/>
-                </w:tcPr>
-                <w:p>
-                  <w:pPr>
-                    <w:bidi/>
-                    <w:spacing w:after="0" w:line="300" w:lineRule="auto"/>
-                    <w:jc w:val="start"/>
-                    <w:rPr>
-                      <w:rFonts w:ascii="Arial" w:hAnsi="Arial" w:cs="Arial"/>
-                      <w:sz w:val="19"/>
-                      <w:szCs w:val="19"/>
-                      <w:rtl/>
-                    </w:rPr>
-                  </w:pPr>
-                  <w:r>
-                    <w:rPr>
-                      <w:rFonts w:ascii="Arial" w:hAnsi="Arial" w:cs="Arial"/>
-                      <w:sz w:val="19"/>
-                      <w:szCs w:val="19"/>
-                      <w:rtl/>
-                    </w:rPr>
-                    <w:t xml:space="preserve">ديسمبر </w:t>
-                  </w:r>
-                  <w:r>
-                    <w:rPr>
-                      <w:rFonts w:ascii="Arial" w:hAnsi="Arial" w:cs="Arial"/>
-                      <w:sz w:val="19"/>
-                      <w:szCs w:val="19"/>
-                    </w:rPr>
-                    <w:t xml:space="preserve">2026</w:t>
-                  </w:r>
-                </w:p>
-              </w:tc>
-              <w:tc>
-                <w:tcPr>
-                  <w:tcW w:w="5090" w:type="dxa"/>
-                </w:tcPr>
-                <w:p>
-                  <w:pPr>
-                    <w:bidi/>
-                    <w:spacing w:after="0" w:line="300" w:lineRule="auto"/>
-                    <w:jc w:val="start"/>
-                    <w:rPr>
-                      <w:rFonts w:ascii="Arial" w:hAnsi="Arial" w:cs="Arial"/>
-                      <w:sz w:val="19"/>
-                      <w:szCs w:val="19"/>
-                      <w:rtl/>
-                    </w:rPr>
-                  </w:pPr>
-                  <w:r>
-                    <w:rPr>
-                      <w:rFonts w:ascii="Arial" w:hAnsi="Arial" w:cs="Arial"/>
-                      <w:sz w:val="19"/>
-                      <w:szCs w:val="19"/>
-                      <w:rtl/>
-                    </w:rPr>
-                    <w:t xml:space="preserve">أهداف مسجّلة: </w:t>
+                    <w:t xml:space="preserve">أهداف مسجّلة: زمن القطع الحقيقي &lt; </w:t>
+                  </w:r>
+                  <w:r>
+                    <w:rPr>
+                      <w:rFonts w:ascii="Arial" w:hAnsi="Arial" w:cs="Arial"/>
+                      <w:sz w:val="19"/>
+                      <w:szCs w:val="19"/>
+                    </w:rPr>
+                    <w:t xml:space="preserve">50</w:t>
+                  </w:r>
+                  <w:r>
+                    <w:rPr>
+                      <w:rFonts w:ascii="Arial" w:hAnsi="Arial" w:cs="Arial"/>
+                      <w:sz w:val="19"/>
+                      <w:szCs w:val="19"/>
+                      <w:rtl/>
+                    </w:rPr>
+                    <w:t xml:space="preserve"> مللي ثانية (</w:t>
+                  </w:r>
+                  <w:r>
+                    <w:rPr>
+                      <w:rFonts w:ascii="Arial" w:hAnsi="Arial" w:cs="Arial"/>
+                      <w:sz w:val="19"/>
+                      <w:szCs w:val="19"/>
+                    </w:rPr>
+                    <w:t xml:space="preserve">nftables)</w:t>
+                  </w:r>
+                  <w:r>
+                    <w:rPr>
+                      <w:rFonts w:ascii="Arial" w:hAnsi="Arial" w:cs="Arial"/>
+                      <w:sz w:val="19"/>
+                      <w:szCs w:val="19"/>
+                      <w:rtl/>
+                    </w:rPr>
+                    <w:t xml:space="preserve">، و</w:t>
                   </w:r>
                   <w:r>
                     <w:rPr>
@@ -26065,7 +26014,7 @@
                       <w:szCs w:val="19"/>
                       <w:rtl/>
                     </w:rPr>
-                    <w:t xml:space="preserve"> مللي ثانية، والمصنع ≥ </w:t>
+                    <w:t xml:space="preserve">، والمصنع ≥ </w:t>
                   </w:r>
                   <w:r>
                     <w:rPr>

</xml_diff>

<commit_message>
form v20: describe 75-case corpus accurately (incidents + published emulation plans), moments not incidents
Co-Authored-By: Claude Opus 5.5 <noreply@anthropic.com>
Claude-Session: https://claude.ai/code/session_011J2KrGUp2npQo9Tosx1KRc
</commit_message>
<xml_diff>
--- a/docs/qacrs/form_drafts/IBDAA_2027_FORM_ACRS_v20.docx
+++ b/docs/qacrs/form_drafts/IBDAA_2027_FORM_ACRS_v20.docx
@@ -3150,7 +3150,24 @@
                 <w:szCs w:val="22"/>
                 <w:rtl/>
               </w:rPr>
-              <w:t xml:space="preserve"> حادثة حقيقية موثقة (</w:t>
+              <w:t xml:space="preserve"> حالة من تقارير منشورة (حوادث حقيقية وخطط محاكاة هجمات، حوّلها نموذج ذكاء اصطناعي، فنعدّها تجريبية) احتوى تلقائيًا </w:t>
+            </w:r>
+            <w:r>
+              <w:rPr>
+                <w:rFonts w:ascii="Arial" w:hAnsi="Arial" w:cs="Arial"/>
+                <w:sz w:val="22"/>
+                <w:szCs w:val="22"/>
+              </w:rPr>
+              <w:t xml:space="preserve">91%</w:t>
+            </w:r>
+            <w:r>
+              <w:rPr>
+                <w:rFonts w:ascii="Arial" w:hAnsi="Arial" w:cs="Arial"/>
+                <w:sz w:val="22"/>
+                <w:szCs w:val="22"/>
+                <w:rtl/>
+              </w:rPr>
+              <w:t xml:space="preserve"> من </w:t>
             </w:r>
             <w:r>
               <w:rPr>
@@ -3167,24 +3184,7 @@
                 <w:szCs w:val="22"/>
                 <w:rtl/>
               </w:rPr>
-              <w:t xml:space="preserve"> لحظات اكتشاف، حوّلها نموذج ذكاء اصطناعي من تقاريرها العامة، فنعدّها تجريبية) احتوى تلقائيًا </w:t>
-            </w:r>
-            <w:r>
-              <w:rPr>
-                <w:rFonts w:ascii="Arial" w:hAnsi="Arial" w:cs="Arial"/>
-                <w:sz w:val="22"/>
-                <w:szCs w:val="22"/>
-              </w:rPr>
-              <w:t xml:space="preserve">91%</w:t>
-            </w:r>
-            <w:r>
-              <w:rPr>
-                <w:rFonts w:ascii="Arial" w:hAnsi="Arial" w:cs="Arial"/>
-                <w:sz w:val="22"/>
-                <w:szCs w:val="22"/>
-                <w:rtl/>
-              </w:rPr>
-              <w:t xml:space="preserve">، وأوقف </w:t>
+              <w:t xml:space="preserve"> لحظات اكتشاف، وأوقف </w:t>
             </w:r>
             <w:r>
               <w:rPr>
@@ -13845,16 +13845,33 @@
                 <w:sz w:val="22"/>
                 <w:szCs w:val="22"/>
               </w:rPr>
-              <w:t xml:space="preserve">75 (207</w:t>
-            </w:r>
-            <w:r>
-              <w:rPr>
-                <w:rFonts w:ascii="Arial" w:hAnsi="Arial" w:cs="Arial"/>
-                <w:sz w:val="22"/>
-                <w:szCs w:val="22"/>
-                <w:rtl/>
-              </w:rPr>
-              <w:t xml:space="preserve"> لحظات). والمحوّل نموذج ذكاء اصطناعي لا إنسان، وهذا قيد معلن.</w:t>
+              <w:t xml:space="preserve">75</w:t>
+            </w:r>
+            <w:r>
+              <w:rPr>
+                <w:rFonts w:ascii="Arial" w:hAnsi="Arial" w:cs="Arial"/>
+                <w:sz w:val="22"/>
+                <w:szCs w:val="22"/>
+                <w:rtl/>
+              </w:rPr>
+              <w:t xml:space="preserve"> حالة (</w:t>
+            </w:r>
+            <w:r>
+              <w:rPr>
+                <w:rFonts w:ascii="Arial" w:hAnsi="Arial" w:cs="Arial"/>
+                <w:sz w:val="22"/>
+                <w:szCs w:val="22"/>
+              </w:rPr>
+              <w:t xml:space="preserve">207</w:t>
+            </w:r>
+            <w:r>
+              <w:rPr>
+                <w:rFonts w:ascii="Arial" w:hAnsi="Arial" w:cs="Arial"/>
+                <w:sz w:val="22"/>
+                <w:szCs w:val="22"/>
+                <w:rtl/>
+              </w:rPr>
+              <w:t xml:space="preserve"> لحظات، منها خطط محاكاة خصوم منشورة). والمحوّل نموذج ذكاء اصطناعي لا إنسان، وهذا قيد معلن.</w:t>
             </w:r>
           </w:p>
           <w:p>
@@ -16099,7 +16116,7 @@
                 <w:szCs w:val="22"/>
                 <w:rtl/>
               </w:rPr>
-              <w:t xml:space="preserve"> حادثة حقيقية، دون أي قرار غير آمن.</w:t>
+              <w:t xml:space="preserve"> حالة من تقارير منشورة، دون أي قرار غير آمن.</w:t>
             </w:r>
           </w:p>
           <w:p>
@@ -16415,7 +16432,7 @@
                       <w:szCs w:val="19"/>
                       <w:rtl/>
                     </w:rPr>
-                    <w:t xml:space="preserve">؛ حقيقية </w:t>
+                    <w:t xml:space="preserve">؛ التقارير المنشورة: احتواء تلقائي </w:t>
                   </w:r>
                   <w:r>
                     <w:rPr>
@@ -20092,7 +20109,7 @@
                       <w:szCs w:val="19"/>
                       <w:rtl/>
                     </w:rPr>
-                    <w:t xml:space="preserve"> حادثة جديدة </w:t>
+                    <w:t xml:space="preserve"> حالة جديدة من تقارير </w:t>
                   </w:r>
                   <w:r>
                     <w:rPr>
@@ -25302,7 +25319,7 @@
                 <w:szCs w:val="22"/>
                 <w:rtl/>
               </w:rPr>
-              <w:t xml:space="preserve"> حادثة حقيقية و</w:t>
+              <w:t xml:space="preserve"> حالة من تقارير منشورة و</w:t>
             </w:r>
             <w:r>
               <w:rPr>

</xml_diff>

<commit_message>
form v20: rewrite abstract, Wazuh-style baseline as numeric comparison, clearer H1/H5/factory verdicts, Table 1 note
Co-Authored-By: Claude Opus 5.5 <noreply@anthropic.com>
Claude-Session: https://claude.ai/code/session_011J2KrGUp2npQo9Tosx1KRc
</commit_message>
<xml_diff>
--- a/docs/qacrs/form_drafts/IBDAA_2027_FORM_ACRS_v20.docx
+++ b/docs/qacrs/form_drafts/IBDAA_2027_FORM_ACRS_v20.docx
@@ -3008,7 +3008,27 @@
                 <w:szCs w:val="22"/>
                 <w:rtl/>
               </w:rPr>
-              <w:t xml:space="preserve">–  على </w:t>
+              <w:t xml:space="preserve">–  </w:t>
+            </w:r>
+            <w:r>
+              <w:rPr>
+                <w:rFonts w:ascii="Arial" w:hAnsi="Arial" w:cs="Arial"/>
+                <w:b/>
+                <w:bCs/>
+                <w:sz w:val="22"/>
+                <w:szCs w:val="22"/>
+                <w:rtl/>
+              </w:rPr>
+              <w:t xml:space="preserve">احتواء مع بقاء الخدمات:</w:t>
+            </w:r>
+            <w:r>
+              <w:rPr>
+                <w:rFonts w:ascii="Arial" w:hAnsi="Arial" w:cs="Arial"/>
+                <w:sz w:val="22"/>
+                <w:szCs w:val="22"/>
+                <w:rtl/>
+              </w:rPr>
+              <w:t xml:space="preserve"> على </w:t>
             </w:r>
             <w:r>
               <w:rPr>
@@ -3059,7 +3079,41 @@
                 <w:szCs w:val="22"/>
                 <w:rtl/>
               </w:rPr>
-              <w:t xml:space="preserve">، وعلى </w:t>
+              <w:t xml:space="preserve">. وبعد موافقة البشر على كل تصعيد أوقفت نسخته النهائية </w:t>
+            </w:r>
+            <w:r>
+              <w:rPr>
+                <w:rFonts w:ascii="Arial" w:hAnsi="Arial" w:cs="Arial"/>
+                <w:sz w:val="22"/>
+                <w:szCs w:val="22"/>
+              </w:rPr>
+              <w:t xml:space="preserve">6</w:t>
+            </w:r>
+            <w:r>
+              <w:rPr>
+                <w:rFonts w:ascii="Arial" w:hAnsi="Arial" w:cs="Arial"/>
+                <w:sz w:val="22"/>
+                <w:szCs w:val="22"/>
+                <w:rtl/>
+              </w:rPr>
+              <w:t xml:space="preserve"> خدمات مقابل </w:t>
+            </w:r>
+            <w:r>
+              <w:rPr>
+                <w:rFonts w:ascii="Arial" w:hAnsi="Arial" w:cs="Arial"/>
+                <w:sz w:val="22"/>
+                <w:szCs w:val="22"/>
+              </w:rPr>
+              <w:t xml:space="preserve">273</w:t>
+            </w:r>
+            <w:r>
+              <w:rPr>
+                <w:rFonts w:ascii="Arial" w:hAnsi="Arial" w:cs="Arial"/>
+                <w:sz w:val="22"/>
+                <w:szCs w:val="22"/>
+                <w:rtl/>
+              </w:rPr>
+              <w:t xml:space="preserve"> للعزل الكامل على </w:t>
             </w:r>
             <w:r>
               <w:rPr>
@@ -3076,41 +3130,58 @@
                 <w:szCs w:val="22"/>
                 <w:rtl/>
               </w:rPr>
-              <w:t xml:space="preserve"> سلسلة أخرى أوقفت نسخته النهائية </w:t>
-            </w:r>
-            <w:r>
-              <w:rPr>
-                <w:rFonts w:ascii="Arial" w:hAnsi="Arial" w:cs="Arial"/>
-                <w:sz w:val="22"/>
-                <w:szCs w:val="22"/>
-              </w:rPr>
-              <w:t xml:space="preserve">6</w:t>
-            </w:r>
-            <w:r>
-              <w:rPr>
-                <w:rFonts w:ascii="Arial" w:hAnsi="Arial" w:cs="Arial"/>
-                <w:sz w:val="22"/>
-                <w:szCs w:val="22"/>
-                <w:rtl/>
-              </w:rPr>
-              <w:t xml:space="preserve"> خدمات مقابل </w:t>
-            </w:r>
-            <w:r>
-              <w:rPr>
-                <w:rFonts w:ascii="Arial" w:hAnsi="Arial" w:cs="Arial"/>
-                <w:sz w:val="22"/>
-                <w:szCs w:val="22"/>
-              </w:rPr>
-              <w:t xml:space="preserve">273</w:t>
-            </w:r>
-            <w:r>
-              <w:rPr>
-                <w:rFonts w:ascii="Arial" w:hAnsi="Arial" w:cs="Arial"/>
-                <w:sz w:val="22"/>
-                <w:szCs w:val="22"/>
-                <w:rtl/>
-              </w:rPr>
-              <w:t xml:space="preserve"> للعزل الكامل.</w:t>
+              <w:t xml:space="preserve"> سلسلة أخرى، و</w:t>
+            </w:r>
+            <w:r>
+              <w:rPr>
+                <w:rFonts w:ascii="Arial" w:hAnsi="Arial" w:cs="Arial"/>
+                <w:sz w:val="22"/>
+                <w:szCs w:val="22"/>
+              </w:rPr>
+              <w:t xml:space="preserve">70</w:t>
+            </w:r>
+            <w:r>
+              <w:rPr>
+                <w:rFonts w:ascii="Arial" w:hAnsi="Arial" w:cs="Arial"/>
+                <w:sz w:val="22"/>
+                <w:szCs w:val="22"/>
+                <w:rtl/>
+              </w:rPr>
+              <w:t xml:space="preserve"> مقابل </w:t>
+            </w:r>
+            <w:r>
+              <w:rPr>
+                <w:rFonts w:ascii="Arial" w:hAnsi="Arial" w:cs="Arial"/>
+                <w:sz w:val="22"/>
+                <w:szCs w:val="22"/>
+              </w:rPr>
+              <w:t xml:space="preserve">268</w:t>
+            </w:r>
+            <w:r>
+              <w:rPr>
+                <w:rFonts w:ascii="Arial" w:hAnsi="Arial" w:cs="Arial"/>
+                <w:sz w:val="22"/>
+                <w:szCs w:val="22"/>
+                <w:rtl/>
+              </w:rPr>
+              <w:t xml:space="preserve"> على </w:t>
+            </w:r>
+            <w:r>
+              <w:rPr>
+                <w:rFonts w:ascii="Arial" w:hAnsi="Arial" w:cs="Arial"/>
+                <w:sz w:val="22"/>
+                <w:szCs w:val="22"/>
+              </w:rPr>
+              <w:t xml:space="preserve">75</w:t>
+            </w:r>
+            <w:r>
+              <w:rPr>
+                <w:rFonts w:ascii="Arial" w:hAnsi="Arial" w:cs="Arial"/>
+                <w:sz w:val="22"/>
+                <w:szCs w:val="22"/>
+                <w:rtl/>
+              </w:rPr>
+              <w:t xml:space="preserve"> حالة من تقارير منشورة (حوادث حقيقية وخطط محاكاة هجمات حوّلها نموذج ذكاء اصطناعي، فنعدّها تجريبية).</w:t>
             </w:r>
           </w:p>
           <w:p>
@@ -3133,92 +3204,129 @@
                 <w:szCs w:val="22"/>
                 <w:rtl/>
               </w:rPr>
-              <w:t xml:space="preserve">–  على </w:t>
-            </w:r>
-            <w:r>
-              <w:rPr>
-                <w:rFonts w:ascii="Arial" w:hAnsi="Arial" w:cs="Arial"/>
-                <w:sz w:val="22"/>
-                <w:szCs w:val="22"/>
-              </w:rPr>
-              <w:t xml:space="preserve">75</w:t>
-            </w:r>
-            <w:r>
-              <w:rPr>
-                <w:rFonts w:ascii="Arial" w:hAnsi="Arial" w:cs="Arial"/>
-                <w:sz w:val="22"/>
-                <w:szCs w:val="22"/>
-                <w:rtl/>
-              </w:rPr>
-              <w:t xml:space="preserve"> حالة من تقارير منشورة (حوادث حقيقية وخطط محاكاة هجمات، حوّلها نموذج ذكاء اصطناعي، فنعدّها تجريبية) احتوى تلقائيًا </w:t>
-            </w:r>
-            <w:r>
-              <w:rPr>
-                <w:rFonts w:ascii="Arial" w:hAnsi="Arial" w:cs="Arial"/>
-                <w:sz w:val="22"/>
-                <w:szCs w:val="22"/>
-              </w:rPr>
-              <w:t xml:space="preserve">91%</w:t>
-            </w:r>
-            <w:r>
-              <w:rPr>
-                <w:rFonts w:ascii="Arial" w:hAnsi="Arial" w:cs="Arial"/>
-                <w:sz w:val="22"/>
-                <w:szCs w:val="22"/>
-                <w:rtl/>
-              </w:rPr>
-              <w:t xml:space="preserve"> من </w:t>
-            </w:r>
-            <w:r>
-              <w:rPr>
-                <w:rFonts w:ascii="Arial" w:hAnsi="Arial" w:cs="Arial"/>
-                <w:sz w:val="22"/>
-                <w:szCs w:val="22"/>
-              </w:rPr>
-              <w:t xml:space="preserve">207</w:t>
-            </w:r>
-            <w:r>
-              <w:rPr>
-                <w:rFonts w:ascii="Arial" w:hAnsi="Arial" w:cs="Arial"/>
-                <w:sz w:val="22"/>
-                <w:szCs w:val="22"/>
-                <w:rtl/>
-              </w:rPr>
-              <w:t xml:space="preserve"> لحظات اكتشاف، وأوقف </w:t>
-            </w:r>
-            <w:r>
-              <w:rPr>
-                <w:rFonts w:ascii="Arial" w:hAnsi="Arial" w:cs="Arial"/>
-                <w:sz w:val="22"/>
-                <w:szCs w:val="22"/>
-              </w:rPr>
-              <w:t xml:space="preserve">70</w:t>
-            </w:r>
-            <w:r>
-              <w:rPr>
-                <w:rFonts w:ascii="Arial" w:hAnsi="Arial" w:cs="Arial"/>
-                <w:sz w:val="22"/>
-                <w:szCs w:val="22"/>
-                <w:rtl/>
-              </w:rPr>
-              <w:t xml:space="preserve"> خدمة مقابل </w:t>
-            </w:r>
-            <w:r>
-              <w:rPr>
-                <w:rFonts w:ascii="Arial" w:hAnsi="Arial" w:cs="Arial"/>
-                <w:sz w:val="22"/>
-                <w:szCs w:val="22"/>
-              </w:rPr>
-              <w:t xml:space="preserve">268</w:t>
-            </w:r>
-            <w:r>
-              <w:rPr>
-                <w:rFonts w:ascii="Arial" w:hAnsi="Arial" w:cs="Arial"/>
-                <w:sz w:val="22"/>
-                <w:szCs w:val="22"/>
-                <w:rtl/>
-              </w:rPr>
-              <w:t xml:space="preserve"> للعزل الكامل.</w:t>
+              <w:t xml:space="preserve">–  </w:t>
+            </w:r>
+            <w:r>
+              <w:rPr>
+                <w:rFonts w:ascii="Arial" w:hAnsi="Arial" w:cs="Arial"/>
+                <w:b/>
+                <w:bCs/>
+                <w:sz w:val="22"/>
+                <w:szCs w:val="22"/>
+                <w:rtl/>
+              </w:rPr>
+              <w:t xml:space="preserve">سلامة مثبتة:</w:t>
+            </w:r>
+            <w:r>
+              <w:rPr>
+                <w:rFonts w:ascii="Arial" w:hAnsi="Arial" w:cs="Arial"/>
+                <w:sz w:val="22"/>
+                <w:szCs w:val="22"/>
+                <w:rtl/>
+              </w:rPr>
+              <w:t xml:space="preserve"> </w:t>
+            </w:r>
+            <w:r>
+              <w:rPr>
+                <w:rFonts w:ascii="Arial" w:hAnsi="Arial" w:cs="Arial"/>
+                <w:sz w:val="22"/>
+                <w:szCs w:val="22"/>
+              </w:rPr>
+              <w:t xml:space="preserve">0</w:t>
+            </w:r>
+            <w:r>
+              <w:rPr>
+                <w:rFonts w:ascii="Arial" w:hAnsi="Arial" w:cs="Arial"/>
+                <w:sz w:val="22"/>
+                <w:szCs w:val="22"/>
+                <w:rtl/>
+              </w:rPr>
+              <w:t xml:space="preserve"> قرارات غير آمنة في كل المجموعات؛ وخمس خصائص سلامة مثبتة رياضيًا على خمس شبكات اختبار (بعد إصلاح معلن لطبقة التنفيذ)؛ وتطابق التنفيذ في جدار حماية </w:t>
+            </w:r>
+            <w:r>
+              <w:rPr>
+                <w:rFonts w:ascii="Arial" w:hAnsi="Arial" w:cs="Arial"/>
+                <w:sz w:val="22"/>
+                <w:szCs w:val="22"/>
+              </w:rPr>
+              <w:t xml:space="preserve">Linux</w:t>
+            </w:r>
+            <w:r>
+              <w:rPr>
+                <w:rFonts w:ascii="Arial" w:hAnsi="Arial" w:cs="Arial"/>
+                <w:sz w:val="22"/>
+                <w:szCs w:val="22"/>
+                <w:rtl/>
+              </w:rPr>
+              <w:t xml:space="preserve"> حقيقي مع النموذج في </w:t>
+            </w:r>
+            <w:r>
+              <w:rPr>
+                <w:rFonts w:ascii="Arial" w:hAnsi="Arial" w:cs="Arial"/>
+                <w:sz w:val="22"/>
+                <w:szCs w:val="22"/>
+              </w:rPr>
+              <w:t xml:space="preserve">6,002</w:t>
+            </w:r>
+            <w:r>
+              <w:rPr>
+                <w:rFonts w:ascii="Arial" w:hAnsi="Arial" w:cs="Arial"/>
+                <w:sz w:val="22"/>
+                <w:szCs w:val="22"/>
+                <w:rtl/>
+              </w:rPr>
+              <w:t xml:space="preserve"> فحص؛ ولم تستطع تنبيهات مزوّرة على </w:t>
+            </w:r>
+            <w:r>
+              <w:rPr>
+                <w:rFonts w:ascii="Arial" w:hAnsi="Arial" w:cs="Arial"/>
+                <w:sz w:val="22"/>
+                <w:szCs w:val="22"/>
+              </w:rPr>
+              <w:t xml:space="preserve">1–3</w:t>
+            </w:r>
+            <w:r>
+              <w:rPr>
+                <w:rFonts w:ascii="Arial" w:hAnsi="Arial" w:cs="Arial"/>
+                <w:sz w:val="22"/>
+                <w:szCs w:val="22"/>
+                <w:rtl/>
+              </w:rPr>
+              <w:t xml:space="preserve"> أجهزة (شبكتا </w:t>
+            </w:r>
+            <w:r>
+              <w:rPr>
+                <w:rFonts w:ascii="Arial" w:hAnsi="Arial" w:cs="Arial"/>
+                <w:sz w:val="22"/>
+                <w:szCs w:val="22"/>
+              </w:rPr>
+              <w:t xml:space="preserve">12</w:t>
+            </w:r>
+            <w:r>
+              <w:rPr>
+                <w:rFonts w:ascii="Arial" w:hAnsi="Arial" w:cs="Arial"/>
+                <w:sz w:val="22"/>
+                <w:szCs w:val="22"/>
+                <w:rtl/>
+              </w:rPr>
+              <w:t xml:space="preserve"> و</w:t>
+            </w:r>
+            <w:r>
+              <w:rPr>
+                <w:rFonts w:ascii="Arial" w:hAnsi="Arial" w:cs="Arial"/>
+                <w:sz w:val="22"/>
+                <w:szCs w:val="22"/>
+              </w:rPr>
+              <w:t xml:space="preserve">22)</w:t>
+            </w:r>
+            <w:r>
+              <w:rPr>
+                <w:rFonts w:ascii="Arial" w:hAnsi="Arial" w:cs="Arial"/>
+                <w:sz w:val="22"/>
+                <w:szCs w:val="22"/>
+                <w:rtl/>
+              </w:rPr>
+              <w:t xml:space="preserve"> إيقاف أي خدمة.</w:t>
             </w:r>
           </w:p>
           <w:p>
@@ -3241,58 +3349,112 @@
                 <w:szCs w:val="22"/>
                 <w:rtl/>
               </w:rPr>
-              <w:t xml:space="preserve">–  لم يتخذ أي قرار غير آمن في أي مجموعة، ولم تستطع تنبيهات مزوّرة على </w:t>
-            </w:r>
-            <w:r>
-              <w:rPr>
-                <w:rFonts w:ascii="Arial" w:hAnsi="Arial" w:cs="Arial"/>
-                <w:sz w:val="22"/>
-                <w:szCs w:val="22"/>
-              </w:rPr>
-              <w:t xml:space="preserve">1–3</w:t>
-            </w:r>
-            <w:r>
-              <w:rPr>
-                <w:rFonts w:ascii="Arial" w:hAnsi="Arial" w:cs="Arial"/>
-                <w:sz w:val="22"/>
-                <w:szCs w:val="22"/>
-                <w:rtl/>
-              </w:rPr>
-              <w:t xml:space="preserve"> أجهزة (شبكتا </w:t>
-            </w:r>
-            <w:r>
-              <w:rPr>
-                <w:rFonts w:ascii="Arial" w:hAnsi="Arial" w:cs="Arial"/>
-                <w:sz w:val="22"/>
-                <w:szCs w:val="22"/>
-              </w:rPr>
-              <w:t xml:space="preserve">12</w:t>
-            </w:r>
-            <w:r>
-              <w:rPr>
-                <w:rFonts w:ascii="Arial" w:hAnsi="Arial" w:cs="Arial"/>
-                <w:sz w:val="22"/>
-                <w:szCs w:val="22"/>
-                <w:rtl/>
-              </w:rPr>
-              <w:t xml:space="preserve"> و</w:t>
-            </w:r>
-            <w:r>
-              <w:rPr>
-                <w:rFonts w:ascii="Arial" w:hAnsi="Arial" w:cs="Arial"/>
-                <w:sz w:val="22"/>
-                <w:szCs w:val="22"/>
-              </w:rPr>
-              <w:t xml:space="preserve">22</w:t>
-            </w:r>
-            <w:r>
-              <w:rPr>
-                <w:rFonts w:ascii="Arial" w:hAnsi="Arial" w:cs="Arial"/>
-                <w:sz w:val="22"/>
-                <w:szCs w:val="22"/>
-                <w:rtl/>
-              </w:rPr>
-              <w:t xml:space="preserve"> جهازًا) إجباره على إيقاف أي خدمة.</w:t>
+              <w:t xml:space="preserve">–  </w:t>
+            </w:r>
+            <w:r>
+              <w:rPr>
+                <w:rFonts w:ascii="Arial" w:hAnsi="Arial" w:cs="Arial"/>
+                <w:b/>
+                <w:bCs/>
+                <w:sz w:val="22"/>
+                <w:szCs w:val="22"/>
+                <w:rtl/>
+              </w:rPr>
+              <w:t xml:space="preserve">عتاد كمّي حقيقي:</w:t>
+            </w:r>
+            <w:r>
+              <w:rPr>
+                <w:rFonts w:ascii="Arial" w:hAnsi="Arial" w:cs="Arial"/>
+                <w:sz w:val="22"/>
+                <w:szCs w:val="22"/>
+                <w:rtl/>
+              </w:rPr>
+              <w:t xml:space="preserve"> وجدت أفضل قراءة على حاسوب </w:t>
+            </w:r>
+            <w:r>
+              <w:rPr>
+                <w:rFonts w:ascii="Arial" w:hAnsi="Arial" w:cs="Arial"/>
+                <w:sz w:val="22"/>
+                <w:szCs w:val="22"/>
+              </w:rPr>
+              <w:t xml:space="preserve">IBM</w:t>
+            </w:r>
+            <w:r>
+              <w:rPr>
+                <w:rFonts w:ascii="Arial" w:hAnsi="Arial" w:cs="Arial"/>
+                <w:sz w:val="22"/>
+                <w:szCs w:val="22"/>
+                <w:rtl/>
+              </w:rPr>
+              <w:t xml:space="preserve"> الحل الأمثل في </w:t>
+            </w:r>
+            <w:r>
+              <w:rPr>
+                <w:rFonts w:ascii="Arial" w:hAnsi="Arial" w:cs="Arial"/>
+                <w:sz w:val="22"/>
+                <w:szCs w:val="22"/>
+              </w:rPr>
+              <w:t xml:space="preserve">11</w:t>
+            </w:r>
+            <w:r>
+              <w:rPr>
+                <w:rFonts w:ascii="Arial" w:hAnsi="Arial" w:cs="Arial"/>
+                <w:sz w:val="22"/>
+                <w:szCs w:val="22"/>
+                <w:rtl/>
+              </w:rPr>
+              <w:t xml:space="preserve"> من </w:t>
+            </w:r>
+            <w:r>
+              <w:rPr>
+                <w:rFonts w:ascii="Arial" w:hAnsi="Arial" w:cs="Arial"/>
+                <w:sz w:val="22"/>
+                <w:szCs w:val="22"/>
+              </w:rPr>
+              <w:t xml:space="preserve">11</w:t>
+            </w:r>
+            <w:r>
+              <w:rPr>
+                <w:rFonts w:ascii="Arial" w:hAnsi="Arial" w:cs="Arial"/>
+                <w:sz w:val="22"/>
+                <w:szCs w:val="22"/>
+                <w:rtl/>
+              </w:rPr>
+              <w:t xml:space="preserve"> مسألة فرعية (</w:t>
+            </w:r>
+            <w:r>
+              <w:rPr>
+                <w:rFonts w:ascii="Arial" w:hAnsi="Arial" w:cs="Arial"/>
+                <w:sz w:val="22"/>
+                <w:szCs w:val="22"/>
+              </w:rPr>
+              <w:t xml:space="preserve">75</w:t>
+            </w:r>
+            <w:r>
+              <w:rPr>
+                <w:rFonts w:ascii="Arial" w:hAnsi="Arial" w:cs="Arial"/>
+                <w:sz w:val="22"/>
+                <w:szCs w:val="22"/>
+                <w:rtl/>
+              </w:rPr>
+              <w:t xml:space="preserve"> كيوبت مجتمعة) من شبكة </w:t>
+            </w:r>
+            <w:r>
+              <w:rPr>
+                <w:rFonts w:ascii="Arial" w:hAnsi="Arial" w:cs="Arial"/>
+                <w:sz w:val="22"/>
+                <w:szCs w:val="22"/>
+              </w:rPr>
+              <w:t xml:space="preserve">240</w:t>
+            </w:r>
+            <w:r>
+              <w:rPr>
+                <w:rFonts w:ascii="Arial" w:hAnsi="Arial" w:cs="Arial"/>
+                <w:sz w:val="22"/>
+                <w:szCs w:val="22"/>
+                <w:rtl/>
+              </w:rPr>
+              <w:t xml:space="preserve"> جهازًا، دون ادعاء تفوق كمّي.</w:t>
             </w:r>
           </w:p>
           <w:p>
@@ -3315,75 +3477,27 @@
                 <w:szCs w:val="22"/>
                 <w:rtl/>
               </w:rPr>
-              <w:t xml:space="preserve">–  قطع المهاجم خلال </w:t>
-            </w:r>
-            <w:r>
-              <w:rPr>
-                <w:rFonts w:ascii="Arial" w:hAnsi="Arial" w:cs="Arial"/>
-                <w:sz w:val="22"/>
-                <w:szCs w:val="22"/>
-              </w:rPr>
-              <w:t xml:space="preserve">41</w:t>
-            </w:r>
-            <w:r>
-              <w:rPr>
-                <w:rFonts w:ascii="Arial" w:hAnsi="Arial" w:cs="Arial"/>
-                <w:sz w:val="22"/>
-                <w:szCs w:val="22"/>
-                <w:rtl/>
-              </w:rPr>
-              <w:t xml:space="preserve"> مللي ثانية من صدور القرار في </w:t>
-            </w:r>
-            <w:r>
-              <w:rPr>
-                <w:rFonts w:ascii="Arial" w:hAnsi="Arial" w:cs="Arial"/>
-                <w:sz w:val="22"/>
-                <w:szCs w:val="22"/>
-              </w:rPr>
-              <w:t xml:space="preserve">95%</w:t>
-            </w:r>
-            <w:r>
-              <w:rPr>
-                <w:rFonts w:ascii="Arial" w:hAnsi="Arial" w:cs="Arial"/>
-                <w:sz w:val="22"/>
-                <w:szCs w:val="22"/>
-                <w:rtl/>
-              </w:rPr>
-              <w:t xml:space="preserve"> من الحالات التركيبية (دون هدفنا </w:t>
-            </w:r>
-            <w:r>
-              <w:rPr>
-                <w:rFonts w:ascii="Arial" w:hAnsi="Arial" w:cs="Arial"/>
-                <w:sz w:val="22"/>
-                <w:szCs w:val="22"/>
-              </w:rPr>
-              <w:t xml:space="preserve">50)</w:t>
-            </w:r>
-            <w:r>
-              <w:rPr>
-                <w:rFonts w:ascii="Arial" w:hAnsi="Arial" w:cs="Arial"/>
-                <w:sz w:val="22"/>
-                <w:szCs w:val="22"/>
-                <w:rtl/>
-              </w:rPr>
-              <w:t xml:space="preserve">، أما على </w:t>
-            </w:r>
-            <w:r>
-              <w:rPr>
-                <w:rFonts w:ascii="Arial" w:hAnsi="Arial" w:cs="Arial"/>
-                <w:sz w:val="22"/>
-                <w:szCs w:val="22"/>
-              </w:rPr>
-              <w:t xml:space="preserve">66</w:t>
-            </w:r>
-            <w:r>
-              <w:rPr>
-                <w:rFonts w:ascii="Arial" w:hAnsi="Arial" w:cs="Arial"/>
-                <w:sz w:val="22"/>
-                <w:szCs w:val="22"/>
-                <w:rtl/>
-              </w:rPr>
-              <w:t xml:space="preserve"> حالة حقيقية وواقعية فبلغ </w:t>
+              <w:t xml:space="preserve">–  </w:t>
+            </w:r>
+            <w:r>
+              <w:rPr>
+                <w:rFonts w:ascii="Arial" w:hAnsi="Arial" w:cs="Arial"/>
+                <w:b/>
+                <w:bCs/>
+                <w:sz w:val="22"/>
+                <w:szCs w:val="22"/>
+                <w:rtl/>
+              </w:rPr>
+              <w:t xml:space="preserve">ما لم يتحقق:</w:t>
+            </w:r>
+            <w:r>
+              <w:rPr>
+                <w:rFonts w:ascii="Arial" w:hAnsi="Arial" w:cs="Arial"/>
+                <w:sz w:val="22"/>
+                <w:szCs w:val="22"/>
+                <w:rtl/>
+              </w:rPr>
+              <w:t xml:space="preserve"> زمن قطع المهاجم على الحالات الحقيقية (</w:t>
             </w:r>
             <w:r>
               <w:rPr>
@@ -3400,72 +3514,66 @@
                 <w:szCs w:val="22"/>
                 <w:rtl/>
               </w:rPr>
-              <w:t xml:space="preserve"> ولم يتحقق الهدف.</w:t>
-            </w:r>
-          </w:p>
-          <w:p>
-            <w:pPr>
-              <w:bidi/>
-              <w:spacing w:after="60" w:line="300" w:lineRule="auto"/>
-              <w:ind w:start="340" w:hanging="340"/>
-              <w:jc w:val="both"/>
-              <w:rPr>
-                <w:rFonts w:ascii="Arial" w:hAnsi="Arial" w:cs="Arial"/>
-                <w:sz w:val="22"/>
-                <w:szCs w:val="22"/>
-                <w:rtl/>
-              </w:rPr>
-            </w:pPr>
-            <w:r>
-              <w:rPr>
-                <w:rFonts w:ascii="Arial" w:hAnsi="Arial" w:cs="Arial"/>
-                <w:sz w:val="22"/>
-                <w:szCs w:val="22"/>
-                <w:rtl/>
-              </w:rPr>
-              <w:t xml:space="preserve">–  عمل بالأوزان نفسها في بنك (</w:t>
-            </w:r>
-            <w:r>
-              <w:rPr>
-                <w:rFonts w:ascii="Arial" w:hAnsi="Arial" w:cs="Arial"/>
-                <w:sz w:val="22"/>
-                <w:szCs w:val="22"/>
-              </w:rPr>
-              <w:t xml:space="preserve">0.902)</w:t>
-            </w:r>
-            <w:r>
-              <w:rPr>
-                <w:rFonts w:ascii="Arial" w:hAnsi="Arial" w:cs="Arial"/>
-                <w:sz w:val="22"/>
-                <w:szCs w:val="22"/>
-                <w:rtl/>
-              </w:rPr>
-              <w:t xml:space="preserve"> وجامعة (</w:t>
-            </w:r>
-            <w:r>
-              <w:rPr>
-                <w:rFonts w:ascii="Arial" w:hAnsi="Arial" w:cs="Arial"/>
-                <w:sz w:val="22"/>
-                <w:szCs w:val="22"/>
-              </w:rPr>
-              <w:t xml:space="preserve">0.839)</w:t>
-            </w:r>
-            <w:r>
-              <w:rPr>
-                <w:rFonts w:ascii="Arial" w:hAnsi="Arial" w:cs="Arial"/>
-                <w:sz w:val="22"/>
-                <w:szCs w:val="22"/>
-                <w:rtl/>
-              </w:rPr>
-              <w:t xml:space="preserve">، ولم يبلغ الهدف في مصنع (</w:t>
-            </w:r>
-            <w:r>
-              <w:rPr>
-                <w:rFonts w:ascii="Arial" w:hAnsi="Arial" w:cs="Arial"/>
-                <w:sz w:val="22"/>
-                <w:szCs w:val="22"/>
-              </w:rPr>
-              <w:t xml:space="preserve">0.792)</w:t>
+              <w:t xml:space="preserve"> مللي ثانية مقابل هدف </w:t>
+            </w:r>
+            <w:r>
+              <w:rPr>
+                <w:rFonts w:ascii="Arial" w:hAnsi="Arial" w:cs="Arial"/>
+                <w:sz w:val="22"/>
+                <w:szCs w:val="22"/>
+              </w:rPr>
+              <w:t xml:space="preserve">50</w:t>
+            </w:r>
+            <w:r>
+              <w:rPr>
+                <w:rFonts w:ascii="Arial" w:hAnsi="Arial" w:cs="Arial"/>
+                <w:sz w:val="22"/>
+                <w:szCs w:val="22"/>
+                <w:rtl/>
+              </w:rPr>
+              <w:t xml:space="preserve">، وتحقق تركيبيًا بـ</w:t>
+            </w:r>
+            <w:r>
+              <w:rPr>
+                <w:rFonts w:ascii="Arial" w:hAnsi="Arial" w:cs="Arial"/>
+                <w:sz w:val="22"/>
+                <w:szCs w:val="22"/>
+              </w:rPr>
+              <w:t xml:space="preserve">41)</w:t>
+            </w:r>
+            <w:r>
+              <w:rPr>
+                <w:rFonts w:ascii="Arial" w:hAnsi="Arial" w:cs="Arial"/>
+                <w:sz w:val="22"/>
+                <w:szCs w:val="22"/>
+                <w:rtl/>
+              </w:rPr>
+              <w:t xml:space="preserve">، والاحتواء في شبكة مصنع (</w:t>
+            </w:r>
+            <w:r>
+              <w:rPr>
+                <w:rFonts w:ascii="Arial" w:hAnsi="Arial" w:cs="Arial"/>
+                <w:sz w:val="22"/>
+                <w:szCs w:val="22"/>
+              </w:rPr>
+              <w:t xml:space="preserve">0.792</w:t>
+            </w:r>
+            <w:r>
+              <w:rPr>
+                <w:rFonts w:ascii="Arial" w:hAnsi="Arial" w:cs="Arial"/>
+                <w:sz w:val="22"/>
+                <w:szCs w:val="22"/>
+                <w:rtl/>
+              </w:rPr>
+              <w:t xml:space="preserve"> مقابل </w:t>
+            </w:r>
+            <w:r>
+              <w:rPr>
+                <w:rFonts w:ascii="Arial" w:hAnsi="Arial" w:cs="Arial"/>
+                <w:sz w:val="22"/>
+                <w:szCs w:val="22"/>
+              </w:rPr>
+              <w:t xml:space="preserve">0.80)</w:t>
             </w:r>
             <w:r>
               <w:rPr>
@@ -3475,171 +3583,6 @@
                 <w:rtl/>
               </w:rPr>
               <w:t xml:space="preserve">.</w:t>
-            </w:r>
-          </w:p>
-          <w:p>
-            <w:pPr>
-              <w:bidi/>
-              <w:spacing w:after="60" w:line="300" w:lineRule="auto"/>
-              <w:ind w:start="340" w:hanging="340"/>
-              <w:jc w:val="both"/>
-              <w:rPr>
-                <w:rFonts w:ascii="Arial" w:hAnsi="Arial" w:cs="Arial"/>
-                <w:sz w:val="22"/>
-                <w:szCs w:val="22"/>
-                <w:rtl/>
-              </w:rPr>
-            </w:pPr>
-            <w:r>
-              <w:rPr>
-                <w:rFonts w:ascii="Arial" w:hAnsi="Arial" w:cs="Arial"/>
-                <w:sz w:val="22"/>
-                <w:szCs w:val="22"/>
-                <w:rtl/>
-              </w:rPr>
-              <w:t xml:space="preserve">–  طابق تنفيذ قراراته في جدار حماية </w:t>
-            </w:r>
-            <w:r>
-              <w:rPr>
-                <w:rFonts w:ascii="Arial" w:hAnsi="Arial" w:cs="Arial"/>
-                <w:sz w:val="22"/>
-                <w:szCs w:val="22"/>
-              </w:rPr>
-              <w:t xml:space="preserve">Linux</w:t>
-            </w:r>
-            <w:r>
-              <w:rPr>
-                <w:rFonts w:ascii="Arial" w:hAnsi="Arial" w:cs="Arial"/>
-                <w:sz w:val="22"/>
-                <w:szCs w:val="22"/>
-                <w:rtl/>
-              </w:rPr>
-              <w:t xml:space="preserve"> حقيقي ما توقعه النموذج في </w:t>
-            </w:r>
-            <w:r>
-              <w:rPr>
-                <w:rFonts w:ascii="Arial" w:hAnsi="Arial" w:cs="Arial"/>
-                <w:sz w:val="22"/>
-                <w:szCs w:val="22"/>
-              </w:rPr>
-              <w:t xml:space="preserve">6,002</w:t>
-            </w:r>
-            <w:r>
-              <w:rPr>
-                <w:rFonts w:ascii="Arial" w:hAnsi="Arial" w:cs="Arial"/>
-                <w:sz w:val="22"/>
-                <w:szCs w:val="22"/>
-                <w:rtl/>
-              </w:rPr>
-              <w:t xml:space="preserve"> فحص، وأثبتنا رياضيًا خمس خصائص سلامة لكل المدخلات على خمس شبكات اختبار.</w:t>
-            </w:r>
-          </w:p>
-          <w:p>
-            <w:pPr>
-              <w:bidi/>
-              <w:spacing w:after="60" w:line="300" w:lineRule="auto"/>
-              <w:ind w:start="340" w:hanging="340"/>
-              <w:jc w:val="both"/>
-              <w:rPr>
-                <w:rFonts w:ascii="Arial" w:hAnsi="Arial" w:cs="Arial"/>
-                <w:sz w:val="22"/>
-                <w:szCs w:val="22"/>
-                <w:rtl/>
-              </w:rPr>
-            </w:pPr>
-            <w:r>
-              <w:rPr>
-                <w:rFonts w:ascii="Arial" w:hAnsi="Arial" w:cs="Arial"/>
-                <w:sz w:val="22"/>
-                <w:szCs w:val="22"/>
-                <w:rtl/>
-              </w:rPr>
-              <w:t xml:space="preserve">–  على حاسوب </w:t>
-            </w:r>
-            <w:r>
-              <w:rPr>
-                <w:rFonts w:ascii="Arial" w:hAnsi="Arial" w:cs="Arial"/>
-                <w:sz w:val="22"/>
-                <w:szCs w:val="22"/>
-              </w:rPr>
-              <w:t xml:space="preserve">IBM</w:t>
-            </w:r>
-            <w:r>
-              <w:rPr>
-                <w:rFonts w:ascii="Arial" w:hAnsi="Arial" w:cs="Arial"/>
-                <w:sz w:val="22"/>
-                <w:szCs w:val="22"/>
-                <w:rtl/>
-              </w:rPr>
-              <w:t xml:space="preserve"> الكمّي وجدت أفضل قراءة الحل الأمثل في </w:t>
-            </w:r>
-            <w:r>
-              <w:rPr>
-                <w:rFonts w:ascii="Arial" w:hAnsi="Arial" w:cs="Arial"/>
-                <w:sz w:val="22"/>
-                <w:szCs w:val="22"/>
-              </w:rPr>
-              <w:t xml:space="preserve">11</w:t>
-            </w:r>
-            <w:r>
-              <w:rPr>
-                <w:rFonts w:ascii="Arial" w:hAnsi="Arial" w:cs="Arial"/>
-                <w:sz w:val="22"/>
-                <w:szCs w:val="22"/>
-                <w:rtl/>
-              </w:rPr>
-              <w:t xml:space="preserve"> من </w:t>
-            </w:r>
-            <w:r>
-              <w:rPr>
-                <w:rFonts w:ascii="Arial" w:hAnsi="Arial" w:cs="Arial"/>
-                <w:sz w:val="22"/>
-                <w:szCs w:val="22"/>
-              </w:rPr>
-              <w:t xml:space="preserve">11</w:t>
-            </w:r>
-            <w:r>
-              <w:rPr>
-                <w:rFonts w:ascii="Arial" w:hAnsi="Arial" w:cs="Arial"/>
-                <w:sz w:val="22"/>
-                <w:szCs w:val="22"/>
-                <w:rtl/>
-              </w:rPr>
-              <w:t xml:space="preserve"> مسألة فرعية (</w:t>
-            </w:r>
-            <w:r>
-              <w:rPr>
-                <w:rFonts w:ascii="Arial" w:hAnsi="Arial" w:cs="Arial"/>
-                <w:sz w:val="22"/>
-                <w:szCs w:val="22"/>
-              </w:rPr>
-              <w:t xml:space="preserve">75</w:t>
-            </w:r>
-            <w:r>
-              <w:rPr>
-                <w:rFonts w:ascii="Arial" w:hAnsi="Arial" w:cs="Arial"/>
-                <w:sz w:val="22"/>
-                <w:szCs w:val="22"/>
-                <w:rtl/>
-              </w:rPr>
-              <w:t xml:space="preserve"> كيوبت مجتمعة) من شبكة </w:t>
-            </w:r>
-            <w:r>
-              <w:rPr>
-                <w:rFonts w:ascii="Arial" w:hAnsi="Arial" w:cs="Arial"/>
-                <w:sz w:val="22"/>
-                <w:szCs w:val="22"/>
-              </w:rPr>
-              <w:t xml:space="preserve">240</w:t>
-            </w:r>
-            <w:r>
-              <w:rPr>
-                <w:rFonts w:ascii="Arial" w:hAnsi="Arial" w:cs="Arial"/>
-                <w:sz w:val="22"/>
-                <w:szCs w:val="22"/>
-                <w:rtl/>
-              </w:rPr>
-              <w:t xml:space="preserve"> جهازًا، دون ادعاء تفوق كمّي.</w:t>
             </w:r>
           </w:p>
           <w:p>
@@ -5460,7 +5403,7 @@
                 <w:szCs w:val="22"/>
                 <w:rtl/>
               </w:rPr>
-              <w:t xml:space="preserve"> نظام استجابة: يستقبل التنبيه من أنظمة الكشف الموجودة، ثم يقرر أنسب رد. وتبيّن مراجعتان حديثتان لأنظمة الاستجابة </w:t>
+              <w:t xml:space="preserve"> نظام استجابة: يستقبل التنبيه من أنظمة الكشف الموجودة، ثم يقرر أنسب رد. وتبيّن مراجعتان لأنظمة الاستجابة </w:t>
             </w:r>
             <w:r>
               <w:rPr>
@@ -5690,7 +5633,24 @@
                       <w:sz w:val="19"/>
                       <w:szCs w:val="19"/>
                     </w:rPr>
-                    <w:t xml:space="preserve">Microsoft Defender [14]</w:t>
+                    <w:t xml:space="preserve">Wazuh</w:t>
+                  </w:r>
+                  <w:r>
+                    <w:rPr>
+                      <w:rFonts w:ascii="Arial" w:hAnsi="Arial" w:cs="Arial"/>
+                      <w:sz w:val="19"/>
+                      <w:szCs w:val="19"/>
+                      <w:rtl/>
+                    </w:rPr>
+                    <w:t xml:space="preserve">، مفتوح المصدر </w:t>
+                  </w:r>
+                  <w:r>
+                    <w:rPr>
+                      <w:rFonts w:ascii="Arial" w:hAnsi="Arial" w:cs="Arial"/>
+                      <w:sz w:val="19"/>
+                      <w:szCs w:val="19"/>
+                    </w:rPr>
+                    <w:t xml:space="preserve">[14]</w:t>
                   </w:r>
                 </w:p>
               </w:tc>
@@ -5717,7 +5677,7 @@
                       <w:szCs w:val="19"/>
                       <w:rtl/>
                     </w:rPr>
-                    <w:t xml:space="preserve">يعزل الأجهزة آليًا بحسب خطورة الهجوم</w:t>
+                    <w:t xml:space="preserve">استجابة نشطة: ينفّذ أمرًا (حجب أو عزل) عند كل تنبيه</w:t>
                   </w:r>
                 </w:p>
               </w:tc>
@@ -5744,7 +5704,7 @@
                       <w:szCs w:val="19"/>
                       <w:rtl/>
                     </w:rPr>
-                    <w:t xml:space="preserve">الأجهزة الحرجة تُستثنى يدويًا بقائمة ثابتة</w:t>
+                    <w:t xml:space="preserve">لكل تنبيه وحده؛ لا يرى الخدمات ولا الأجهزة الممنوع عزلها</w:t>
                   </w:r>
                 </w:p>
               </w:tc>
@@ -5774,17 +5734,8 @@
                       <w:rFonts w:ascii="Arial" w:hAnsi="Arial" w:cs="Arial"/>
                       <w:sz w:val="19"/>
                       <w:szCs w:val="19"/>
-                      <w:rtl/>
-                    </w:rPr>
-                    <w:t xml:space="preserve">براءة </w:t>
-                  </w:r>
-                  <w:r>
-                    <w:rPr>
-                      <w:rFonts w:ascii="Arial" w:hAnsi="Arial" w:cs="Arial"/>
-                      <w:sz w:val="19"/>
-                      <w:szCs w:val="19"/>
-                    </w:rPr>
-                    <w:t xml:space="preserve">CrowdStrike [15]</w:t>
+                    </w:rPr>
+                    <w:t xml:space="preserve">Microsoft Defender [15]</w:t>
                   </w:r>
                 </w:p>
               </w:tc>
@@ -5811,7 +5762,7 @@
                       <w:szCs w:val="19"/>
                       <w:rtl/>
                     </w:rPr>
-                    <w:t xml:space="preserve">درجات احتواء لكل جهاز</w:t>
+                    <w:t xml:space="preserve">يعزل الأجهزة آليًا بحسب خطورة الهجوم</w:t>
                   </w:r>
                 </w:p>
               </w:tc>
@@ -5838,7 +5789,7 @@
                       <w:szCs w:val="19"/>
                       <w:rtl/>
                     </w:rPr>
-                    <w:t xml:space="preserve">القرار لكل جهاز وحده، لا للشبكة</w:t>
+                    <w:t xml:space="preserve">الأجهزة الحرجة تُستثنى يدويًا بقائمة ثابتة</w:t>
                   </w:r>
                 </w:p>
               </w:tc>
@@ -5868,25 +5819,17 @@
                       <w:rFonts w:ascii="Arial" w:hAnsi="Arial" w:cs="Arial"/>
                       <w:sz w:val="19"/>
                       <w:szCs w:val="19"/>
-                    </w:rPr>
-                    <w:t xml:space="preserve">Shameli-Sendi</w:t>
-                  </w:r>
-                  <w:r>
-                    <w:rPr>
-                      <w:rFonts w:ascii="Arial" w:hAnsi="Arial" w:cs="Arial"/>
-                      <w:sz w:val="19"/>
-                      <w:szCs w:val="19"/>
-                      <w:rtl/>
-                    </w:rPr>
-                    <w:t xml:space="preserve"> وزملاؤه، </w:t>
-                  </w:r>
-                  <w:r>
-                    <w:rPr>
-                      <w:rFonts w:ascii="Arial" w:hAnsi="Arial" w:cs="Arial"/>
-                      <w:sz w:val="19"/>
-                      <w:szCs w:val="19"/>
-                    </w:rPr>
-                    <w:t xml:space="preserve">2018 [16]</w:t>
+                      <w:rtl/>
+                    </w:rPr>
+                    <w:t xml:space="preserve">براءة </w:t>
+                  </w:r>
+                  <w:r>
+                    <w:rPr>
+                      <w:rFonts w:ascii="Arial" w:hAnsi="Arial" w:cs="Arial"/>
+                      <w:sz w:val="19"/>
+                      <w:szCs w:val="19"/>
+                    </w:rPr>
+                    <w:t xml:space="preserve">CrowdStrike [16]</w:t>
                   </w:r>
                 </w:p>
               </w:tc>
@@ -5913,7 +5856,7 @@
                       <w:szCs w:val="19"/>
                       <w:rtl/>
                     </w:rPr>
-                    <w:t xml:space="preserve">اختيار الرد الأمثل بحسب تكلفته وفائدته</w:t>
+                    <w:t xml:space="preserve">درجات احتواء لكل جهاز</w:t>
                   </w:r>
                 </w:p>
               </w:tc>
@@ -5940,7 +5883,7 @@
                       <w:szCs w:val="19"/>
                       <w:rtl/>
                     </w:rPr>
-                    <w:t xml:space="preserve">لكل هجوم، دون بوابة سلامة منفصلة</w:t>
+                    <w:t xml:space="preserve">القرار لكل جهاز وحده، لا للشبكة</w:t>
                   </w:r>
                 </w:p>
               </w:tc>
@@ -5971,7 +5914,7 @@
                       <w:sz w:val="19"/>
                       <w:szCs w:val="19"/>
                     </w:rPr>
-                    <w:t xml:space="preserve">Bozorgchenani</w:t>
+                    <w:t xml:space="preserve">Shameli-Sendi</w:t>
                   </w:r>
                   <w:r>
                     <w:rPr>
@@ -5988,7 +5931,7 @@
                       <w:sz w:val="19"/>
                       <w:szCs w:val="19"/>
                     </w:rPr>
-                    <w:t xml:space="preserve">2024 [17]</w:t>
+                    <w:t xml:space="preserve">2018 [17]</w:t>
                   </w:r>
                 </w:p>
               </w:tc>
@@ -6015,15 +5958,7 @@
                       <w:szCs w:val="19"/>
                       <w:rtl/>
                     </w:rPr>
-                    <w:t xml:space="preserve">موازنة الأمن مع جودة الخدمة في شبكات </w:t>
-                  </w:r>
-                  <w:r>
-                    <w:rPr>
-                      <w:rFonts w:ascii="Arial" w:hAnsi="Arial" w:cs="Arial"/>
-                      <w:sz w:val="19"/>
-                      <w:szCs w:val="19"/>
-                    </w:rPr>
-                    <w:t xml:space="preserve">5G</w:t>
+                    <w:t xml:space="preserve">اختيار الرد الأمثل بحسب تكلفته وفائدته</w:t>
                   </w:r>
                 </w:p>
               </w:tc>
@@ -6050,7 +5985,7 @@
                       <w:szCs w:val="19"/>
                       <w:rtl/>
                     </w:rPr>
-                    <w:t xml:space="preserve">لا بوابة سلامة، ولا اختبار لتنبيهات مزوّرة</w:t>
+                    <w:t xml:space="preserve">لكل هجوم، دون بوابة سلامة منفصلة</w:t>
                   </w:r>
                 </w:p>
               </w:tc>
@@ -6081,58 +6016,24 @@
                       <w:sz w:val="19"/>
                       <w:szCs w:val="19"/>
                     </w:rPr>
-                    <w:t xml:space="preserve">Hammar</w:t>
-                  </w:r>
-                  <w:r>
-                    <w:rPr>
-                      <w:rFonts w:ascii="Arial" w:hAnsi="Arial" w:cs="Arial"/>
-                      <w:sz w:val="19"/>
-                      <w:szCs w:val="19"/>
-                      <w:rtl/>
-                    </w:rPr>
-                    <w:t xml:space="preserve"> و</w:t>
-                  </w:r>
-                  <w:r>
-                    <w:rPr>
-                      <w:rFonts w:ascii="Arial" w:hAnsi="Arial" w:cs="Arial"/>
-                      <w:sz w:val="19"/>
-                      <w:szCs w:val="19"/>
-                    </w:rPr>
-                    <w:t xml:space="preserve">Stadler</w:t>
-                  </w:r>
-                  <w:r>
-                    <w:rPr>
-                      <w:rFonts w:ascii="Arial" w:hAnsi="Arial" w:cs="Arial"/>
-                      <w:sz w:val="19"/>
-                      <w:szCs w:val="19"/>
-                      <w:rtl/>
-                    </w:rPr>
-                    <w:t xml:space="preserve">، </w:t>
-                  </w:r>
-                  <w:r>
-                    <w:rPr>
-                      <w:rFonts w:ascii="Arial" w:hAnsi="Arial" w:cs="Arial"/>
-                      <w:sz w:val="19"/>
-                      <w:szCs w:val="19"/>
-                    </w:rPr>
-                    <w:t xml:space="preserve">2022</w:t>
-                  </w:r>
-                  <w:r>
-                    <w:rPr>
-                      <w:rFonts w:ascii="Arial" w:hAnsi="Arial" w:cs="Arial"/>
-                      <w:sz w:val="19"/>
-                      <w:szCs w:val="19"/>
-                      <w:rtl/>
-                    </w:rPr>
-                    <w:t xml:space="preserve"> و</w:t>
-                  </w:r>
-                  <w:r>
-                    <w:rPr>
-                      <w:rFonts w:ascii="Arial" w:hAnsi="Arial" w:cs="Arial"/>
-                      <w:sz w:val="19"/>
-                      <w:szCs w:val="19"/>
-                    </w:rPr>
-                    <w:t xml:space="preserve">2024 [18][12]</w:t>
+                    <w:t xml:space="preserve">Bozorgchenani</w:t>
+                  </w:r>
+                  <w:r>
+                    <w:rPr>
+                      <w:rFonts w:ascii="Arial" w:hAnsi="Arial" w:cs="Arial"/>
+                      <w:sz w:val="19"/>
+                      <w:szCs w:val="19"/>
+                      <w:rtl/>
+                    </w:rPr>
+                    <w:t xml:space="preserve"> وزملاؤه، </w:t>
+                  </w:r>
+                  <w:r>
+                    <w:rPr>
+                      <w:rFonts w:ascii="Arial" w:hAnsi="Arial" w:cs="Arial"/>
+                      <w:sz w:val="19"/>
+                      <w:szCs w:val="19"/>
+                    </w:rPr>
+                    <w:t xml:space="preserve">2024 [18]</w:t>
                   </w:r>
                 </w:p>
               </w:tc>
@@ -6159,7 +6060,15 @@
                       <w:szCs w:val="19"/>
                       <w:rtl/>
                     </w:rPr>
-                    <w:t xml:space="preserve">تعلّم توقيت الاستجابة الأمثل أمام مهاجم يغيّر سلوكه</w:t>
+                    <w:t xml:space="preserve">موازنة الأمن مع جودة الخدمة في شبكات </w:t>
+                  </w:r>
+                  <w:r>
+                    <w:rPr>
+                      <w:rFonts w:ascii="Arial" w:hAnsi="Arial" w:cs="Arial"/>
+                      <w:sz w:val="19"/>
+                      <w:szCs w:val="19"/>
+                    </w:rPr>
+                    <w:t xml:space="preserve">5G</w:t>
                   </w:r>
                 </w:p>
               </w:tc>
@@ -6186,7 +6095,7 @@
                       <w:szCs w:val="19"/>
                       <w:rtl/>
                     </w:rPr>
-                    <w:t xml:space="preserve">متى يتدخل، لا أي درجة احتواء لكل جهاز؛ والسياسة متعلَّمة بلا بوابة مثبتة</w:t>
+                    <w:t xml:space="preserve">لا بوابة سلامة، ولا اختبار لتنبيهات مزوّرة</w:t>
                   </w:r>
                 </w:p>
               </w:tc>
@@ -6226,15 +6135,49 @@
                       <w:szCs w:val="19"/>
                       <w:rtl/>
                     </w:rPr>
-                    <w:t xml:space="preserve"> وزملاؤه، </w:t>
-                  </w:r>
-                  <w:r>
-                    <w:rPr>
-                      <w:rFonts w:ascii="Arial" w:hAnsi="Arial" w:cs="Arial"/>
-                      <w:sz w:val="19"/>
-                      <w:szCs w:val="19"/>
-                    </w:rPr>
-                    <w:t xml:space="preserve">2025 [13]</w:t>
+                    <w:t xml:space="preserve"> و</w:t>
+                  </w:r>
+                  <w:r>
+                    <w:rPr>
+                      <w:rFonts w:ascii="Arial" w:hAnsi="Arial" w:cs="Arial"/>
+                      <w:sz w:val="19"/>
+                      <w:szCs w:val="19"/>
+                    </w:rPr>
+                    <w:t xml:space="preserve">Stadler</w:t>
+                  </w:r>
+                  <w:r>
+                    <w:rPr>
+                      <w:rFonts w:ascii="Arial" w:hAnsi="Arial" w:cs="Arial"/>
+                      <w:sz w:val="19"/>
+                      <w:szCs w:val="19"/>
+                      <w:rtl/>
+                    </w:rPr>
+                    <w:t xml:space="preserve">، </w:t>
+                  </w:r>
+                  <w:r>
+                    <w:rPr>
+                      <w:rFonts w:ascii="Arial" w:hAnsi="Arial" w:cs="Arial"/>
+                      <w:sz w:val="19"/>
+                      <w:szCs w:val="19"/>
+                    </w:rPr>
+                    <w:t xml:space="preserve">2022</w:t>
+                  </w:r>
+                  <w:r>
+                    <w:rPr>
+                      <w:rFonts w:ascii="Arial" w:hAnsi="Arial" w:cs="Arial"/>
+                      <w:sz w:val="19"/>
+                      <w:szCs w:val="19"/>
+                      <w:rtl/>
+                    </w:rPr>
+                    <w:t xml:space="preserve"> و</w:t>
+                  </w:r>
+                  <w:r>
+                    <w:rPr>
+                      <w:rFonts w:ascii="Arial" w:hAnsi="Arial" w:cs="Arial"/>
+                      <w:sz w:val="19"/>
+                      <w:szCs w:val="19"/>
+                    </w:rPr>
+                    <w:t xml:space="preserve">2024 [19][12]</w:t>
                   </w:r>
                 </w:p>
               </w:tc>
@@ -6261,7 +6204,7 @@
                       <w:szCs w:val="19"/>
                       <w:rtl/>
                     </w:rPr>
-                    <w:t xml:space="preserve">استجابة تتكيف آنيًا مع نموذج المهاجم</w:t>
+                    <w:t xml:space="preserve">تعلّم توقيت الاستجابة الأمثل أمام مهاجم يغيّر سلوكه</w:t>
                   </w:r>
                 </w:p>
               </w:tc>
@@ -6288,7 +6231,7 @@
                       <w:szCs w:val="19"/>
                       <w:rtl/>
                     </w:rPr>
-                    <w:t xml:space="preserve">لا تجزئة للخادم الحرج، ولا إثبات سلامة قبل التنفيذ</w:t>
+                    <w:t xml:space="preserve">متى يتدخل، لا أي درجة احتواء لكل جهاز؛ والسياسة متعلَّمة بلا بوابة مثبتة</w:t>
                   </w:r>
                 </w:p>
               </w:tc>
@@ -6319,24 +6262,24 @@
                       <w:sz w:val="19"/>
                       <w:szCs w:val="19"/>
                     </w:rPr>
-                    <w:t xml:space="preserve">CybORG</w:t>
-                  </w:r>
-                  <w:r>
-                    <w:rPr>
-                      <w:rFonts w:ascii="Arial" w:hAnsi="Arial" w:cs="Arial"/>
-                      <w:sz w:val="19"/>
-                      <w:szCs w:val="19"/>
-                      <w:rtl/>
-                    </w:rPr>
-                    <w:t xml:space="preserve">، </w:t>
-                  </w:r>
-                  <w:r>
-                    <w:rPr>
-                      <w:rFonts w:ascii="Arial" w:hAnsi="Arial" w:cs="Arial"/>
-                      <w:sz w:val="19"/>
-                      <w:szCs w:val="19"/>
-                    </w:rPr>
-                    <w:t xml:space="preserve">2021 [19]</w:t>
+                    <w:t xml:space="preserve">Hammar</w:t>
+                  </w:r>
+                  <w:r>
+                    <w:rPr>
+                      <w:rFonts w:ascii="Arial" w:hAnsi="Arial" w:cs="Arial"/>
+                      <w:sz w:val="19"/>
+                      <w:szCs w:val="19"/>
+                      <w:rtl/>
+                    </w:rPr>
+                    <w:t xml:space="preserve"> وزملاؤه، </w:t>
+                  </w:r>
+                  <w:r>
+                    <w:rPr>
+                      <w:rFonts w:ascii="Arial" w:hAnsi="Arial" w:cs="Arial"/>
+                      <w:sz w:val="19"/>
+                      <w:szCs w:val="19"/>
+                    </w:rPr>
+                    <w:t xml:space="preserve">2025 [13]</w:t>
                   </w:r>
                 </w:p>
               </w:tc>
@@ -6363,7 +6306,7 @@
                       <w:szCs w:val="19"/>
                       <w:rtl/>
                     </w:rPr>
-                    <w:t xml:space="preserve">بيئة لتدريب وكلاء دفاع بالتعلم المعزز</w:t>
+                    <w:t xml:space="preserve">استجابة تتكيف آنيًا مع نموذج المهاجم</w:t>
                   </w:r>
                 </w:p>
               </w:tc>
@@ -6390,7 +6333,7 @@
                       <w:szCs w:val="19"/>
                       <w:rtl/>
                     </w:rPr>
-                    <w:t xml:space="preserve">سلامة القرار المتعلَّم يصعب إثباتها قبل التنفيذ</w:t>
+                    <w:t xml:space="preserve">لا تجزئة للخادم الحرج، ولا إثبات سلامة قبل التنفيذ</w:t>
                   </w:r>
                 </w:p>
               </w:tc>
@@ -6420,17 +6363,25 @@
                       <w:rFonts w:ascii="Arial" w:hAnsi="Arial" w:cs="Arial"/>
                       <w:sz w:val="19"/>
                       <w:szCs w:val="19"/>
-                      <w:rtl/>
-                    </w:rPr>
-                    <w:t xml:space="preserve">الثقة المعدومة، </w:t>
-                  </w:r>
-                  <w:r>
-                    <w:rPr>
-                      <w:rFonts w:ascii="Arial" w:hAnsi="Arial" w:cs="Arial"/>
-                      <w:sz w:val="19"/>
-                      <w:szCs w:val="19"/>
-                    </w:rPr>
-                    <w:t xml:space="preserve">NIST [20]</w:t>
+                    </w:rPr>
+                    <w:t xml:space="preserve">CybORG</w:t>
+                  </w:r>
+                  <w:r>
+                    <w:rPr>
+                      <w:rFonts w:ascii="Arial" w:hAnsi="Arial" w:cs="Arial"/>
+                      <w:sz w:val="19"/>
+                      <w:szCs w:val="19"/>
+                      <w:rtl/>
+                    </w:rPr>
+                    <w:t xml:space="preserve">، </w:t>
+                  </w:r>
+                  <w:r>
+                    <w:rPr>
+                      <w:rFonts w:ascii="Arial" w:hAnsi="Arial" w:cs="Arial"/>
+                      <w:sz w:val="19"/>
+                      <w:szCs w:val="19"/>
+                    </w:rPr>
+                    <w:t xml:space="preserve">2021 [20]</w:t>
                   </w:r>
                 </w:p>
               </w:tc>
@@ -6457,7 +6408,7 @@
                       <w:szCs w:val="19"/>
                       <w:rtl/>
                     </w:rPr>
-                    <w:t xml:space="preserve">تجزئة الشبكة مسبقًا</w:t>
+                    <w:t xml:space="preserve">بيئة لتدريب وكلاء دفاع بالتعلم المعزز</w:t>
                   </w:r>
                 </w:p>
               </w:tc>
@@ -6484,7 +6435,7 @@
                       <w:szCs w:val="19"/>
                       <w:rtl/>
                     </w:rPr>
-                    <w:t xml:space="preserve">لا تحدد أي جهاز يُعزل أثناء الهجوم</w:t>
+                    <w:t xml:space="preserve">سلامة القرار المتعلَّم يصعب إثباتها قبل التنفيذ</w:t>
                   </w:r>
                 </w:p>
               </w:tc>
@@ -6514,25 +6465,17 @@
                       <w:rFonts w:ascii="Arial" w:hAnsi="Arial" w:cs="Arial"/>
                       <w:sz w:val="19"/>
                       <w:szCs w:val="19"/>
-                    </w:rPr>
-                    <w:t xml:space="preserve">Cogburn</w:t>
-                  </w:r>
-                  <w:r>
-                    <w:rPr>
-                      <w:rFonts w:ascii="Arial" w:hAnsi="Arial" w:cs="Arial"/>
-                      <w:sz w:val="19"/>
-                      <w:szCs w:val="19"/>
-                      <w:rtl/>
-                    </w:rPr>
-                    <w:t xml:space="preserve"> وزملاؤه، </w:t>
-                  </w:r>
-                  <w:r>
-                    <w:rPr>
-                      <w:rFonts w:ascii="Arial" w:hAnsi="Arial" w:cs="Arial"/>
-                      <w:sz w:val="19"/>
-                      <w:szCs w:val="19"/>
-                    </w:rPr>
-                    <w:t xml:space="preserve">2026 [21]</w:t>
+                      <w:rtl/>
+                    </w:rPr>
+                    <w:t xml:space="preserve">الثقة المعدومة، </w:t>
+                  </w:r>
+                  <w:r>
+                    <w:rPr>
+                      <w:rFonts w:ascii="Arial" w:hAnsi="Arial" w:cs="Arial"/>
+                      <w:sz w:val="19"/>
+                      <w:szCs w:val="19"/>
+                    </w:rPr>
+                    <w:t xml:space="preserve">NIST [21]</w:t>
                   </w:r>
                 </w:p>
               </w:tc>
@@ -6557,34 +6500,9 @@
                       <w:rFonts w:ascii="Arial" w:hAnsi="Arial" w:cs="Arial"/>
                       <w:sz w:val="19"/>
                       <w:szCs w:val="19"/>
-                    </w:rPr>
-                    <w:t xml:space="preserve">QAOA</w:t>
-                  </w:r>
-                  <w:r>
-                    <w:rPr>
-                      <w:rFonts w:ascii="Arial" w:hAnsi="Arial" w:cs="Arial"/>
-                      <w:sz w:val="19"/>
-                      <w:szCs w:val="19"/>
-                      <w:rtl/>
-                    </w:rPr>
-                    <w:t xml:space="preserve"> على حاسوب </w:t>
-                  </w:r>
-                  <w:r>
-                    <w:rPr>
-                      <w:rFonts w:ascii="Arial" w:hAnsi="Arial" w:cs="Arial"/>
-                      <w:sz w:val="19"/>
-                      <w:szCs w:val="19"/>
-                    </w:rPr>
-                    <w:t xml:space="preserve">IBM</w:t>
-                  </w:r>
-                  <w:r>
-                    <w:rPr>
-                      <w:rFonts w:ascii="Arial" w:hAnsi="Arial" w:cs="Arial"/>
-                      <w:sz w:val="19"/>
-                      <w:szCs w:val="19"/>
-                      <w:rtl/>
-                    </w:rPr>
-                    <w:t xml:space="preserve"> لتقسيم حركة شبكة مصائد</w:t>
+                      <w:rtl/>
+                    </w:rPr>
+                    <w:t xml:space="preserve">تجزئة الشبكة مسبقًا</w:t>
                   </w:r>
                 </w:p>
               </w:tc>
@@ -6611,6 +6529,133 @@
                       <w:szCs w:val="19"/>
                       <w:rtl/>
                     </w:rPr>
+                    <w:t xml:space="preserve">لا تحدد أي جهاز يُعزل أثناء الهجوم</w:t>
+                  </w:r>
+                </w:p>
+              </w:tc>
+            </w:tr>
+            <w:tr>
+              <w:trPr>
+                <w:cantSplit/>
+              </w:trPr>
+              <w:tc>
+                <w:tcPr>
+                  <w:tcW w:w="2936" w:type="dxa"/>
+                </w:tcPr>
+                <w:p>
+                  <w:pPr>
+                    <w:bidi/>
+                    <w:spacing w:after="0" w:line="300" w:lineRule="auto"/>
+                    <w:jc w:val="start"/>
+                    <w:rPr>
+                      <w:rFonts w:ascii="Arial" w:hAnsi="Arial" w:cs="Arial"/>
+                      <w:sz w:val="19"/>
+                      <w:szCs w:val="19"/>
+                      <w:rtl/>
+                    </w:rPr>
+                  </w:pPr>
+                  <w:r>
+                    <w:rPr>
+                      <w:rFonts w:ascii="Arial" w:hAnsi="Arial" w:cs="Arial"/>
+                      <w:sz w:val="19"/>
+                      <w:szCs w:val="19"/>
+                    </w:rPr>
+                    <w:t xml:space="preserve">Cogburn</w:t>
+                  </w:r>
+                  <w:r>
+                    <w:rPr>
+                      <w:rFonts w:ascii="Arial" w:hAnsi="Arial" w:cs="Arial"/>
+                      <w:sz w:val="19"/>
+                      <w:szCs w:val="19"/>
+                      <w:rtl/>
+                    </w:rPr>
+                    <w:t xml:space="preserve"> وزملاؤه، </w:t>
+                  </w:r>
+                  <w:r>
+                    <w:rPr>
+                      <w:rFonts w:ascii="Arial" w:hAnsi="Arial" w:cs="Arial"/>
+                      <w:sz w:val="19"/>
+                      <w:szCs w:val="19"/>
+                    </w:rPr>
+                    <w:t xml:space="preserve">2026 [22]</w:t>
+                  </w:r>
+                </w:p>
+              </w:tc>
+              <w:tc>
+                <w:tcPr>
+                  <w:tcW w:w="3230" w:type="dxa"/>
+                </w:tcPr>
+                <w:p>
+                  <w:pPr>
+                    <w:bidi/>
+                    <w:spacing w:after="0" w:line="300" w:lineRule="auto"/>
+                    <w:jc w:val="start"/>
+                    <w:rPr>
+                      <w:rFonts w:ascii="Arial" w:hAnsi="Arial" w:cs="Arial"/>
+                      <w:sz w:val="19"/>
+                      <w:szCs w:val="19"/>
+                      <w:rtl/>
+                    </w:rPr>
+                  </w:pPr>
+                  <w:r>
+                    <w:rPr>
+                      <w:rFonts w:ascii="Arial" w:hAnsi="Arial" w:cs="Arial"/>
+                      <w:sz w:val="19"/>
+                      <w:szCs w:val="19"/>
+                    </w:rPr>
+                    <w:t xml:space="preserve">QAOA</w:t>
+                  </w:r>
+                  <w:r>
+                    <w:rPr>
+                      <w:rFonts w:ascii="Arial" w:hAnsi="Arial" w:cs="Arial"/>
+                      <w:sz w:val="19"/>
+                      <w:szCs w:val="19"/>
+                      <w:rtl/>
+                    </w:rPr>
+                    <w:t xml:space="preserve"> على حاسوب </w:t>
+                  </w:r>
+                  <w:r>
+                    <w:rPr>
+                      <w:rFonts w:ascii="Arial" w:hAnsi="Arial" w:cs="Arial"/>
+                      <w:sz w:val="19"/>
+                      <w:szCs w:val="19"/>
+                    </w:rPr>
+                    <w:t xml:space="preserve">IBM</w:t>
+                  </w:r>
+                  <w:r>
+                    <w:rPr>
+                      <w:rFonts w:ascii="Arial" w:hAnsi="Arial" w:cs="Arial"/>
+                      <w:sz w:val="19"/>
+                      <w:szCs w:val="19"/>
+                      <w:rtl/>
+                    </w:rPr>
+                    <w:t xml:space="preserve"> لتقسيم حركة شبكة مصائد</w:t>
+                  </w:r>
+                </w:p>
+              </w:tc>
+              <w:tc>
+                <w:tcPr>
+                  <w:tcW w:w="3132" w:type="dxa"/>
+                </w:tcPr>
+                <w:p>
+                  <w:pPr>
+                    <w:bidi/>
+                    <w:spacing w:after="0" w:line="300" w:lineRule="auto"/>
+                    <w:jc w:val="start"/>
+                    <w:rPr>
+                      <w:rFonts w:ascii="Arial" w:hAnsi="Arial" w:cs="Arial"/>
+                      <w:sz w:val="19"/>
+                      <w:szCs w:val="19"/>
+                      <w:rtl/>
+                    </w:rPr>
+                  </w:pPr>
+                  <w:r>
+                    <w:rPr>
+                      <w:rFonts w:ascii="Arial" w:hAnsi="Arial" w:cs="Arial"/>
+                      <w:sz w:val="19"/>
+                      <w:szCs w:val="19"/>
+                      <w:rtl/>
+                    </w:rPr>
                     <w:t xml:space="preserve">بلا قيود سلامة، ونسبة تكلفة </w:t>
                   </w:r>
                   <w:r>
@@ -6746,7 +6791,7 @@
                 <w:sz w:val="22"/>
                 <w:szCs w:val="22"/>
               </w:rPr>
-              <w:t xml:space="preserve">[22][23]</w:t>
+              <w:t xml:space="preserve">[23][24]</w:t>
             </w:r>
             <w:r>
               <w:rPr>
@@ -6780,7 +6825,7 @@
                 <w:sz w:val="22"/>
                 <w:szCs w:val="22"/>
               </w:rPr>
-              <w:t xml:space="preserve">QAOA [24]</w:t>
+              <w:t xml:space="preserve">QAOA [25]</w:t>
             </w:r>
             <w:r>
               <w:rPr>
@@ -6833,7 +6878,7 @@
                 <w:sz w:val="22"/>
                 <w:szCs w:val="22"/>
               </w:rPr>
-              <w:t xml:space="preserve">Simplex [25]</w:t>
+              <w:t xml:space="preserve">Simplex [26]</w:t>
             </w:r>
             <w:r>
               <w:rPr>
@@ -6895,7 +6940,7 @@
                 <w:sz w:val="22"/>
                 <w:szCs w:val="22"/>
               </w:rPr>
-              <w:t xml:space="preserve">[26]</w:t>
+              <w:t xml:space="preserve">[27]</w:t>
             </w:r>
             <w:r>
               <w:rPr>
@@ -6912,7 +6957,7 @@
                 <w:sz w:val="22"/>
                 <w:szCs w:val="22"/>
               </w:rPr>
-              <w:t xml:space="preserve">Z3 [27]</w:t>
+              <w:t xml:space="preserve">Z3 [28]</w:t>
             </w:r>
             <w:r>
               <w:rPr>
@@ -6929,7 +6974,7 @@
                 <w:sz w:val="22"/>
                 <w:szCs w:val="22"/>
               </w:rPr>
-              <w:t xml:space="preserve">[28]</w:t>
+              <w:t xml:space="preserve">[29]</w:t>
             </w:r>
             <w:r>
               <w:rPr>
@@ -7941,7 +7986,24 @@
                 <w:szCs w:val="22"/>
                 <w:rtl/>
               </w:rPr>
-              <w:t xml:space="preserve"> مهاجم يزوّر التنبيهات يوقف خدمات أقل منه في العزل الكامل. المجموعة أ.</w:t>
+              <w:t xml:space="preserve"> مهاجم يزوّر التنبيهات يوقف خدمات أقل منه في العزل الكامل. المجموعة أ. (حدّ أولي متساهل؛ والاختبار الأقوى، مهاجم يعرف الكود، مسجّل في القسم </w:t>
+            </w:r>
+            <w:r>
+              <w:rPr>
+                <w:rFonts w:ascii="Arial" w:hAnsi="Arial" w:cs="Arial"/>
+                <w:sz w:val="22"/>
+                <w:szCs w:val="22"/>
+              </w:rPr>
+              <w:t xml:space="preserve">8)</w:t>
+            </w:r>
+            <w:r>
+              <w:rPr>
+                <w:rFonts w:ascii="Arial" w:hAnsi="Arial" w:cs="Arial"/>
+                <w:sz w:val="22"/>
+                <w:szCs w:val="22"/>
+                <w:rtl/>
+              </w:rPr>
+              <w:t xml:space="preserve">.</w:t>
             </w:r>
           </w:p>
           <w:p>
@@ -8016,7 +8078,7 @@
                 <w:sz w:val="22"/>
                 <w:szCs w:val="22"/>
               </w:rPr>
-              <w:t xml:space="preserve">CVSS [29])</w:t>
+              <w:t xml:space="preserve">CVSS [30])</w:t>
             </w:r>
             <w:r>
               <w:rPr>
@@ -8598,41 +8660,7 @@
                 <w:szCs w:val="22"/>
                 <w:rtl/>
               </w:rPr>
-              <w:t xml:space="preserve">أقرب الحلول تقرر لكل جهاز أو لكل هجوم وحده (القسم </w:t>
-            </w:r>
-            <w:r>
-              <w:rPr>
-                <w:rFonts w:ascii="Arial" w:hAnsi="Arial" w:cs="Arial"/>
-                <w:sz w:val="22"/>
-                <w:szCs w:val="22"/>
-              </w:rPr>
-              <w:t xml:space="preserve">3)</w:t>
-            </w:r>
-            <w:r>
-              <w:rPr>
-                <w:rFonts w:ascii="Arial" w:hAnsi="Arial" w:cs="Arial"/>
-                <w:sz w:val="22"/>
-                <w:szCs w:val="22"/>
-                <w:rtl/>
-              </w:rPr>
-              <w:t xml:space="preserve">. أما </w:t>
-            </w:r>
-            <w:r>
-              <w:rPr>
-                <w:rFonts w:ascii="Arial" w:hAnsi="Arial" w:cs="Arial"/>
-                <w:sz w:val="22"/>
-                <w:szCs w:val="22"/>
-              </w:rPr>
-              <w:t xml:space="preserve">ACRS</w:t>
-            </w:r>
-            <w:r>
-              <w:rPr>
-                <w:rFonts w:ascii="Arial" w:hAnsi="Arial" w:cs="Arial"/>
-                <w:sz w:val="22"/>
-                <w:szCs w:val="22"/>
-                <w:rtl/>
-              </w:rPr>
-              <w:t xml:space="preserve"> فيقرر للشبكة كاملة بقرار واحد، ويفصل السلامة عن المُحسِّن، ويُختبر أمام التزوير. والإضافة العلمية والتقنية:</w:t>
+              <w:t xml:space="preserve">أقرب الحلول تقرر لكل جهاز أو هجوم وحده. والإضافة العلمية والتقنية:</w:t>
             </w:r>
           </w:p>
           <w:p>
@@ -8734,7 +8762,7 @@
                 <w:sz w:val="22"/>
                 <w:szCs w:val="22"/>
               </w:rPr>
-              <w:t xml:space="preserve">[20]</w:t>
+              <w:t xml:space="preserve">[21]</w:t>
             </w:r>
             <w:r>
               <w:rPr>
@@ -8786,7 +8814,7 @@
                 <w:szCs w:val="22"/>
                 <w:rtl/>
               </w:rPr>
-              <w:t xml:space="preserve"> خمس خصائص سلامة مثبتة رياضيًا على خمس شبكات، وصمود أمام كل تزوير لـ</w:t>
+              <w:t xml:space="preserve"> خمس خصائص سلامة مثبتة رياضيًا على خمس شبكات (بعد إصلاح معلن لطبقة التنفيذ)، وصمود أمام كل تزوير لـ</w:t>
             </w:r>
             <w:r>
               <w:rPr>
@@ -8880,24 +8908,24 @@
                 <w:szCs w:val="22"/>
                 <w:rtl/>
               </w:rPr>
-              <w:t xml:space="preserve"> أثبتنا أنها لا تغيّر الحل الأمثل، وبها وجد العتاد الكمّي الأمثل الدقيق، أما أقرب عمل كمّي </w:t>
-            </w:r>
-            <w:r>
-              <w:rPr>
-                <w:rFonts w:ascii="Arial" w:hAnsi="Arial" w:cs="Arial"/>
-                <w:sz w:val="22"/>
-                <w:szCs w:val="22"/>
-              </w:rPr>
-              <w:t xml:space="preserve">[21]</w:t>
-            </w:r>
-            <w:r>
-              <w:rPr>
-                <w:rFonts w:ascii="Arial" w:hAnsi="Arial" w:cs="Arial"/>
-                <w:sz w:val="22"/>
-                <w:szCs w:val="22"/>
-                <w:rtl/>
-              </w:rPr>
-              <w:t xml:space="preserve"> فقاس متوسط نسبة التكلفة (</w:t>
+              <w:t xml:space="preserve"> أثبتنا أنها لا تغيّر الحل الأمثل، وبها وجد العتاد الكمّي الأمثل الدقيق؛ وأقرب عمل كمّي </w:t>
+            </w:r>
+            <w:r>
+              <w:rPr>
+                <w:rFonts w:ascii="Arial" w:hAnsi="Arial" w:cs="Arial"/>
+                <w:sz w:val="22"/>
+                <w:szCs w:val="22"/>
+              </w:rPr>
+              <w:t xml:space="preserve">[22]</w:t>
+            </w:r>
+            <w:r>
+              <w:rPr>
+                <w:rFonts w:ascii="Arial" w:hAnsi="Arial" w:cs="Arial"/>
+                <w:sz w:val="22"/>
+                <w:szCs w:val="22"/>
+                <w:rtl/>
+              </w:rPr>
+              <w:t xml:space="preserve"> قاس متوسط نسبة التكلفة (</w:t>
             </w:r>
             <w:r>
               <w:rPr>
@@ -8931,41 +8959,7 @@
                 <w:szCs w:val="22"/>
                 <w:rtl/>
               </w:rPr>
-              <w:t xml:space="preserve"> كيوبت و</w:t>
-            </w:r>
-            <w:r>
-              <w:rPr>
-                <w:rFonts w:ascii="Arial" w:hAnsi="Arial" w:cs="Arial"/>
-                <w:sz w:val="22"/>
-                <w:szCs w:val="22"/>
-              </w:rPr>
-              <w:t xml:space="preserve">0.70</w:t>
-            </w:r>
-            <w:r>
-              <w:rPr>
-                <w:rFonts w:ascii="Arial" w:hAnsi="Arial" w:cs="Arial"/>
-                <w:sz w:val="22"/>
-                <w:szCs w:val="22"/>
-                <w:rtl/>
-              </w:rPr>
-              <w:t xml:space="preserve"> عند </w:t>
-            </w:r>
-            <w:r>
-              <w:rPr>
-                <w:rFonts w:ascii="Arial" w:hAnsi="Arial" w:cs="Arial"/>
-                <w:sz w:val="22"/>
-                <w:szCs w:val="22"/>
-              </w:rPr>
-              <w:t xml:space="preserve">110)</w:t>
-            </w:r>
-            <w:r>
-              <w:rPr>
-                <w:rFonts w:ascii="Arial" w:hAnsi="Arial" w:cs="Arial"/>
-                <w:sz w:val="22"/>
-                <w:szCs w:val="22"/>
-                <w:rtl/>
-              </w:rPr>
-              <w:t xml:space="preserve">، ونحن نقيس أفضل قراءة، فالمقارنة تقريبية.</w:t>
+              <w:t xml:space="preserve"> كيوبت)، فالمقارنة تقريبية.</w:t>
             </w:r>
           </w:p>
           <w:p>
@@ -9081,7 +9075,7 @@
                       <w:sz w:val="19"/>
                       <w:szCs w:val="19"/>
                     </w:rPr>
-                    <w:t xml:space="preserve">[16]</w:t>
+                    <w:t xml:space="preserve">[17]</w:t>
                   </w:r>
                 </w:p>
               </w:tc>
@@ -9110,7 +9104,7 @@
                       <w:sz w:val="19"/>
                       <w:szCs w:val="19"/>
                     </w:rPr>
-                    <w:t xml:space="preserve">[17]</w:t>
+                    <w:t xml:space="preserve">[18]</w:t>
                   </w:r>
                 </w:p>
               </w:tc>
@@ -9139,7 +9133,7 @@
                       <w:sz w:val="19"/>
                       <w:szCs w:val="19"/>
                     </w:rPr>
-                    <w:t xml:space="preserve">Defender [14]</w:t>
+                    <w:t xml:space="preserve">Defender [15]</w:t>
                   </w:r>
                 </w:p>
               </w:tc>
@@ -9168,7 +9162,7 @@
                       <w:sz w:val="19"/>
                       <w:szCs w:val="19"/>
                     </w:rPr>
-                    <w:t xml:space="preserve">CrowdStrike [15]</w:t>
+                    <w:t xml:space="preserve">CrowdStrike [16]</w:t>
                   </w:r>
                 </w:p>
               </w:tc>
@@ -9905,6 +9899,158 @@
                 <w:szCs w:val="22"/>
                 <w:rtl/>
               </w:rPr>
+              <w:t xml:space="preserve">مقارنة رقمية بحل قائم:</w:t>
+            </w:r>
+            <w:r>
+              <w:rPr>
+                <w:rFonts w:ascii="Arial" w:hAnsi="Arial" w:cs="Arial"/>
+                <w:sz w:val="22"/>
+                <w:szCs w:val="22"/>
+                <w:rtl/>
+              </w:rPr>
+              <w:t xml:space="preserve"> نفّذنا سياسة على نمط الاستجابة النشطة في </w:t>
+            </w:r>
+            <w:r>
+              <w:rPr>
+                <w:rFonts w:ascii="Arial" w:hAnsi="Arial" w:cs="Arial"/>
+                <w:sz w:val="22"/>
+                <w:szCs w:val="22"/>
+              </w:rPr>
+              <w:t xml:space="preserve">Wazuh [14]</w:t>
+            </w:r>
+            <w:r>
+              <w:rPr>
+                <w:rFonts w:ascii="Arial" w:hAnsi="Arial" w:cs="Arial"/>
+                <w:sz w:val="22"/>
+                <w:szCs w:val="22"/>
+                <w:rtl/>
+              </w:rPr>
+              <w:t xml:space="preserve"> (عزل كل مُنبَّه عليه): على الـ</w:t>
+            </w:r>
+            <w:r>
+              <w:rPr>
+                <w:rFonts w:ascii="Arial" w:hAnsi="Arial" w:cs="Arial"/>
+                <w:sz w:val="22"/>
+                <w:szCs w:val="22"/>
+              </w:rPr>
+              <w:t xml:space="preserve">75</w:t>
+            </w:r>
+            <w:r>
+              <w:rPr>
+                <w:rFonts w:ascii="Arial" w:hAnsi="Arial" w:cs="Arial"/>
+                <w:sz w:val="22"/>
+                <w:szCs w:val="22"/>
+                <w:rtl/>
+              </w:rPr>
+              <w:t xml:space="preserve"> حالة أوقفت </w:t>
+            </w:r>
+            <w:r>
+              <w:rPr>
+                <w:rFonts w:ascii="Arial" w:hAnsi="Arial" w:cs="Arial"/>
+                <w:sz w:val="22"/>
+                <w:szCs w:val="22"/>
+              </w:rPr>
+              <w:t xml:space="preserve">268</w:t>
+            </w:r>
+            <w:r>
+              <w:rPr>
+                <w:rFonts w:ascii="Arial" w:hAnsi="Arial" w:cs="Arial"/>
+                <w:sz w:val="22"/>
+                <w:szCs w:val="22"/>
+                <w:rtl/>
+              </w:rPr>
+              <w:t xml:space="preserve"> خدمة مقابل </w:t>
+            </w:r>
+            <w:r>
+              <w:rPr>
+                <w:rFonts w:ascii="Arial" w:hAnsi="Arial" w:cs="Arial"/>
+                <w:sz w:val="22"/>
+                <w:szCs w:val="22"/>
+              </w:rPr>
+              <w:t xml:space="preserve">70</w:t>
+            </w:r>
+            <w:r>
+              <w:rPr>
+                <w:rFonts w:ascii="Arial" w:hAnsi="Arial" w:cs="Arial"/>
+                <w:sz w:val="22"/>
+                <w:szCs w:val="22"/>
+                <w:rtl/>
+              </w:rPr>
+              <w:t xml:space="preserve"> لـ</w:t>
+            </w:r>
+            <w:r>
+              <w:rPr>
+                <w:rFonts w:ascii="Arial" w:hAnsi="Arial" w:cs="Arial"/>
+                <w:sz w:val="22"/>
+                <w:szCs w:val="22"/>
+              </w:rPr>
+              <w:t xml:space="preserve">ACRS</w:t>
+            </w:r>
+            <w:r>
+              <w:rPr>
+                <w:rFonts w:ascii="Arial" w:hAnsi="Arial" w:cs="Arial"/>
+                <w:sz w:val="22"/>
+                <w:szCs w:val="22"/>
+                <w:rtl/>
+              </w:rPr>
+              <w:t xml:space="preserve">، واتخذت مع السيناريوهات الواقعية </w:t>
+            </w:r>
+            <w:r>
+              <w:rPr>
+                <w:rFonts w:ascii="Arial" w:hAnsi="Arial" w:cs="Arial"/>
+                <w:sz w:val="22"/>
+                <w:szCs w:val="22"/>
+              </w:rPr>
+              <w:t xml:space="preserve">13</w:t>
+            </w:r>
+            <w:r>
+              <w:rPr>
+                <w:rFonts w:ascii="Arial" w:hAnsi="Arial" w:cs="Arial"/>
+                <w:sz w:val="22"/>
+                <w:szCs w:val="22"/>
+                <w:rtl/>
+              </w:rPr>
+              <w:t xml:space="preserve"> قرارًا غير آمن مقابل </w:t>
+            </w:r>
+            <w:r>
+              <w:rPr>
+                <w:rFonts w:ascii="Arial" w:hAnsi="Arial" w:cs="Arial"/>
+                <w:sz w:val="22"/>
+                <w:szCs w:val="22"/>
+              </w:rPr>
+              <w:t xml:space="preserve">0</w:t>
+            </w:r>
+            <w:r>
+              <w:rPr>
+                <w:rFonts w:ascii="Arial" w:hAnsi="Arial" w:cs="Arial"/>
+                <w:sz w:val="22"/>
+                <w:szCs w:val="22"/>
+                <w:rtl/>
+              </w:rPr>
+              <w:t xml:space="preserve">.</w:t>
+            </w:r>
+          </w:p>
+          <w:p>
+            <w:pPr>
+              <w:bidi/>
+              <w:spacing w:after="100" w:line="300" w:lineRule="auto"/>
+              <w:jc w:val="both"/>
+              <w:rPr>
+                <w:rFonts w:ascii="Arial" w:hAnsi="Arial" w:cs="Arial"/>
+                <w:sz w:val="22"/>
+                <w:szCs w:val="22"/>
+                <w:rtl/>
+              </w:rPr>
+            </w:pPr>
+            <w:r>
+              <w:rPr>
+                <w:rFonts w:ascii="Arial" w:hAnsi="Arial" w:cs="Arial"/>
+                <w:b/>
+                <w:bCs/>
+                <w:sz w:val="22"/>
+                <w:szCs w:val="22"/>
+                <w:rtl/>
+              </w:rPr>
               <w:t xml:space="preserve">أين الإضافة إذن؟</w:t>
             </w:r>
             <w:r>
@@ -9965,7 +10111,7 @@
                 <w:szCs w:val="22"/>
                 <w:rtl/>
               </w:rPr>
-              <w:t xml:space="preserve"> لأنها صياغة واحدة تحلها الحلّالات الدقيقة والتقريبية والكمّية، فنتحقق من كل قرار بأكثر من طريقة. ولا ندّعي أن </w:t>
+              <w:t xml:space="preserve"> لأن الحلّالات الدقيقة والتقريبية والكمّية تحلها كلها، فنتحقق من القرار بأكثر من طريقة. ولا ندّعي أن </w:t>
             </w:r>
             <w:r>
               <w:rPr>
@@ -13327,236 +13473,32 @@
                 <w:szCs w:val="22"/>
                 <w:rtl/>
               </w:rPr>
-              <w:t xml:space="preserve"> سيناريو تطوير، ثم كان كل اختبار على بيانات جديدة ببذرة لم تُستخدم: </w:t>
-            </w:r>
-            <w:r>
-              <w:rPr>
-                <w:rFonts w:ascii="Arial" w:hAnsi="Arial" w:cs="Arial"/>
-                <w:sz w:val="22"/>
-                <w:szCs w:val="22"/>
-              </w:rPr>
-              <w:t xml:space="preserve">482</w:t>
-            </w:r>
-            <w:r>
-              <w:rPr>
-                <w:rFonts w:ascii="Arial" w:hAnsi="Arial" w:cs="Arial"/>
-                <w:sz w:val="22"/>
-                <w:szCs w:val="22"/>
-                <w:rtl/>
-              </w:rPr>
-              <w:t xml:space="preserve"> (بذرة </w:t>
-            </w:r>
-            <w:r>
-              <w:rPr>
-                <w:rFonts w:ascii="Arial" w:hAnsi="Arial" w:cs="Arial"/>
-                <w:sz w:val="22"/>
-                <w:szCs w:val="22"/>
-              </w:rPr>
-              <w:t xml:space="preserve">9001)</w:t>
-            </w:r>
-            <w:r>
-              <w:rPr>
-                <w:rFonts w:ascii="Arial" w:hAnsi="Arial" w:cs="Arial"/>
-                <w:sz w:val="22"/>
-                <w:szCs w:val="22"/>
-                <w:rtl/>
-              </w:rPr>
-              <w:t xml:space="preserve">، و</w:t>
-            </w:r>
-            <w:r>
-              <w:rPr>
-                <w:rFonts w:ascii="Arial" w:hAnsi="Arial" w:cs="Arial"/>
-                <w:sz w:val="22"/>
-                <w:szCs w:val="22"/>
-              </w:rPr>
-              <w:t xml:space="preserve">456 (9002)</w:t>
-            </w:r>
-            <w:r>
-              <w:rPr>
-                <w:rFonts w:ascii="Arial" w:hAnsi="Arial" w:cs="Arial"/>
-                <w:sz w:val="22"/>
-                <w:szCs w:val="22"/>
-                <w:rtl/>
-              </w:rPr>
-              <w:t xml:space="preserve">، و</w:t>
-            </w:r>
-            <w:r>
-              <w:rPr>
-                <w:rFonts w:ascii="Arial" w:hAnsi="Arial" w:cs="Arial"/>
-                <w:sz w:val="22"/>
-                <w:szCs w:val="22"/>
-              </w:rPr>
-              <w:t xml:space="preserve">291</w:t>
-            </w:r>
-            <w:r>
-              <w:rPr>
-                <w:rFonts w:ascii="Arial" w:hAnsi="Arial" w:cs="Arial"/>
-                <w:sz w:val="22"/>
-                <w:szCs w:val="22"/>
-                <w:rtl/>
-              </w:rPr>
-              <w:t xml:space="preserve"> سلسلة (</w:t>
-            </w:r>
-            <w:r>
-              <w:rPr>
-                <w:rFonts w:ascii="Arial" w:hAnsi="Arial" w:cs="Arial"/>
-                <w:sz w:val="22"/>
-                <w:szCs w:val="22"/>
-              </w:rPr>
-              <w:t xml:space="preserve">7007)</w:t>
-            </w:r>
-            <w:r>
-              <w:rPr>
-                <w:rFonts w:ascii="Arial" w:hAnsi="Arial" w:cs="Arial"/>
-                <w:sz w:val="22"/>
-                <w:szCs w:val="22"/>
-                <w:rtl/>
-              </w:rPr>
-              <w:t xml:space="preserve">، و</w:t>
-            </w:r>
-            <w:r>
-              <w:rPr>
-                <w:rFonts w:ascii="Arial" w:hAnsi="Arial" w:cs="Arial"/>
-                <w:sz w:val="22"/>
-                <w:szCs w:val="22"/>
-              </w:rPr>
-              <w:t xml:space="preserve">259</w:t>
-            </w:r>
-            <w:r>
-              <w:rPr>
-                <w:rFonts w:ascii="Arial" w:hAnsi="Arial" w:cs="Arial"/>
-                <w:sz w:val="22"/>
-                <w:szCs w:val="22"/>
-                <w:rtl/>
-              </w:rPr>
-              <w:t xml:space="preserve"> سلسلة + </w:t>
-            </w:r>
-            <w:r>
-              <w:rPr>
-                <w:rFonts w:ascii="Arial" w:hAnsi="Arial" w:cs="Arial"/>
-                <w:sz w:val="22"/>
-                <w:szCs w:val="22"/>
-              </w:rPr>
-              <w:t xml:space="preserve">428</w:t>
-            </w:r>
-            <w:r>
-              <w:rPr>
-                <w:rFonts w:ascii="Arial" w:hAnsi="Arial" w:cs="Arial"/>
-                <w:sz w:val="22"/>
-                <w:szCs w:val="22"/>
-                <w:rtl/>
-              </w:rPr>
-              <w:t xml:space="preserve"> عشوائيًا (</w:t>
-            </w:r>
-            <w:r>
-              <w:rPr>
-                <w:rFonts w:ascii="Arial" w:hAnsi="Arial" w:cs="Arial"/>
-                <w:sz w:val="22"/>
-                <w:szCs w:val="22"/>
-              </w:rPr>
-              <w:t xml:space="preserve">7008/9003)</w:t>
-            </w:r>
-            <w:r>
-              <w:rPr>
-                <w:rFonts w:ascii="Arial" w:hAnsi="Arial" w:cs="Arial"/>
-                <w:sz w:val="22"/>
-                <w:szCs w:val="22"/>
-                <w:rtl/>
-              </w:rPr>
-              <w:t xml:space="preserve">، و</w:t>
-            </w:r>
-            <w:r>
-              <w:rPr>
-                <w:rFonts w:ascii="Arial" w:hAnsi="Arial" w:cs="Arial"/>
-                <w:sz w:val="22"/>
-                <w:szCs w:val="22"/>
-              </w:rPr>
-              <w:t xml:space="preserve">200</w:t>
-            </w:r>
-            <w:r>
-              <w:rPr>
-                <w:rFonts w:ascii="Arial" w:hAnsi="Arial" w:cs="Arial"/>
-                <w:sz w:val="22"/>
-                <w:szCs w:val="22"/>
-                <w:rtl/>
-              </w:rPr>
-              <w:t xml:space="preserve"> هجوم صحي، ثم للتأكيد </w:t>
-            </w:r>
-            <w:r>
-              <w:rPr>
-                <w:rFonts w:ascii="Arial" w:hAnsi="Arial" w:cs="Arial"/>
-                <w:sz w:val="22"/>
-                <w:szCs w:val="22"/>
-              </w:rPr>
-              <w:t xml:space="preserve">253 + 412 + 187</w:t>
-            </w:r>
-            <w:r>
-              <w:rPr>
-                <w:rFonts w:ascii="Arial" w:hAnsi="Arial" w:cs="Arial"/>
-                <w:sz w:val="22"/>
-                <w:szCs w:val="22"/>
-                <w:rtl/>
-              </w:rPr>
-              <w:t xml:space="preserve">، وفي </w:t>
-            </w:r>
-            <w:r>
-              <w:rPr>
-                <w:rFonts w:ascii="Arial" w:hAnsi="Arial" w:cs="Arial"/>
-                <w:sz w:val="22"/>
-                <w:szCs w:val="22"/>
-              </w:rPr>
-              <w:t xml:space="preserve">v10</w:t>
-            </w:r>
-            <w:r>
-              <w:rPr>
-                <w:rFonts w:ascii="Arial" w:hAnsi="Arial" w:cs="Arial"/>
-                <w:sz w:val="22"/>
-                <w:szCs w:val="22"/>
-                <w:rtl/>
-              </w:rPr>
-              <w:t xml:space="preserve"> ثلاث شبكات قطاعية (</w:t>
-            </w:r>
-            <w:r>
-              <w:rPr>
-                <w:rFonts w:ascii="Arial" w:hAnsi="Arial" w:cs="Arial"/>
-                <w:sz w:val="22"/>
-                <w:szCs w:val="22"/>
-              </w:rPr>
-              <w:t xml:space="preserve">577</w:t>
-            </w:r>
-            <w:r>
-              <w:rPr>
-                <w:rFonts w:ascii="Arial" w:hAnsi="Arial" w:cs="Arial"/>
-                <w:sz w:val="22"/>
-                <w:szCs w:val="22"/>
-                <w:rtl/>
-              </w:rPr>
-              <w:t xml:space="preserve"> سلسلة + </w:t>
-            </w:r>
-            <w:r>
-              <w:rPr>
-                <w:rFonts w:ascii="Arial" w:hAnsi="Arial" w:cs="Arial"/>
-                <w:sz w:val="22"/>
-                <w:szCs w:val="22"/>
-              </w:rPr>
-              <w:t xml:space="preserve">594</w:t>
-            </w:r>
-            <w:r>
-              <w:rPr>
-                <w:rFonts w:ascii="Arial" w:hAnsi="Arial" w:cs="Arial"/>
-                <w:sz w:val="22"/>
-                <w:szCs w:val="22"/>
-                <w:rtl/>
-              </w:rPr>
-              <w:t xml:space="preserve"> عشوائيًا). والسلاسل مربوطة بتقنيات </w:t>
-            </w:r>
-            <w:r>
-              <w:rPr>
-                <w:rFonts w:ascii="Arial" w:hAnsi="Arial" w:cs="Arial"/>
-                <w:sz w:val="22"/>
-                <w:szCs w:val="22"/>
-              </w:rPr>
-              <w:t xml:space="preserve">MITRE ATT&amp;CK [30]</w:t>
+              <w:t xml:space="preserve"> سيناريو تطوير فقط، ثم كان كل اختبار على بيانات جديدة ببذرة لم تُستخدم (أكثر من </w:t>
+            </w:r>
+            <w:r>
+              <w:rPr>
+                <w:rFonts w:ascii="Arial" w:hAnsi="Arial" w:cs="Arial"/>
+                <w:sz w:val="22"/>
+                <w:szCs w:val="22"/>
+              </w:rPr>
+              <w:t xml:space="preserve">4,000</w:t>
+            </w:r>
+            <w:r>
+              <w:rPr>
+                <w:rFonts w:ascii="Arial" w:hAnsi="Arial" w:cs="Arial"/>
+                <w:sz w:val="22"/>
+                <w:szCs w:val="22"/>
+                <w:rtl/>
+              </w:rPr>
+              <w:t xml:space="preserve"> سيناريو تركيبي؛ العينات النهائية وبذورها في جدول المجموعات، وكل بذرة في ملف تسجيلها). والسلاسل مربوطة بتقنيات </w:t>
+            </w:r>
+            <w:r>
+              <w:rPr>
+                <w:rFonts w:ascii="Arial" w:hAnsi="Arial" w:cs="Arial"/>
+                <w:sz w:val="22"/>
+                <w:szCs w:val="22"/>
+              </w:rPr>
+              <w:t xml:space="preserve">MITRE ATT&amp;CK [31]</w:t>
             </w:r>
             <w:r>
               <w:rPr>
@@ -13760,7 +13702,7 @@
                 <w:sz w:val="22"/>
                 <w:szCs w:val="22"/>
               </w:rPr>
-              <w:t xml:space="preserve">PwC [31]</w:t>
+              <w:t xml:space="preserve">PwC [32]</w:t>
             </w:r>
             <w:r>
               <w:rPr>
@@ -13777,7 +13719,7 @@
                 <w:sz w:val="22"/>
                 <w:szCs w:val="22"/>
               </w:rPr>
-              <w:t xml:space="preserve">The DFIR Report [32]</w:t>
+              <w:t xml:space="preserve">The DFIR Report [33]</w:t>
             </w:r>
             <w:r>
               <w:rPr>
@@ -13794,7 +13736,7 @@
                 <w:sz w:val="22"/>
                 <w:szCs w:val="22"/>
               </w:rPr>
-              <w:t xml:space="preserve">MITRE Attack Flow [33]</w:t>
+              <w:t xml:space="preserve">MITRE Attack Flow [34]</w:t>
             </w:r>
             <w:r>
               <w:rPr>
@@ -13811,7 +13753,7 @@
                 <w:sz w:val="22"/>
                 <w:szCs w:val="22"/>
               </w:rPr>
-              <w:t xml:space="preserve">CISA [34]: 8</w:t>
+              <w:t xml:space="preserve">CISA [35]: 8</w:t>
             </w:r>
             <w:r>
               <w:rPr>
@@ -14241,7 +14183,7 @@
                 <w:sz w:val="22"/>
                 <w:szCs w:val="22"/>
               </w:rPr>
-              <w:t xml:space="preserve">HiGHS [26]</w:t>
+              <w:t xml:space="preserve">HiGHS [27]</w:t>
             </w:r>
             <w:r>
               <w:rPr>
@@ -14420,7 +14362,7 @@
                 <w:sz w:val="22"/>
                 <w:szCs w:val="22"/>
               </w:rPr>
-              <w:t xml:space="preserve">CVaR [35])</w:t>
+              <w:t xml:space="preserve">CVaR [36])</w:t>
             </w:r>
             <w:r>
               <w:rPr>
@@ -16422,6 +16364,15 @@
                       <w:rFonts w:ascii="Arial" w:hAnsi="Arial" w:cs="Arial"/>
                       <w:sz w:val="19"/>
                       <w:szCs w:val="19"/>
+                      <w:rtl/>
+                    </w:rPr>
+                    <w:t xml:space="preserve">نسبة إلى العزل الكامل: </w:t>
+                  </w:r>
+                  <w:r>
+                    <w:rPr>
+                      <w:rFonts w:ascii="Arial" w:hAnsi="Arial" w:cs="Arial"/>
+                      <w:sz w:val="19"/>
+                      <w:szCs w:val="19"/>
                     </w:rPr>
                     <w:t xml:space="preserve">0.977 (0.95–0.99)</w:t>
                   </w:r>
@@ -16432,23 +16383,6 @@
                       <w:szCs w:val="19"/>
                       <w:rtl/>
                     </w:rPr>
-                    <w:t xml:space="preserve">؛ التقارير المنشورة: احتواء تلقائي </w:t>
-                  </w:r>
-                  <w:r>
-                    <w:rPr>
-                      <w:rFonts w:ascii="Arial" w:hAnsi="Arial" w:cs="Arial"/>
-                      <w:sz w:val="19"/>
-                      <w:szCs w:val="19"/>
-                    </w:rPr>
-                    <w:t xml:space="preserve">0.91 (0.86–0.94)</w:t>
-                  </w:r>
-                  <w:r>
-                    <w:rPr>
-                      <w:rFonts w:ascii="Arial" w:hAnsi="Arial" w:cs="Arial"/>
-                      <w:sz w:val="19"/>
-                      <w:szCs w:val="19"/>
-                      <w:rtl/>
-                    </w:rPr>
                     <w:t xml:space="preserve">؛ بنك </w:t>
                   </w:r>
                   <w:r>
@@ -16492,6 +16426,15 @@
                       <w:szCs w:val="19"/>
                     </w:rPr>
                     <w:t xml:space="preserve">0.792 (0.73–0.84)</w:t>
+                  </w:r>
+                  <w:r>
+                    <w:rPr>
+                      <w:rFonts w:ascii="Arial" w:hAnsi="Arial" w:cs="Arial"/>
+                      <w:sz w:val="19"/>
+                      <w:szCs w:val="19"/>
+                      <w:rtl/>
+                    </w:rPr>
+                    <w:t xml:space="preserve">. والخدمات المتوقفة أقل في كل مجموعة</w:t>
                   </w:r>
                 </w:p>
               </w:tc>
@@ -16518,7 +16461,24 @@
                       <w:szCs w:val="19"/>
                       <w:rtl/>
                     </w:rPr>
-                    <w:t xml:space="preserve">تحققت عدا المصنع؛ الجامعة والمصنع غير حاسمتين</w:t>
+                    <w:t xml:space="preserve">تحققت عدا المصنع (أقل من </w:t>
+                  </w:r>
+                  <w:r>
+                    <w:rPr>
+                      <w:rFonts w:ascii="Arial" w:hAnsi="Arial" w:cs="Arial"/>
+                      <w:sz w:val="19"/>
+                      <w:szCs w:val="19"/>
+                    </w:rPr>
+                    <w:t xml:space="preserve">0.80</w:t>
+                  </w:r>
+                  <w:r>
+                    <w:rPr>
+                      <w:rFonts w:ascii="Arial" w:hAnsi="Arial" w:cs="Arial"/>
+                      <w:sz w:val="19"/>
+                      <w:szCs w:val="19"/>
+                      <w:rtl/>
+                    </w:rPr>
+                    <w:t xml:space="preserve">، والفترة تشمله)</w:t>
                   </w:r>
                 </w:p>
               </w:tc>
@@ -17150,15 +17110,32 @@
                       <w:szCs w:val="19"/>
                       <w:rtl/>
                     </w:rPr>
-                    <w:t xml:space="preserve">أسوأ حالة في بحث شامل: </w:t>
-                  </w:r>
-                  <w:r>
-                    <w:rPr>
-                      <w:rFonts w:ascii="Arial" w:hAnsi="Arial" w:cs="Arial"/>
-                      <w:sz w:val="19"/>
-                      <w:szCs w:val="19"/>
-                    </w:rPr>
-                    <w:t xml:space="preserve">0</w:t>
+                    <w:t xml:space="preserve">أسوأ حالة في بحث شامل على شبكتي </w:t>
+                  </w:r>
+                  <w:r>
+                    <w:rPr>
+                      <w:rFonts w:ascii="Arial" w:hAnsi="Arial" w:cs="Arial"/>
+                      <w:sz w:val="19"/>
+                      <w:szCs w:val="19"/>
+                    </w:rPr>
+                    <w:t xml:space="preserve">12</w:t>
+                  </w:r>
+                  <w:r>
+                    <w:rPr>
+                      <w:rFonts w:ascii="Arial" w:hAnsi="Arial" w:cs="Arial"/>
+                      <w:sz w:val="19"/>
+                      <w:szCs w:val="19"/>
+                      <w:rtl/>
+                    </w:rPr>
+                    <w:t xml:space="preserve"> و</w:t>
+                  </w:r>
+                  <w:r>
+                    <w:rPr>
+                      <w:rFonts w:ascii="Arial" w:hAnsi="Arial" w:cs="Arial"/>
+                      <w:sz w:val="19"/>
+                      <w:szCs w:val="19"/>
+                    </w:rPr>
+                    <w:t xml:space="preserve">22: 0</w:t>
                   </w:r>
                   <w:r>
                     <w:rPr>
@@ -17202,7 +17179,7 @@
                       <w:szCs w:val="19"/>
                       <w:rtl/>
                     </w:rPr>
-                    <w:t xml:space="preserve">تحققت</w:t>
+                    <w:t xml:space="preserve">تحققت؛ مهاجم يعرف الكود لم يُختبر بعد</w:t>
                   </w:r>
                 </w:p>
               </w:tc>
@@ -17257,7 +17234,126 @@
                 <w:szCs w:val="22"/>
                 <w:rtl/>
               </w:rPr>
-              <w:t xml:space="preserve">، فالفرق عن الحد غير حاسم في الاتجاهين.</w:t>
+              <w:t xml:space="preserve">؛ فنعدّ الجامعة نجاحًا غير حاسم، والمصنع فشلًا بالقيمة المسجّلة. وعلى الـ</w:t>
+            </w:r>
+            <w:r>
+              <w:rPr>
+                <w:rFonts w:ascii="Arial" w:hAnsi="Arial" w:cs="Arial"/>
+                <w:sz w:val="22"/>
+                <w:szCs w:val="22"/>
+              </w:rPr>
+              <w:t xml:space="preserve">75</w:t>
+            </w:r>
+            <w:r>
+              <w:rPr>
+                <w:rFonts w:ascii="Arial" w:hAnsi="Arial" w:cs="Arial"/>
+                <w:sz w:val="22"/>
+                <w:szCs w:val="22"/>
+                <w:rtl/>
+              </w:rPr>
+              <w:t xml:space="preserve"> حالة من التقارير المنشورة احتُوي </w:t>
+            </w:r>
+            <w:r>
+              <w:rPr>
+                <w:rFonts w:ascii="Arial" w:hAnsi="Arial" w:cs="Arial"/>
+                <w:sz w:val="22"/>
+                <w:szCs w:val="22"/>
+              </w:rPr>
+              <w:t xml:space="preserve">188</w:t>
+            </w:r>
+            <w:r>
+              <w:rPr>
+                <w:rFonts w:ascii="Arial" w:hAnsi="Arial" w:cs="Arial"/>
+                <w:sz w:val="22"/>
+                <w:szCs w:val="22"/>
+                <w:rtl/>
+              </w:rPr>
+              <w:t xml:space="preserve"> من </w:t>
+            </w:r>
+            <w:r>
+              <w:rPr>
+                <w:rFonts w:ascii="Arial" w:hAnsi="Arial" w:cs="Arial"/>
+                <w:sz w:val="22"/>
+                <w:szCs w:val="22"/>
+              </w:rPr>
+              <w:t xml:space="preserve">207</w:t>
+            </w:r>
+            <w:r>
+              <w:rPr>
+                <w:rFonts w:ascii="Arial" w:hAnsi="Arial" w:cs="Arial"/>
+                <w:sz w:val="22"/>
+                <w:szCs w:val="22"/>
+                <w:rtl/>
+              </w:rPr>
+              <w:t xml:space="preserve"> لحظات تلقائيًا (</w:t>
+            </w:r>
+            <w:r>
+              <w:rPr>
+                <w:rFonts w:ascii="Arial" w:hAnsi="Arial" w:cs="Arial"/>
+                <w:sz w:val="22"/>
+                <w:szCs w:val="22"/>
+              </w:rPr>
+              <w:t xml:space="preserve">91%</w:t>
+            </w:r>
+            <w:r>
+              <w:rPr>
+                <w:rFonts w:ascii="Arial" w:hAnsi="Arial" w:cs="Arial"/>
+                <w:sz w:val="22"/>
+                <w:szCs w:val="22"/>
+                <w:rtl/>
+              </w:rPr>
+              <w:t xml:space="preserve">، </w:t>
+            </w:r>
+            <w:r>
+              <w:rPr>
+                <w:rFonts w:ascii="Arial" w:hAnsi="Arial" w:cs="Arial"/>
+                <w:sz w:val="22"/>
+                <w:szCs w:val="22"/>
+              </w:rPr>
+              <w:t xml:space="preserve">0.86–0.94)</w:t>
+            </w:r>
+            <w:r>
+              <w:rPr>
+                <w:rFonts w:ascii="Arial" w:hAnsi="Arial" w:cs="Arial"/>
+                <w:sz w:val="22"/>
+                <w:szCs w:val="22"/>
+                <w:rtl/>
+              </w:rPr>
+              <w:t xml:space="preserve"> والباقي </w:t>
+            </w:r>
+            <w:r>
+              <w:rPr>
+                <w:rFonts w:ascii="Arial" w:hAnsi="Arial" w:cs="Arial"/>
+                <w:sz w:val="22"/>
+                <w:szCs w:val="22"/>
+              </w:rPr>
+              <w:t xml:space="preserve">19</w:t>
+            </w:r>
+            <w:r>
+              <w:rPr>
+                <w:rFonts w:ascii="Arial" w:hAnsi="Arial" w:cs="Arial"/>
+                <w:sz w:val="22"/>
+                <w:szCs w:val="22"/>
+                <w:rtl/>
+              </w:rPr>
+              <w:t xml:space="preserve"> بإحالة للبشر، فالاحتواء الكلي </w:t>
+            </w:r>
+            <w:r>
+              <w:rPr>
+                <w:rFonts w:ascii="Arial" w:hAnsi="Arial" w:cs="Arial"/>
+                <w:sz w:val="22"/>
+                <w:szCs w:val="22"/>
+              </w:rPr>
+              <w:t xml:space="preserve">207/207</w:t>
+            </w:r>
+            <w:r>
+              <w:rPr>
+                <w:rFonts w:ascii="Arial" w:hAnsi="Arial" w:cs="Arial"/>
+                <w:sz w:val="22"/>
+                <w:szCs w:val="22"/>
+                <w:rtl/>
+              </w:rPr>
+              <w:t xml:space="preserve">.</w:t>
             </w:r>
           </w:p>
           <w:p>
@@ -17335,6 +17431,38 @@
                 <w:szCs w:val="19"/>
               </w:rPr>
               <w:t xml:space="preserve">7008)</w:t>
+            </w:r>
+            <w:r>
+              <w:rPr>
+                <w:rFonts w:ascii="Arial" w:hAnsi="Arial" w:cs="Arial"/>
+                <w:b/>
+                <w:bCs/>
+                <w:sz w:val="19"/>
+                <w:szCs w:val="19"/>
+                <w:rtl/>
+              </w:rPr>
+              <w:t xml:space="preserve">. العزل الكامل يحتوي الكل، لكن </w:t>
+            </w:r>
+            <w:r>
+              <w:rPr>
+                <w:rFonts w:ascii="Arial" w:hAnsi="Arial" w:cs="Arial"/>
+                <w:b/>
+                <w:bCs/>
+                <w:sz w:val="19"/>
+                <w:szCs w:val="19"/>
+              </w:rPr>
+              <w:t xml:space="preserve">164</w:t>
+            </w:r>
+            <w:r>
+              <w:rPr>
+                <w:rFonts w:ascii="Arial" w:hAnsi="Arial" w:cs="Arial"/>
+                <w:b/>
+                <w:bCs/>
+                <w:sz w:val="19"/>
+                <w:szCs w:val="19"/>
+                <w:rtl/>
+              </w:rPr>
+              <w:t xml:space="preserve"> منها لا تُنفَّذ إلا بموافقة البشر لأنها تمس أجهزة حرجة</w:t>
             </w:r>
           </w:p>
           <w:tbl>
@@ -19690,7 +19818,17 @@
                       <w:szCs w:val="19"/>
                       <w:rtl/>
                     </w:rPr>
-                    <w:t xml:space="preserve">عزل كل مُنبَّه عليه</w:t>
+                    <w:t xml:space="preserve">عزل كل مُنبَّه عليه (نمط </w:t>
+                  </w:r>
+                  <w:r>
+                    <w:rPr>
+                      <w:rFonts w:ascii="Arial" w:hAnsi="Arial" w:cs="Arial"/>
+                      <w:b/>
+                      <w:bCs/>
+                      <w:sz w:val="19"/>
+                      <w:szCs w:val="19"/>
+                    </w:rPr>
+                    <w:t xml:space="preserve">Wazuh)</w:t>
                   </w:r>
                 </w:p>
               </w:tc>
@@ -21020,7 +21158,24 @@
                 <w:szCs w:val="22"/>
                 <w:rtl/>
               </w:rPr>
-              <w:t xml:space="preserve">. أما «عزل كل مُنبَّه عليه» فاتخذ </w:t>
+              <w:t xml:space="preserve">. أما «عزل كل مُنبَّه عليه» (نمط </w:t>
+            </w:r>
+            <w:r>
+              <w:rPr>
+                <w:rFonts w:ascii="Arial" w:hAnsi="Arial" w:cs="Arial"/>
+                <w:sz w:val="22"/>
+                <w:szCs w:val="22"/>
+              </w:rPr>
+              <w:t xml:space="preserve">Wazuh)</w:t>
+            </w:r>
+            <w:r>
+              <w:rPr>
+                <w:rFonts w:ascii="Arial" w:hAnsi="Arial" w:cs="Arial"/>
+                <w:sz w:val="22"/>
+                <w:szCs w:val="22"/>
+                <w:rtl/>
+              </w:rPr>
+              <w:t xml:space="preserve"> فاتخذ </w:t>
             </w:r>
             <w:r>
               <w:rPr>
@@ -21071,7 +21226,41 @@
                 <w:szCs w:val="22"/>
                 <w:rtl/>
               </w:rPr>
-              <w:t xml:space="preserve"> حقيقيًا)، وترك </w:t>
+              <w:t xml:space="preserve"> حقيقيًا)، و</w:t>
+            </w:r>
+            <w:r>
+              <w:rPr>
+                <w:rFonts w:ascii="Arial" w:hAnsi="Arial" w:cs="Arial"/>
+                <w:sz w:val="22"/>
+                <w:szCs w:val="22"/>
+              </w:rPr>
+              <w:t xml:space="preserve">182</w:t>
+            </w:r>
+            <w:r>
+              <w:rPr>
+                <w:rFonts w:ascii="Arial" w:hAnsi="Arial" w:cs="Arial"/>
+                <w:sz w:val="22"/>
+                <w:szCs w:val="22"/>
+                <w:rtl/>
+              </w:rPr>
+              <w:t xml:space="preserve"> على </w:t>
+            </w:r>
+            <w:r>
+              <w:rPr>
+                <w:rFonts w:ascii="Arial" w:hAnsi="Arial" w:cs="Arial"/>
+                <w:sz w:val="22"/>
+                <w:szCs w:val="22"/>
+              </w:rPr>
+              <w:t xml:space="preserve">412</w:t>
+            </w:r>
+            <w:r>
+              <w:rPr>
+                <w:rFonts w:ascii="Arial" w:hAnsi="Arial" w:cs="Arial"/>
+                <w:sz w:val="22"/>
+                <w:szCs w:val="22"/>
+                <w:rtl/>
+              </w:rPr>
+              <w:t xml:space="preserve"> هجومًا عشوائيًا، وترك </w:t>
             </w:r>
             <w:r>
               <w:rPr>
@@ -21232,7 +21421,7 @@
                 <w:sz w:val="22"/>
                 <w:szCs w:val="22"/>
               </w:rPr>
-              <w:t xml:space="preserve">[31]</w:t>
+              <w:t xml:space="preserve">[32]</w:t>
             </w:r>
             <w:r>
               <w:rPr>
@@ -21585,7 +21774,7 @@
                       <w:szCs w:val="19"/>
                       <w:rtl/>
                     </w:rPr>
-                    <w:t xml:space="preserve">كشف التزوير (مستشعر شبكة مستقل)</w:t>
+                    <w:t xml:space="preserve">كشف التزوير (مستشعر شبكة مستقل؛ الحقن الذكي ما زال أضعف)</w:t>
                   </w:r>
                 </w:p>
               </w:tc>
@@ -24057,7 +24246,7 @@
                 <w:sz w:val="22"/>
                 <w:szCs w:val="22"/>
               </w:rPr>
-              <w:t xml:space="preserve">ML-DSA-65 [36] (71–98</w:t>
+              <w:t xml:space="preserve">ML-DSA-65 [37] (71–98</w:t>
             </w:r>
             <w:r>
               <w:rPr>
@@ -24298,7 +24487,7 @@
                 <w:sz w:val="22"/>
                 <w:szCs w:val="22"/>
               </w:rPr>
-              <w:t xml:space="preserve">[14]</w:t>
+              <w:t xml:space="preserve">[15]</w:t>
             </w:r>
             <w:r>
               <w:rPr>
@@ -24315,7 +24504,7 @@
                 <w:sz w:val="22"/>
                 <w:szCs w:val="22"/>
               </w:rPr>
-              <w:t xml:space="preserve">[15]</w:t>
+              <w:t xml:space="preserve">[16]</w:t>
             </w:r>
             <w:r>
               <w:rPr>
@@ -24349,7 +24538,7 @@
                 <w:sz w:val="22"/>
                 <w:szCs w:val="22"/>
               </w:rPr>
-              <w:t xml:space="preserve">[16][17]</w:t>
+              <w:t xml:space="preserve">[17][18]</w:t>
             </w:r>
             <w:r>
               <w:rPr>
@@ -24366,7 +24555,7 @@
                 <w:sz w:val="22"/>
                 <w:szCs w:val="22"/>
               </w:rPr>
-              <w:t xml:space="preserve">[21]</w:t>
+              <w:t xml:space="preserve">[22]</w:t>
             </w:r>
             <w:r>
               <w:rPr>
@@ -24624,7 +24813,7 @@
                 <w:sz w:val="22"/>
                 <w:szCs w:val="22"/>
               </w:rPr>
-              <w:t xml:space="preserve">[16]</w:t>
+              <w:t xml:space="preserve">[17]</w:t>
             </w:r>
             <w:r>
               <w:rPr>
@@ -24776,7 +24965,7 @@
                 <w:sz w:val="22"/>
                 <w:szCs w:val="22"/>
               </w:rPr>
-              <w:t xml:space="preserve">[37]</w:t>
+              <w:t xml:space="preserve">[38]</w:t>
             </w:r>
             <w:r>
               <w:rPr>
@@ -25724,7 +25913,7 @@
                       <w:szCs w:val="19"/>
                       <w:rtl/>
                     </w:rPr>
-                    <w:t xml:space="preserve">نوفمبر </w:t>
+                    <w:t xml:space="preserve">نوفمبر – ديسمبر </w:t>
                   </w:r>
                   <w:r>
                     <w:rPr>
@@ -26167,7 +26356,7 @@
                       <w:sz w:val="19"/>
                       <w:szCs w:val="19"/>
                     </w:rPr>
-                    <w:t xml:space="preserve">CIC-IDS2017 [38])</w:t>
+                    <w:t xml:space="preserve">CIC-IDS2017 [39])</w:t>
                   </w:r>
                   <w:r>
                     <w:rPr>
@@ -27142,7 +27331,7 @@
                 <w:sz w:val="19"/>
                 <w:szCs w:val="19"/>
               </w:rPr>
-              <w:t xml:space="preserve">[14]  Microsoft. (n.d.). Automatic attack disruption in Microsoft Defender; Exclude assets from automated response in attack disruption. Microsoft Learn. Retrieved October 14, 2026, from https://learn.microsoft.com/en-us/defender-xdr/automatic-attack-disruption-exclusions</w:t>
+              <w:t xml:space="preserve">[14]  Wazuh. (2025). Active Response. Wazuh documentation. https://documentation.wazuh.com/current/compliance/hipaa/active-response.html</w:t>
             </w:r>
           </w:p>
           <w:p>
@@ -27158,7 +27347,7 @@
                 <w:sz w:val="19"/>
                 <w:szCs w:val="19"/>
               </w:rPr>
-              <w:t xml:space="preserve">[15]  Meyer, P., Gutman, C., &amp; Kooker, J. R. (2020). Network containment of compromised machines (U.S. Patent No. 10,659,432). CrowdStrike, Inc. https://patents.justia.com/patent/10659432</w:t>
+              <w:t xml:space="preserve">[15]  Microsoft. (n.d.). Automatic attack disruption in Microsoft Defender; Exclude assets from automated response in attack disruption. Microsoft Learn. Retrieved October 14, 2026, from https://learn.microsoft.com/en-us/defender-xdr/automatic-attack-disruption-exclusions</w:t>
             </w:r>
           </w:p>
           <w:p>
@@ -27174,7 +27363,7 @@
                 <w:sz w:val="19"/>
                 <w:szCs w:val="19"/>
               </w:rPr>
-              <w:t xml:space="preserve">[16]  Shameli-Sendi, A., Louafi, H., He, W., &amp; Cheriet, M. (2018). Dynamic optimal countermeasure selection for intrusion response system. IEEE Transactions on Dependable and Secure Computing, 15(5), 755–770. https://doi.org/10.1109/TDSC.2016.2615622</w:t>
+              <w:t xml:space="preserve">[16]  Meyer, P., Gutman, C., &amp; Kooker, J. R. (2020). Network containment of compromised machines (U.S. Patent No. 10,659,432). CrowdStrike, Inc. https://patents.justia.com/patent/10659432</w:t>
             </w:r>
           </w:p>
           <w:p>
@@ -27190,7 +27379,7 @@
                 <w:sz w:val="19"/>
                 <w:szCs w:val="19"/>
               </w:rPr>
-              <w:t xml:space="preserve">[17]  Bozorgchenani, A., Zarakovitis, C. C., Chien, S. F., Ni, Q., Gouglidis, A., Mallouli, W., &amp; Lim, H. S. (2024). Intrusion Response Systems for the 5G Networks and Beyond: A New Joint Security-vs-QoS Optimization Approach. IEEE Transactions on Network Science and Engineering, 11(3), 3039–3052. https://doi.org/10.1109/TNSE.2024.3358170</w:t>
+              <w:t xml:space="preserve">[17]  Shameli-Sendi, A., Louafi, H., He, W., &amp; Cheriet, M. (2018). Dynamic optimal countermeasure selection for intrusion response system. IEEE Transactions on Dependable and Secure Computing, 15(5), 755–770. https://doi.org/10.1109/TDSC.2016.2615622</w:t>
             </w:r>
           </w:p>
           <w:p>
@@ -27206,7 +27395,7 @@
                 <w:sz w:val="19"/>
                 <w:szCs w:val="19"/>
               </w:rPr>
-              <w:t xml:space="preserve">[18]  Hammar, K., &amp; Stadler, R. (2022). Intrusion Prevention Through Optimal Stopping. IEEE Transactions on Network and Service Management, 19(3). https://doi.org/10.1109/TNSM.2022.3176781</w:t>
+              <w:t xml:space="preserve">[18]  Bozorgchenani, A., Zarakovitis, C. C., Chien, S. F., Ni, Q., Gouglidis, A., Mallouli, W., &amp; Lim, H. S. (2024). Intrusion Response Systems for the 5G Networks and Beyond: A New Joint Security-vs-QoS Optimization Approach. IEEE Transactions on Network Science and Engineering, 11(3), 3039–3052. https://doi.org/10.1109/TNSE.2024.3358170</w:t>
             </w:r>
           </w:p>
           <w:p>
@@ -27222,7 +27411,7 @@
                 <w:sz w:val="19"/>
                 <w:szCs w:val="19"/>
               </w:rPr>
-              <w:t xml:space="preserve">[19]  Standen, M., Lucas, M., Bowman, D., Richer, T. J., Kim, J., &amp; Marriott, D. (2021). CybORG: A Gym for the Development of Autonomous Cyber Agents. arXiv:2108.09118. https://arxiv.org/abs/2108.09118</w:t>
+              <w:t xml:space="preserve">[19]  Hammar, K., &amp; Stadler, R. (2022). Intrusion Prevention Through Optimal Stopping. IEEE Transactions on Network and Service Management, 19(3). https://doi.org/10.1109/TNSM.2022.3176781</w:t>
             </w:r>
           </w:p>
           <w:p>
@@ -27238,7 +27427,7 @@
                 <w:sz w:val="19"/>
                 <w:szCs w:val="19"/>
               </w:rPr>
-              <w:t xml:space="preserve">[20]  Rose, S., Borchert, O., Mitchell, S., &amp; Connelly, S. (2020). Zero Trust Architecture (NIST Special Publication 800-207). National Institute of Standards and Technology. https://doi.org/10.6028/NIST.SP.800-207</w:t>
+              <w:t xml:space="preserve">[20]  Standen, M., Lucas, M., Bowman, D., Richer, T. J., Kim, J., &amp; Marriott, D. (2021). CybORG: A Gym for the Development of Autonomous Cyber Agents. arXiv:2108.09118. https://arxiv.org/abs/2108.09118</w:t>
             </w:r>
           </w:p>
           <w:p>
@@ -27254,7 +27443,7 @@
                 <w:sz w:val="19"/>
                 <w:szCs w:val="19"/>
               </w:rPr>
-              <w:t xml:space="preserve">[21]  Cogburn, C. V., DeCusatis, C., &amp; Spillane, E. (2026). Hardware-Aware QAOA for Honeypot Traffic Partitioning on 100+ Qubit IBM Quantum Processors. arXiv:2606.09469. https://arxiv.org/abs/2606.09469</w:t>
+              <w:t xml:space="preserve">[21]  Rose, S., Borchert, O., Mitchell, S., &amp; Connelly, S. (2020). Zero Trust Architecture (NIST Special Publication 800-207). National Institute of Standards and Technology. https://doi.org/10.6028/NIST.SP.800-207</w:t>
             </w:r>
           </w:p>
           <w:p>
@@ -27270,7 +27459,7 @@
                 <w:sz w:val="19"/>
                 <w:szCs w:val="19"/>
               </w:rPr>
-              <w:t xml:space="preserve">[22]  Lucas, A. (2014). Ising formulations of many NP problems. Frontiers in Physics, 2, 5. https://doi.org/10.3389/fphy.2014.00005</w:t>
+              <w:t xml:space="preserve">[22]  Cogburn, C. V., DeCusatis, C., &amp; Spillane, E. (2026). Hardware-Aware QAOA for Honeypot Traffic Partitioning on 100+ Qubit IBM Quantum Processors. arXiv:2606.09469. https://arxiv.org/abs/2606.09469</w:t>
             </w:r>
           </w:p>
           <w:p>
@@ -27286,7 +27475,7 @@
                 <w:sz w:val="19"/>
                 <w:szCs w:val="19"/>
               </w:rPr>
-              <w:t xml:space="preserve">[23]  Glover, F., Kochenberger, G., &amp; Du, Y. (2019). Quantum Bridge Analytics I: a tutorial on formulating and using QUBO models. 4OR, 17(4), 335–371. https://doi.org/10.1007/s10288-019-00424-y</w:t>
+              <w:t xml:space="preserve">[23]  Lucas, A. (2014). Ising formulations of many NP problems. Frontiers in Physics, 2, 5. https://doi.org/10.3389/fphy.2014.00005</w:t>
             </w:r>
           </w:p>
           <w:p>
@@ -27302,7 +27491,7 @@
                 <w:sz w:val="19"/>
                 <w:szCs w:val="19"/>
               </w:rPr>
-              <w:t xml:space="preserve">[24]  Farhi, E., Goldstone, J., &amp; Gutmann, S. (2014). A Quantum Approximate Optimization Algorithm. arXiv:1411.4028. https://arxiv.org/abs/1411.4028</w:t>
+              <w:t xml:space="preserve">[24]  Glover, F., Kochenberger, G., &amp; Du, Y. (2019). Quantum Bridge Analytics I: a tutorial on formulating and using QUBO models. 4OR, 17(4), 335–371. https://doi.org/10.1007/s10288-019-00424-y</w:t>
             </w:r>
           </w:p>
           <w:p>
@@ -27318,7 +27507,7 @@
                 <w:sz w:val="19"/>
                 <w:szCs w:val="19"/>
               </w:rPr>
-              <w:t xml:space="preserve">[25]  Sha, L. (2001). Using simplicity to control complexity. IEEE Software, 18(4), 20–28. https://doi.org/10.1109/MS.2001.936213</w:t>
+              <w:t xml:space="preserve">[25]  Farhi, E., Goldstone, J., &amp; Gutmann, S. (2014). A Quantum Approximate Optimization Algorithm. arXiv:1411.4028. https://arxiv.org/abs/1411.4028</w:t>
             </w:r>
           </w:p>
           <w:p>
@@ -27334,7 +27523,7 @@
                 <w:sz w:val="19"/>
                 <w:szCs w:val="19"/>
               </w:rPr>
-              <w:t xml:space="preserve">[26]  Huangfu, Q., &amp; Hall, J. A. J. (2018). Parallelizing the dual revised simplex method. Mathematical Programming Computation, 10(1), 119–142. https://doi.org/10.1007/s12532-017-0130-5</w:t>
+              <w:t xml:space="preserve">[26]  Sha, L. (2001). Using simplicity to control complexity. IEEE Software, 18(4), 20–28. https://doi.org/10.1109/MS.2001.936213</w:t>
             </w:r>
           </w:p>
           <w:p>
@@ -27350,7 +27539,7 @@
                 <w:sz w:val="19"/>
                 <w:szCs w:val="19"/>
               </w:rPr>
-              <w:t xml:space="preserve">[27]  de Moura, L., &amp; Bjørner, N. (2008). Z3: An Efficient SMT Solver. In Tools and Algorithms for the Construction and Analysis of Systems (TACAS 2008), LNCS 4963, 337–340. Springer. https://doi.org/10.1007/978-3-540-78800-3_24</w:t>
+              <w:t xml:space="preserve">[27]  Huangfu, Q., &amp; Hall, J. A. J. (2018). Parallelizing the dual revised simplex method. Mathematical Programming Computation, 10(1), 119–142. https://doi.org/10.1007/s12532-017-0130-5</w:t>
             </w:r>
           </w:p>
           <w:p>
@@ -27366,7 +27555,7 @@
                 <w:sz w:val="19"/>
                 <w:szCs w:val="19"/>
               </w:rPr>
-              <w:t xml:space="preserve">[28]  Alshiekh, M., Bloem, R., Ehlers, R., Könighofer, B., Niekum, S., &amp; Topcu, U. (2018). Safe Reinforcement Learning via Shielding. Proceedings of the AAAI Conference on Artificial Intelligence, 32(1). https://doi.org/10.1609/aaai.v32i1.11797</w:t>
+              <w:t xml:space="preserve">[28]  de Moura, L., &amp; Bjørner, N. (2008). Z3: An Efficient SMT Solver. In Tools and Algorithms for the Construction and Analysis of Systems (TACAS 2008), LNCS 4963, 337–340. Springer. https://doi.org/10.1007/978-3-540-78800-3_24</w:t>
             </w:r>
           </w:p>
           <w:p>
@@ -27382,7 +27571,7 @@
                 <w:sz w:val="19"/>
                 <w:szCs w:val="19"/>
               </w:rPr>
-              <w:t xml:space="preserve">[29]  FIRST. (2019). Common Vulnerability Scoring System v3.1: Specification Document. https://www.first.org/cvss/v3-1/specification-document</w:t>
+              <w:t xml:space="preserve">[29]  Alshiekh, M., Bloem, R., Ehlers, R., Könighofer, B., Niekum, S., &amp; Topcu, U. (2018). Safe Reinforcement Learning via Shielding. Proceedings of the AAAI Conference on Artificial Intelligence, 32(1). https://doi.org/10.1609/aaai.v32i1.11797</w:t>
             </w:r>
           </w:p>
           <w:p>
@@ -27398,7 +27587,7 @@
                 <w:sz w:val="19"/>
                 <w:szCs w:val="19"/>
               </w:rPr>
-              <w:t xml:space="preserve">[30]  MITRE. (2026). MITRE ATT&amp;CK® (Enterprise and ICS matrices). https://attack.mitre.org/</w:t>
+              <w:t xml:space="preserve">[30]  FIRST. (2019). Common Vulnerability Scoring System v3.1: Specification Document. https://www.first.org/cvss/v3-1/specification-document</w:t>
             </w:r>
           </w:p>
           <w:p>
@@ -27414,7 +27603,7 @@
                 <w:sz w:val="19"/>
                 <w:szCs w:val="19"/>
               </w:rPr>
-              <w:t xml:space="preserve">[31]  PwC. (2021). Conti cyber attack on the HSE: Independent post incident review. Health Service Executive (Ireland). https://www.hse.ie/eng/services/publications/conti-cyber-attack-on-the-hse-full-report.pdf</w:t>
+              <w:t xml:space="preserve">[31]  MITRE. (2026). MITRE ATT&amp;CK® (Enterprise and ICS matrices). https://attack.mitre.org/</w:t>
             </w:r>
           </w:p>
           <w:p>
@@ -27430,7 +27619,7 @@
                 <w:sz w:val="19"/>
                 <w:szCs w:val="19"/>
               </w:rPr>
-              <w:t xml:space="preserve">[32]  The DFIR Report. (2021–2026). Intrusion reports. https://thedfirreport.com/</w:t>
+              <w:t xml:space="preserve">[32]  PwC. (2021). Conti cyber attack on the HSE: Independent post incident review. Health Service Executive (Ireland). https://www.hse.ie/eng/services/publications/conti-cyber-attack-on-the-hse-full-report.pdf</w:t>
             </w:r>
           </w:p>
           <w:p>
@@ -27446,7 +27635,7 @@
                 <w:sz w:val="19"/>
                 <w:szCs w:val="19"/>
               </w:rPr>
-              <w:t xml:space="preserve">[33]  MITRE Center for Threat-Informed Defense. (2024). Attack Flow (v2) and the Attack Flow corpus [Software and data]. https://github.com/center-for-threat-informed-defense/attack-flow</w:t>
+              <w:t xml:space="preserve">[33]  The DFIR Report. (2021–2026). Intrusion reports. https://thedfirreport.com/</w:t>
             </w:r>
           </w:p>
           <w:p>
@@ -27462,7 +27651,7 @@
                 <w:sz w:val="19"/>
                 <w:szCs w:val="19"/>
               </w:rPr>
-              <w:t xml:space="preserve">[34]  Cybersecurity and Infrastructure Security Agency (CISA). (2013–2026). Cybersecurity Advisories. https://www.cisa.gov/news-events/cybersecurity-advisories</w:t>
+              <w:t xml:space="preserve">[34]  MITRE Center for Threat-Informed Defense. (2024). Attack Flow (v2) and the Attack Flow corpus [Software and data]. https://github.com/center-for-threat-informed-defense/attack-flow</w:t>
             </w:r>
           </w:p>
           <w:p>
@@ -27478,7 +27667,7 @@
                 <w:sz w:val="19"/>
                 <w:szCs w:val="19"/>
               </w:rPr>
-              <w:t xml:space="preserve">[35]  Barkoutsos, P. K., Nannicini, G., Robert, A., Tavernelli, I., &amp; Woerner, S. (2020). Improving Variational Quantum Optimization using CVaR. Quantum, 4, 256. https://doi.org/10.22331/q-2020-04-20-256</w:t>
+              <w:t xml:space="preserve">[35]  Cybersecurity and Infrastructure Security Agency (CISA). (2013–2026). Cybersecurity Advisories. https://www.cisa.gov/news-events/cybersecurity-advisories</w:t>
             </w:r>
           </w:p>
           <w:p>
@@ -27494,63 +27683,7 @@
                 <w:sz w:val="19"/>
                 <w:szCs w:val="19"/>
               </w:rPr>
-              <w:t xml:space="preserve">[36]  National Institute of Standards and Technology. (2024). Module-Lattice-Based Digital Signature Standard (FIPS 204). https://doi.org/10.6028/NIST.FIPS.204</w:t>
-            </w:r>
-          </w:p>
-          <w:p>
-            <w:pPr>
-              <w:bidi/>
-              <w:spacing w:after="50" w:line="300" w:lineRule="auto"/>
-              <w:ind w:start="520" w:hanging="520"/>
-              <w:jc w:val="start"/>
-              <w:rPr>
-                <w:rFonts w:ascii="Arial" w:hAnsi="Arial" w:cs="Arial"/>
-                <w:sz w:val="19"/>
-                <w:szCs w:val="19"/>
-                <w:rtl/>
-              </w:rPr>
-            </w:pPr>
-            <w:r>
-              <w:rPr>
-                <w:rFonts w:ascii="Arial" w:hAnsi="Arial" w:cs="Arial"/>
-                <w:sz w:val="19"/>
-                <w:szCs w:val="19"/>
-              </w:rPr>
-              <w:t xml:space="preserve">[37]</w:t>
-            </w:r>
-            <w:r>
-              <w:rPr>
-                <w:rFonts w:ascii="Arial" w:hAnsi="Arial" w:cs="Arial"/>
-                <w:sz w:val="19"/>
-                <w:szCs w:val="19"/>
-                <w:rtl/>
-              </w:rPr>
-              <w:t xml:space="preserve">  الهيئة السعودية للبيانات والذكاء الاصطناعي (سدايا). (</w:t>
-            </w:r>
-            <w:r>
-              <w:rPr>
-                <w:rFonts w:ascii="Arial" w:hAnsi="Arial" w:cs="Arial"/>
-                <w:sz w:val="19"/>
-                <w:szCs w:val="19"/>
-              </w:rPr>
-              <w:t xml:space="preserve">2023)</w:t>
-            </w:r>
-            <w:r>
-              <w:rPr>
-                <w:rFonts w:ascii="Arial" w:hAnsi="Arial" w:cs="Arial"/>
-                <w:sz w:val="19"/>
-                <w:szCs w:val="19"/>
-                <w:rtl/>
-              </w:rPr>
-              <w:t xml:space="preserve">. مبادئ أخلاقيات الذكاء الاصطناعي (الإصدار </w:t>
-            </w:r>
-            <w:r>
-              <w:rPr>
-                <w:rFonts w:ascii="Arial" w:hAnsi="Arial" w:cs="Arial"/>
-                <w:sz w:val="19"/>
-                <w:szCs w:val="19"/>
-              </w:rPr>
-              <w:t xml:space="preserve">1.0). https://sdaia.gov.sa/en/SDAIA/about/Documents/ai-principles.pdf</w:t>
+              <w:t xml:space="preserve">[36]  Barkoutsos, P. K., Nannicini, G., Robert, A., Tavernelli, I., &amp; Woerner, S. (2020). Improving Variational Quantum Optimization using CVaR. Quantum, 4, 256. https://doi.org/10.22331/q-2020-04-20-256</w:t>
             </w:r>
           </w:p>
           <w:p>
@@ -27566,7 +27699,63 @@
                 <w:sz w:val="19"/>
                 <w:szCs w:val="19"/>
               </w:rPr>
-              <w:t xml:space="preserve">[38]  Sharafaldin, I., Lashkari, A. H., &amp; Ghorbani, A. A. (2018). Toward Generating a New Intrusion Detection Dataset and Intrusion Traffic Characterization. In Proceedings of ICISSP 2018, 108–116. https://doi.org/10.5220/0006639801080116</w:t>
+              <w:t xml:space="preserve">[37]  National Institute of Standards and Technology. (2024). Module-Lattice-Based Digital Signature Standard (FIPS 204). https://doi.org/10.6028/NIST.FIPS.204</w:t>
+            </w:r>
+          </w:p>
+          <w:p>
+            <w:pPr>
+              <w:bidi/>
+              <w:spacing w:after="50" w:line="300" w:lineRule="auto"/>
+              <w:ind w:start="520" w:hanging="520"/>
+              <w:jc w:val="start"/>
+              <w:rPr>
+                <w:rFonts w:ascii="Arial" w:hAnsi="Arial" w:cs="Arial"/>
+                <w:sz w:val="19"/>
+                <w:szCs w:val="19"/>
+                <w:rtl/>
+              </w:rPr>
+            </w:pPr>
+            <w:r>
+              <w:rPr>
+                <w:rFonts w:ascii="Arial" w:hAnsi="Arial" w:cs="Arial"/>
+                <w:sz w:val="19"/>
+                <w:szCs w:val="19"/>
+              </w:rPr>
+              <w:t xml:space="preserve">[38]</w:t>
+            </w:r>
+            <w:r>
+              <w:rPr>
+                <w:rFonts w:ascii="Arial" w:hAnsi="Arial" w:cs="Arial"/>
+                <w:sz w:val="19"/>
+                <w:szCs w:val="19"/>
+                <w:rtl/>
+              </w:rPr>
+              <w:t xml:space="preserve">  الهيئة السعودية للبيانات والذكاء الاصطناعي (سدايا). (</w:t>
+            </w:r>
+            <w:r>
+              <w:rPr>
+                <w:rFonts w:ascii="Arial" w:hAnsi="Arial" w:cs="Arial"/>
+                <w:sz w:val="19"/>
+                <w:szCs w:val="19"/>
+              </w:rPr>
+              <w:t xml:space="preserve">2023)</w:t>
+            </w:r>
+            <w:r>
+              <w:rPr>
+                <w:rFonts w:ascii="Arial" w:hAnsi="Arial" w:cs="Arial"/>
+                <w:sz w:val="19"/>
+                <w:szCs w:val="19"/>
+                <w:rtl/>
+              </w:rPr>
+              <w:t xml:space="preserve">. مبادئ أخلاقيات الذكاء الاصطناعي (الإصدار </w:t>
+            </w:r>
+            <w:r>
+              <w:rPr>
+                <w:rFonts w:ascii="Arial" w:hAnsi="Arial" w:cs="Arial"/>
+                <w:sz w:val="19"/>
+                <w:szCs w:val="19"/>
+              </w:rPr>
+              <w:t xml:space="preserve">1.0). https://sdaia.gov.sa/en/SDAIA/about/Documents/ai-principles.pdf</w:t>
             </w:r>
           </w:p>
           <w:p>
@@ -27582,7 +27771,7 @@
                 <w:sz w:val="19"/>
                 <w:szCs w:val="19"/>
               </w:rPr>
-              <w:t xml:space="preserve">[39]  Anthropic. (2026). Claude (Opus) [Large language model]. Used September–October 2026 for code assistance, analysis, source search and drafting support, as disclosed in this section. https://claude.ai</w:t>
+              <w:t xml:space="preserve">[39]  Sharafaldin, I., Lashkari, A. H., &amp; Ghorbani, A. A. (2018). Toward Generating a New Intrusion Detection Dataset and Intrusion Traffic Characterization. In Proceedings of ICISSP 2018, 108–116. https://doi.org/10.5220/0006639801080116</w:t>
             </w:r>
           </w:p>
           <w:p>
@@ -27598,7 +27787,23 @@
                 <w:sz w:val="19"/>
                 <w:szCs w:val="19"/>
               </w:rPr>
-              <w:t xml:space="preserve">[40]  OpenAI. (2026). ChatGPT and Codex [Large language models]. Used September–October 2026 as an independent reviewer of text and code. https://chatgpt.com</w:t>
+              <w:t xml:space="preserve">[40]  Anthropic. (2026). Claude (Opus) [Large language model]. Used September–October 2026 for code assistance, analysis, source search and drafting support, as disclosed in this section. https://claude.ai</w:t>
+            </w:r>
+          </w:p>
+          <w:p>
+            <w:pPr>
+              <w:bidi w:val="0"/>
+              <w:spacing w:after="50" w:line="276" w:lineRule="auto"/>
+              <w:ind w:left="520" w:hanging="520"/>
+              <w:jc w:val="left"/>
+            </w:pPr>
+            <w:r>
+              <w:rPr>
+                <w:rFonts w:ascii="Arial" w:hAnsi="Arial" w:cs="Arial"/>
+                <w:sz w:val="19"/>
+                <w:szCs w:val="19"/>
+              </w:rPr>
+              <w:t xml:space="preserve">[41]  OpenAI. (2026). ChatGPT and Codex [Large language models]. Used September–October 2026 as an independent reviewer of text and code. https://chatgpt.com</w:t>
             </w:r>
           </w:p>
           <w:p>
@@ -27682,7 +27887,7 @@
                 <w:sz w:val="22"/>
                 <w:szCs w:val="22"/>
               </w:rPr>
-              <w:t xml:space="preserve">Anthropic) [39]</w:t>
+              <w:t xml:space="preserve">Anthropic) [40]</w:t>
             </w:r>
             <w:r>
               <w:rPr>
@@ -27716,7 +27921,7 @@
                 <w:sz w:val="22"/>
                 <w:szCs w:val="22"/>
               </w:rPr>
-              <w:t xml:space="preserve">OpenAI) [40]</w:t>
+              <w:t xml:space="preserve">OpenAI) [41]</w:t>
             </w:r>
             <w:r>
               <w:rPr>

</xml_diff>

<commit_message>
form v20: record student's own reproduction run (Kali, 786 s, 141 tests OK, Table 1 identical); add raw log
Co-Authored-By: Claude Opus 5.5 <noreply@anthropic.com>
Claude-Session: https://claude.ai/code/session_011J2KrGUp2npQo9Tosx1KRc
</commit_message>
<xml_diff>
--- a/docs/qacrs/form_drafts/IBDAA_2027_FORM_ACRS_v20.docx
+++ b/docs/qacrs/form_drafts/IBDAA_2027_FORM_ACRS_v20.docx
@@ -15244,7 +15244,7 @@
                       <w:szCs w:val="19"/>
                       <w:rtl/>
                     </w:rPr>
-                    <w:t xml:space="preserve"> من حساب الطالب</w:t>
+                    <w:t xml:space="preserve"> وإعادة الإنتاج على حاسوب الطالب وحسابه</w:t>
                   </w:r>
                 </w:p>
               </w:tc>
@@ -15337,24 +15337,24 @@
                 <w:szCs w:val="22"/>
                 <w:rtl/>
               </w:rPr>
-              <w:t xml:space="preserve"> الأساسية في </w:t>
-            </w:r>
-            <w:r>
-              <w:rPr>
-                <w:rFonts w:ascii="Arial" w:hAnsi="Arial" w:cs="Arial"/>
-                <w:sz w:val="22"/>
-                <w:szCs w:val="22"/>
-              </w:rPr>
-              <w:t xml:space="preserve">561</w:t>
-            </w:r>
-            <w:r>
-              <w:rPr>
-                <w:rFonts w:ascii="Arial" w:hAnsi="Arial" w:cs="Arial"/>
-                <w:sz w:val="22"/>
-                <w:szCs w:val="22"/>
-                <w:rtl/>
-              </w:rPr>
-              <w:t xml:space="preserve"> ثانية، وأعطى نتائج مطابقة عدا الأزمنة.</w:t>
+              <w:t xml:space="preserve"> الأساسية، وأعاده الطالب على حاسوبه (</w:t>
+            </w:r>
+            <w:r>
+              <w:rPr>
+                <w:rFonts w:ascii="Arial" w:hAnsi="Arial" w:cs="Arial"/>
+                <w:sz w:val="22"/>
+                <w:szCs w:val="22"/>
+              </w:rPr>
+              <w:t xml:space="preserve">786</w:t>
+            </w:r>
+            <w:r>
+              <w:rPr>
+                <w:rFonts w:ascii="Arial" w:hAnsi="Arial" w:cs="Arial"/>
+                <w:sz w:val="22"/>
+                <w:szCs w:val="22"/>
+                <w:rtl/>
+              </w:rPr>
+              <w:t xml:space="preserve"> ثانية) فتطابقت النتائج عدا الأزمنة.</w:t>
             </w:r>
           </w:p>
         </w:tc>
@@ -28075,6 +28075,199 @@
                 <w:rtl/>
               </w:rPr>
               <w:t xml:space="preserve"> الكمّية من حسابه.</w:t>
+            </w:r>
+          </w:p>
+          <w:p>
+            <w:pPr>
+              <w:bidi/>
+              <w:spacing w:after="60" w:line="300" w:lineRule="auto"/>
+              <w:ind w:start="340" w:hanging="340"/>
+              <w:jc w:val="both"/>
+              <w:rPr>
+                <w:rFonts w:ascii="Arial" w:hAnsi="Arial" w:cs="Arial"/>
+                <w:sz w:val="22"/>
+                <w:szCs w:val="22"/>
+                <w:rtl/>
+              </w:rPr>
+            </w:pPr>
+            <w:r>
+              <w:rPr>
+                <w:rFonts w:ascii="Arial" w:hAnsi="Arial" w:cs="Arial"/>
+                <w:sz w:val="22"/>
+                <w:szCs w:val="22"/>
+                <w:rtl/>
+              </w:rPr>
+              <w:t xml:space="preserve">–  إعادة تشغيل التجارب الأساسية بنفسه على حاسوبه (</w:t>
+            </w:r>
+            <w:r>
+              <w:rPr>
+                <w:rFonts w:ascii="Arial" w:hAnsi="Arial" w:cs="Arial"/>
+                <w:sz w:val="22"/>
+                <w:szCs w:val="22"/>
+              </w:rPr>
+              <w:t xml:space="preserve">make hassan-repro</w:t>
+            </w:r>
+            <w:r>
+              <w:rPr>
+                <w:rFonts w:ascii="Arial" w:hAnsi="Arial" w:cs="Arial"/>
+                <w:sz w:val="22"/>
+                <w:szCs w:val="22"/>
+                <w:rtl/>
+              </w:rPr>
+              <w:t xml:space="preserve">، نظام </w:t>
+            </w:r>
+            <w:r>
+              <w:rPr>
+                <w:rFonts w:ascii="Arial" w:hAnsi="Arial" w:cs="Arial"/>
+                <w:sz w:val="22"/>
+                <w:szCs w:val="22"/>
+              </w:rPr>
+              <w:t xml:space="preserve">Kali Linux</w:t>
+            </w:r>
+            <w:r>
+              <w:rPr>
+                <w:rFonts w:ascii="Arial" w:hAnsi="Arial" w:cs="Arial"/>
+                <w:sz w:val="22"/>
+                <w:szCs w:val="22"/>
+                <w:rtl/>
+              </w:rPr>
+              <w:t xml:space="preserve">، </w:t>
+            </w:r>
+            <w:r>
+              <w:rPr>
+                <w:rFonts w:ascii="Arial" w:hAnsi="Arial" w:cs="Arial"/>
+                <w:sz w:val="22"/>
+                <w:szCs w:val="22"/>
+              </w:rPr>
+              <w:t xml:space="preserve">786</w:t>
+            </w:r>
+            <w:r>
+              <w:rPr>
+                <w:rFonts w:ascii="Arial" w:hAnsi="Arial" w:cs="Arial"/>
+                <w:sz w:val="22"/>
+                <w:szCs w:val="22"/>
+                <w:rtl/>
+              </w:rPr>
+              <w:t xml:space="preserve"> ثانية): نجحت الاختبارات الآلية الـ</w:t>
+            </w:r>
+            <w:r>
+              <w:rPr>
+                <w:rFonts w:ascii="Arial" w:hAnsi="Arial" w:cs="Arial"/>
+                <w:sz w:val="22"/>
+                <w:szCs w:val="22"/>
+              </w:rPr>
+              <w:t xml:space="preserve">141</w:t>
+            </w:r>
+            <w:r>
+              <w:rPr>
+                <w:rFonts w:ascii="Arial" w:hAnsi="Arial" w:cs="Arial"/>
+                <w:sz w:val="22"/>
+                <w:szCs w:val="22"/>
+                <w:rtl/>
+              </w:rPr>
+              <w:t xml:space="preserve">، وتطابقت نتائج جدول </w:t>
+            </w:r>
+            <w:r>
+              <w:rPr>
+                <w:rFonts w:ascii="Arial" w:hAnsi="Arial" w:cs="Arial"/>
+                <w:sz w:val="22"/>
+                <w:szCs w:val="22"/>
+              </w:rPr>
+              <w:t xml:space="preserve">1</w:t>
+            </w:r>
+            <w:r>
+              <w:rPr>
+                <w:rFonts w:ascii="Arial" w:hAnsi="Arial" w:cs="Arial"/>
+                <w:sz w:val="22"/>
+                <w:szCs w:val="22"/>
+                <w:rtl/>
+              </w:rPr>
+              <w:t xml:space="preserve"> رقمًا برقم (</w:t>
+            </w:r>
+            <w:r>
+              <w:rPr>
+                <w:rFonts w:ascii="Arial" w:hAnsi="Arial" w:cs="Arial"/>
+                <w:sz w:val="22"/>
+                <w:szCs w:val="22"/>
+              </w:rPr>
+              <w:t xml:space="preserve">259</w:t>
+            </w:r>
+            <w:r>
+              <w:rPr>
+                <w:rFonts w:ascii="Arial" w:hAnsi="Arial" w:cs="Arial"/>
+                <w:sz w:val="22"/>
+                <w:szCs w:val="22"/>
+                <w:rtl/>
+              </w:rPr>
+              <w:t xml:space="preserve"> و</w:t>
+            </w:r>
+            <w:r>
+              <w:rPr>
+                <w:rFonts w:ascii="Arial" w:hAnsi="Arial" w:cs="Arial"/>
+                <w:sz w:val="22"/>
+                <w:szCs w:val="22"/>
+              </w:rPr>
+              <w:t xml:space="preserve">253</w:t>
+            </w:r>
+            <w:r>
+              <w:rPr>
+                <w:rFonts w:ascii="Arial" w:hAnsi="Arial" w:cs="Arial"/>
+                <w:sz w:val="22"/>
+                <w:szCs w:val="22"/>
+                <w:rtl/>
+              </w:rPr>
+              <w:t xml:space="preserve"> و</w:t>
+            </w:r>
+            <w:r>
+              <w:rPr>
+                <w:rFonts w:ascii="Arial" w:hAnsi="Arial" w:cs="Arial"/>
+                <w:sz w:val="22"/>
+                <w:szCs w:val="22"/>
+              </w:rPr>
+              <w:t xml:space="preserve">142</w:t>
+            </w:r>
+            <w:r>
+              <w:rPr>
+                <w:rFonts w:ascii="Arial" w:hAnsi="Arial" w:cs="Arial"/>
+                <w:sz w:val="22"/>
+                <w:szCs w:val="22"/>
+                <w:rtl/>
+              </w:rPr>
+              <w:t xml:space="preserve">، ونسبة </w:t>
+            </w:r>
+            <w:r>
+              <w:rPr>
+                <w:rFonts w:ascii="Arial" w:hAnsi="Arial" w:cs="Arial"/>
+                <w:sz w:val="22"/>
+                <w:szCs w:val="22"/>
+              </w:rPr>
+              <w:t xml:space="preserve">0.977</w:t>
+            </w:r>
+            <w:r>
+              <w:rPr>
+                <w:rFonts w:ascii="Arial" w:hAnsi="Arial" w:cs="Arial"/>
+                <w:sz w:val="22"/>
+                <w:szCs w:val="22"/>
+                <w:rtl/>
+              </w:rPr>
+              <w:t xml:space="preserve">، و</w:t>
+            </w:r>
+            <w:r>
+              <w:rPr>
+                <w:rFonts w:ascii="Arial" w:hAnsi="Arial" w:cs="Arial"/>
+                <w:sz w:val="22"/>
+                <w:szCs w:val="22"/>
+              </w:rPr>
+              <w:t xml:space="preserve">p = 3.9×10⁻³⁴)</w:t>
+            </w:r>
+            <w:r>
+              <w:rPr>
+                <w:rFonts w:ascii="Arial" w:hAnsi="Arial" w:cs="Arial"/>
+                <w:sz w:val="22"/>
+                <w:szCs w:val="22"/>
+                <w:rtl/>
+              </w:rPr>
+              <w:t xml:space="preserve">.</w:t>
             </w:r>
           </w:p>
           <w:p>

</xml_diff>

<commit_message>
form v20: disclose duplicate-exclusion rule, exact repro test count, E9 sub-problem sizes
Co-Authored-By: Claude Opus 5.5 <noreply@anthropic.com>
Claude-Session: https://claude.ai/code/session_011J2KrGUp2npQo9Tosx1KRc
</commit_message>
<xml_diff>
--- a/docs/qacrs/form_drafts/IBDAA_2027_FORM_ACRS_v20.docx
+++ b/docs/qacrs/form_drafts/IBDAA_2027_FORM_ACRS_v20.docx
@@ -3386,7 +3386,7 @@
                 <w:szCs w:val="22"/>
                 <w:rtl/>
               </w:rPr>
-              <w:t xml:space="preserve"> الحل الأمثل في </w:t>
+              <w:t xml:space="preserve"> الحل الأمثل لكل واحدة من </w:t>
             </w:r>
             <w:r>
               <w:rPr>
@@ -3403,24 +3403,24 @@
                 <w:szCs w:val="22"/>
                 <w:rtl/>
               </w:rPr>
-              <w:t xml:space="preserve"> من </w:t>
-            </w:r>
-            <w:r>
-              <w:rPr>
-                <w:rFonts w:ascii="Arial" w:hAnsi="Arial" w:cs="Arial"/>
-                <w:sz w:val="22"/>
-                <w:szCs w:val="22"/>
-              </w:rPr>
-              <w:t xml:space="preserve">11</w:t>
-            </w:r>
-            <w:r>
-              <w:rPr>
-                <w:rFonts w:ascii="Arial" w:hAnsi="Arial" w:cs="Arial"/>
-                <w:sz w:val="22"/>
-                <w:szCs w:val="22"/>
-                <w:rtl/>
-              </w:rPr>
-              <w:t xml:space="preserve"> مسألة فرعية (</w:t>
+              <w:t xml:space="preserve"> مسألة فرعية (حتى </w:t>
+            </w:r>
+            <w:r>
+              <w:rPr>
+                <w:rFonts w:ascii="Arial" w:hAnsi="Arial" w:cs="Arial"/>
+                <w:sz w:val="22"/>
+                <w:szCs w:val="22"/>
+              </w:rPr>
+              <w:t xml:space="preserve">16</w:t>
+            </w:r>
+            <w:r>
+              <w:rPr>
+                <w:rFonts w:ascii="Arial" w:hAnsi="Arial" w:cs="Arial"/>
+                <w:sz w:val="22"/>
+                <w:szCs w:val="22"/>
+                <w:rtl/>
+              </w:rPr>
+              <w:t xml:space="preserve"> كيوبت لكل منها، </w:t>
             </w:r>
             <w:r>
               <w:rPr>
@@ -3437,7 +3437,7 @@
                 <w:szCs w:val="22"/>
                 <w:rtl/>
               </w:rPr>
-              <w:t xml:space="preserve"> كيوبت مجتمعة) من شبكة </w:t>
+              <w:t xml:space="preserve"> مجموعًا) من شبكة </w:t>
             </w:r>
             <w:r>
               <w:rPr>
@@ -3454,7 +3454,7 @@
                 <w:szCs w:val="22"/>
                 <w:rtl/>
               </w:rPr>
-              <w:t xml:space="preserve"> جهازًا، دون ادعاء تفوق كمّي.</w:t>
+              <w:t xml:space="preserve"> جهازًا، وجُمع القرار منها، دون ادعاء تفوق كمّي.</w:t>
             </w:r>
           </w:p>
           <w:p>
@@ -13490,7 +13490,75 @@
                 <w:szCs w:val="22"/>
                 <w:rtl/>
               </w:rPr>
-              <w:t xml:space="preserve"> سيناريو تركيبي؛ العينات النهائية وبذورها في جدول المجموعات، وكل بذرة في ملف تسجيلها). والسلاسل مربوطة بتقنيات </w:t>
+              <w:t xml:space="preserve"> سيناريو تركيبي؛ العينات النهائية وبذورها في جدول المجموعات). ويُحذف كل سيناريو يكرر سيناريو تطوير أو سابقًا (قاعدة مسجّلة منذ </w:t>
+            </w:r>
+            <w:r>
+              <w:rPr>
+                <w:rFonts w:ascii="Arial" w:hAnsi="Arial" w:cs="Arial"/>
+                <w:sz w:val="22"/>
+                <w:szCs w:val="22"/>
+              </w:rPr>
+              <w:t xml:space="preserve">v4</w:t>
+            </w:r>
+            <w:r>
+              <w:rPr>
+                <w:rFonts w:ascii="Arial" w:hAnsi="Arial" w:cs="Arial"/>
+                <w:sz w:val="22"/>
+                <w:szCs w:val="22"/>
+                <w:rtl/>
+              </w:rPr>
+              <w:t xml:space="preserve">، ويُنشر العدد: مثلًا </w:t>
+            </w:r>
+            <w:r>
+              <w:rPr>
+                <w:rFonts w:ascii="Arial" w:hAnsi="Arial" w:cs="Arial"/>
+                <w:sz w:val="22"/>
+                <w:szCs w:val="22"/>
+              </w:rPr>
+              <w:t xml:space="preserve">141</w:t>
+            </w:r>
+            <w:r>
+              <w:rPr>
+                <w:rFonts w:ascii="Arial" w:hAnsi="Arial" w:cs="Arial"/>
+                <w:sz w:val="22"/>
+                <w:szCs w:val="22"/>
+                <w:rtl/>
+              </w:rPr>
+              <w:t xml:space="preserve"> من </w:t>
+            </w:r>
+            <w:r>
+              <w:rPr>
+                <w:rFonts w:ascii="Arial" w:hAnsi="Arial" w:cs="Arial"/>
+                <w:sz w:val="22"/>
+                <w:szCs w:val="22"/>
+              </w:rPr>
+              <w:t xml:space="preserve">400</w:t>
+            </w:r>
+            <w:r>
+              <w:rPr>
+                <w:rFonts w:ascii="Arial" w:hAnsi="Arial" w:cs="Arial"/>
+                <w:sz w:val="22"/>
+                <w:szCs w:val="22"/>
+                <w:rtl/>
+              </w:rPr>
+              <w:t xml:space="preserve"> سلسلة، فبقيت </w:t>
+            </w:r>
+            <w:r>
+              <w:rPr>
+                <w:rFonts w:ascii="Arial" w:hAnsi="Arial" w:cs="Arial"/>
+                <w:sz w:val="22"/>
+                <w:szCs w:val="22"/>
+              </w:rPr>
+              <w:t xml:space="preserve">259)</w:t>
+            </w:r>
+            <w:r>
+              <w:rPr>
+                <w:rFonts w:ascii="Arial" w:hAnsi="Arial" w:cs="Arial"/>
+                <w:sz w:val="22"/>
+                <w:szCs w:val="22"/>
+                <w:rtl/>
+              </w:rPr>
+              <w:t xml:space="preserve">. والسلاسل مربوطة بتقنيات </w:t>
             </w:r>
             <w:r>
               <w:rPr>
@@ -28148,7 +28216,7 @@
                 <w:szCs w:val="22"/>
                 <w:rtl/>
               </w:rPr>
-              <w:t xml:space="preserve"> ثانية): نجحت الاختبارات الآلية الـ</w:t>
+              <w:t xml:space="preserve"> ثانية): اكتملت الاختبارات الآلية الـ</w:t>
             </w:r>
             <w:r>
               <w:rPr>
@@ -28157,6 +28225,23 @@
                 <w:szCs w:val="22"/>
               </w:rPr>
               <w:t xml:space="preserve">141</w:t>
+            </w:r>
+            <w:r>
+              <w:rPr>
+                <w:rFonts w:ascii="Arial" w:hAnsi="Arial" w:cs="Arial"/>
+                <w:sz w:val="22"/>
+                <w:szCs w:val="22"/>
+                <w:rtl/>
+              </w:rPr>
+              <w:t xml:space="preserve"> بلا خطأ (واحد متروك عمدًا)، وبإصدارات أحدث من المكتبات (</w:t>
+            </w:r>
+            <w:r>
+              <w:rPr>
+                <w:rFonts w:ascii="Arial" w:hAnsi="Arial" w:cs="Arial"/>
+                <w:sz w:val="22"/>
+                <w:szCs w:val="22"/>
+              </w:rPr>
+              <w:t xml:space="preserve">Python 3.14)</w:t>
             </w:r>
             <w:r>
               <w:rPr>

</xml_diff>

<commit_message>
form v20: 0.55 (v5 on same 259 chains), repro claim limited to Table 1
Co-Authored-By: Claude Opus 5.5 <noreply@anthropic.com>
Claude-Session: https://claude.ai/code/session_011J2KrGUp2npQo9Tosx1KRc
</commit_message>
<xml_diff>
--- a/docs/qacrs/form_drafts/IBDAA_2027_FORM_ACRS_v20.docx
+++ b/docs/qacrs/form_drafts/IBDAA_2027_FORM_ACRS_v20.docx
@@ -8728,16 +8728,16 @@
                 <w:sz w:val="22"/>
                 <w:szCs w:val="22"/>
               </w:rPr>
-              <w:t xml:space="preserve">0.56</w:t>
-            </w:r>
-            <w:r>
-              <w:rPr>
-                <w:rFonts w:ascii="Arial" w:hAnsi="Arial" w:cs="Arial"/>
-                <w:sz w:val="22"/>
-                <w:szCs w:val="22"/>
-                <w:rtl/>
-              </w:rPr>
-              <w:t xml:space="preserve"> (بلا تجزئة) إلى </w:t>
+              <w:t xml:space="preserve">0.55 (v5</w:t>
+            </w:r>
+            <w:r>
+              <w:rPr>
+                <w:rFonts w:ascii="Arial" w:hAnsi="Arial" w:cs="Arial"/>
+                <w:sz w:val="22"/>
+                <w:szCs w:val="22"/>
+                <w:rtl/>
+              </w:rPr>
+              <w:t xml:space="preserve"> بلا تجزئة) إلى </w:t>
             </w:r>
             <w:r>
               <w:rPr>
@@ -15422,7 +15422,24 @@
                 <w:szCs w:val="22"/>
                 <w:rtl/>
               </w:rPr>
-              <w:t xml:space="preserve"> ثانية) فتطابقت النتائج عدا الأزمنة.</w:t>
+              <w:t xml:space="preserve"> ثانية) فتطابقت نتائج جدول </w:t>
+            </w:r>
+            <w:r>
+              <w:rPr>
+                <w:rFonts w:ascii="Arial" w:hAnsi="Arial" w:cs="Arial"/>
+                <w:sz w:val="22"/>
+                <w:szCs w:val="22"/>
+              </w:rPr>
+              <w:t xml:space="preserve">1</w:t>
+            </w:r>
+            <w:r>
+              <w:rPr>
+                <w:rFonts w:ascii="Arial" w:hAnsi="Arial" w:cs="Arial"/>
+                <w:sz w:val="22"/>
+                <w:szCs w:val="22"/>
+                <w:rtl/>
+              </w:rPr>
+              <w:t xml:space="preserve"> رقمًا برقم.</w:t>
             </w:r>
           </w:p>
         </w:tc>

</xml_diff>